<commit_message>
print Function Working Notes
</commit_message>
<xml_diff>
--- a/extra notes.docx
+++ b/extra notes.docx
@@ -311,7 +311,6 @@
           <w:color w:val="2F5496" w:themeColor="accent1" w:themeShade="BF"/>
           <w:highlight w:val="green"/>
         </w:rPr>
-        <w:lastRenderedPageBreak/>
         <w:t>Yes</w:t>
       </w:r>
       <w:proofErr w:type="gramEnd"/>
@@ -478,6 +477,7 @@
           <w:color w:val="2F5496" w:themeColor="accent1" w:themeShade="BF"/>
           <w:highlight w:val="green"/>
         </w:rPr>
+        <w:lastRenderedPageBreak/>
         <w:t xml:space="preserve">This is just the basic example </w:t>
       </w:r>
       <w:proofErr w:type="spellStart"/>
@@ -1123,7 +1123,6 @@
           <w:bCs/>
           <w:color w:val="000000" w:themeColor="text1"/>
         </w:rPr>
-        <w:lastRenderedPageBreak/>
         <w:t>The Connection:</w:t>
       </w:r>
       <w:r>
@@ -1174,6 +1173,7 @@
         <w:rPr>
           <w:color w:val="000000" w:themeColor="text1"/>
         </w:rPr>
+        <w:lastRenderedPageBreak/>
         <w:t>If we want to get you to a FAANG level, we will not just write code; we will understand what the hardware is doing.</w:t>
       </w:r>
     </w:p>
@@ -1617,7 +1617,6 @@
           <w:bCs/>
           <w:color w:val="000000" w:themeColor="text1"/>
         </w:rPr>
-        <w:lastRenderedPageBreak/>
         <w:t>The Stack Gets a Name:</w:t>
       </w:r>
       <w:r>
@@ -1718,6 +1717,7 @@
           <w:noProof/>
           <w:color w:val="000000" w:themeColor="text1"/>
         </w:rPr>
+        <w:lastRenderedPageBreak/>
         <w:drawing>
           <wp:inline distT="0" distB="0" distL="0" distR="0" wp14:anchorId="2E106659" wp14:editId="1412AA0E">
             <wp:extent cx="3886200" cy="2331720"/>
@@ -2071,14 +2071,7 @@
         <w:rPr>
           <w:color w:val="000000" w:themeColor="text1"/>
         </w:rPr>
-        <w:t xml:space="preserve"> name tag and ties it </w:t>
-      </w:r>
-      <w:r>
-        <w:rPr>
-          <w:color w:val="000000" w:themeColor="text1"/>
-        </w:rPr>
-        <w:lastRenderedPageBreak/>
-        <w:t>to the exact same 100 object in the Heap that score is pointing to. They are both pointing at the same object.</w:t>
+        <w:t xml:space="preserve"> name tag and ties it to the exact same 100 object in the Heap that score is pointing to. They are both pointing at the same object.</w:t>
       </w:r>
     </w:p>
     <w:p>
@@ -2912,195 +2905,195 @@
           <w:color w:val="000000" w:themeColor="text1"/>
           <w:highlight w:val="green"/>
         </w:rPr>
+        <w:t>Yeha</w:t>
+      </w:r>
+      <w:proofErr w:type="spellEnd"/>
+      <w:r>
+        <w:rPr>
+          <w:color w:val="000000" w:themeColor="text1"/>
+          <w:highlight w:val="green"/>
+        </w:rPr>
+        <w:t xml:space="preserve"> </w:t>
+      </w:r>
+      <w:proofErr w:type="spellStart"/>
+      <w:r>
+        <w:rPr>
+          <w:color w:val="000000" w:themeColor="text1"/>
+          <w:highlight w:val="green"/>
+        </w:rPr>
+        <w:t>itz</w:t>
+      </w:r>
+      <w:proofErr w:type="spellEnd"/>
+      <w:r>
+        <w:rPr>
+          <w:color w:val="000000" w:themeColor="text1"/>
+          <w:highlight w:val="green"/>
+        </w:rPr>
+        <w:t xml:space="preserve"> good</w:t>
+      </w:r>
+      <w:proofErr w:type="gramStart"/>
+      <w:r>
+        <w:rPr>
+          <w:color w:val="000000" w:themeColor="text1"/>
+          <w:highlight w:val="green"/>
+        </w:rPr>
+        <w:t xml:space="preserve"> ..</w:t>
+      </w:r>
+      <w:proofErr w:type="gramEnd"/>
+      <w:r>
+        <w:rPr>
+          <w:color w:val="000000" w:themeColor="text1"/>
+          <w:highlight w:val="green"/>
+        </w:rPr>
+        <w:t xml:space="preserve"> </w:t>
+      </w:r>
+      <w:proofErr w:type="spellStart"/>
+      <w:r>
+        <w:rPr>
+          <w:color w:val="000000" w:themeColor="text1"/>
+          <w:highlight w:val="green"/>
+        </w:rPr>
+        <w:t>i</w:t>
+      </w:r>
+      <w:proofErr w:type="spellEnd"/>
+      <w:r>
+        <w:rPr>
+          <w:color w:val="000000" w:themeColor="text1"/>
+          <w:highlight w:val="green"/>
+        </w:rPr>
+        <w:t xml:space="preserve"> am understanding ... </w:t>
+      </w:r>
+      <w:proofErr w:type="spellStart"/>
+      <w:r>
+        <w:rPr>
+          <w:color w:val="000000" w:themeColor="text1"/>
+          <w:highlight w:val="green"/>
+        </w:rPr>
+        <w:t>lets</w:t>
+      </w:r>
+      <w:proofErr w:type="spellEnd"/>
+      <w:r>
+        <w:rPr>
+          <w:color w:val="000000" w:themeColor="text1"/>
+          <w:highlight w:val="green"/>
+        </w:rPr>
+        <w:t xml:space="preserve"> move forward</w:t>
+      </w:r>
+      <w:proofErr w:type="gramStart"/>
+      <w:r>
+        <w:rPr>
+          <w:color w:val="000000" w:themeColor="text1"/>
+          <w:highlight w:val="green"/>
+        </w:rPr>
+        <w:t xml:space="preserve"> ..</w:t>
+      </w:r>
+      <w:proofErr w:type="gramEnd"/>
+      <w:r>
+        <w:rPr>
+          <w:color w:val="000000" w:themeColor="text1"/>
+          <w:highlight w:val="green"/>
+        </w:rPr>
+        <w:t xml:space="preserve"> we will cover the whole thing like this ... just </w:t>
+      </w:r>
+      <w:proofErr w:type="spellStart"/>
+      <w:r>
+        <w:rPr>
+          <w:color w:val="000000" w:themeColor="text1"/>
+          <w:highlight w:val="green"/>
+        </w:rPr>
+        <w:t>ho</w:t>
+      </w:r>
+      <w:proofErr w:type="spellEnd"/>
+      <w:r>
+        <w:rPr>
+          <w:color w:val="000000" w:themeColor="text1"/>
+          <w:highlight w:val="green"/>
+        </w:rPr>
+        <w:t xml:space="preserve"> with the next</w:t>
+      </w:r>
+      <w:proofErr w:type="gramStart"/>
+      <w:r>
+        <w:rPr>
+          <w:color w:val="000000" w:themeColor="text1"/>
+          <w:highlight w:val="green"/>
+        </w:rPr>
+        <w:t xml:space="preserve"> ..</w:t>
+      </w:r>
+      <w:proofErr w:type="gramEnd"/>
+    </w:p>
+    <w:p>
+      <w:pPr>
+        <w:rPr>
+          <w:color w:val="1F3864" w:themeColor="accent1" w:themeShade="80"/>
+        </w:rPr>
+      </w:pPr>
+      <w:r>
+        <w:rPr>
+          <w:color w:val="000000" w:themeColor="text1"/>
+          <w:highlight w:val="green"/>
+        </w:rPr>
+        <w:t xml:space="preserve">You have </w:t>
+      </w:r>
+      <w:proofErr w:type="spellStart"/>
+      <w:r>
+        <w:rPr>
+          <w:color w:val="000000" w:themeColor="text1"/>
+          <w:highlight w:val="green"/>
+        </w:rPr>
+        <w:t>yo</w:t>
+      </w:r>
+      <w:proofErr w:type="spellEnd"/>
+      <w:r>
+        <w:rPr>
+          <w:color w:val="000000" w:themeColor="text1"/>
+          <w:highlight w:val="green"/>
+        </w:rPr>
+        <w:t xml:space="preserve"> choose by yourself that what we will learn next</w:t>
+      </w:r>
+      <w:proofErr w:type="gramStart"/>
+      <w:r>
+        <w:rPr>
+          <w:color w:val="000000" w:themeColor="text1"/>
+          <w:highlight w:val="green"/>
+        </w:rPr>
+        <w:t xml:space="preserve"> ..</w:t>
+      </w:r>
+      <w:proofErr w:type="gramEnd"/>
+      <w:r>
+        <w:rPr>
+          <w:color w:val="000000" w:themeColor="text1"/>
+          <w:highlight w:val="green"/>
+        </w:rPr>
+        <w:t xml:space="preserve"> but as </w:t>
+      </w:r>
+      <w:proofErr w:type="spellStart"/>
+      <w:r>
+        <w:rPr>
+          <w:color w:val="000000" w:themeColor="text1"/>
+          <w:highlight w:val="green"/>
+        </w:rPr>
+        <w:t>i</w:t>
+      </w:r>
+      <w:proofErr w:type="spellEnd"/>
+      <w:r>
+        <w:rPr>
+          <w:color w:val="000000" w:themeColor="text1"/>
+          <w:highlight w:val="green"/>
+        </w:rPr>
+        <w:t xml:space="preserve"> told you go deep as you have done so far</w:t>
+      </w:r>
+    </w:p>
+    <w:p>
+      <w:pPr>
+        <w:rPr>
+          <w:color w:val="000000" w:themeColor="text1"/>
+        </w:rPr>
+      </w:pPr>
+      <w:r>
+        <w:rPr>
+          <w:color w:val="000000" w:themeColor="text1"/>
+        </w:rPr>
         <w:lastRenderedPageBreak/>
-        <w:t>Yeha</w:t>
-      </w:r>
-      <w:proofErr w:type="spellEnd"/>
-      <w:r>
-        <w:rPr>
-          <w:color w:val="000000" w:themeColor="text1"/>
-          <w:highlight w:val="green"/>
-        </w:rPr>
-        <w:t xml:space="preserve"> </w:t>
-      </w:r>
-      <w:proofErr w:type="spellStart"/>
-      <w:r>
-        <w:rPr>
-          <w:color w:val="000000" w:themeColor="text1"/>
-          <w:highlight w:val="green"/>
-        </w:rPr>
-        <w:t>itz</w:t>
-      </w:r>
-      <w:proofErr w:type="spellEnd"/>
-      <w:r>
-        <w:rPr>
-          <w:color w:val="000000" w:themeColor="text1"/>
-          <w:highlight w:val="green"/>
-        </w:rPr>
-        <w:t xml:space="preserve"> good</w:t>
-      </w:r>
-      <w:proofErr w:type="gramStart"/>
-      <w:r>
-        <w:rPr>
-          <w:color w:val="000000" w:themeColor="text1"/>
-          <w:highlight w:val="green"/>
-        </w:rPr>
-        <w:t xml:space="preserve"> ..</w:t>
-      </w:r>
-      <w:proofErr w:type="gramEnd"/>
-      <w:r>
-        <w:rPr>
-          <w:color w:val="000000" w:themeColor="text1"/>
-          <w:highlight w:val="green"/>
-        </w:rPr>
-        <w:t xml:space="preserve"> </w:t>
-      </w:r>
-      <w:proofErr w:type="spellStart"/>
-      <w:r>
-        <w:rPr>
-          <w:color w:val="000000" w:themeColor="text1"/>
-          <w:highlight w:val="green"/>
-        </w:rPr>
-        <w:t>i</w:t>
-      </w:r>
-      <w:proofErr w:type="spellEnd"/>
-      <w:r>
-        <w:rPr>
-          <w:color w:val="000000" w:themeColor="text1"/>
-          <w:highlight w:val="green"/>
-        </w:rPr>
-        <w:t xml:space="preserve"> am understanding ... </w:t>
-      </w:r>
-      <w:proofErr w:type="spellStart"/>
-      <w:r>
-        <w:rPr>
-          <w:color w:val="000000" w:themeColor="text1"/>
-          <w:highlight w:val="green"/>
-        </w:rPr>
-        <w:t>lets</w:t>
-      </w:r>
-      <w:proofErr w:type="spellEnd"/>
-      <w:r>
-        <w:rPr>
-          <w:color w:val="000000" w:themeColor="text1"/>
-          <w:highlight w:val="green"/>
-        </w:rPr>
-        <w:t xml:space="preserve"> move forward</w:t>
-      </w:r>
-      <w:proofErr w:type="gramStart"/>
-      <w:r>
-        <w:rPr>
-          <w:color w:val="000000" w:themeColor="text1"/>
-          <w:highlight w:val="green"/>
-        </w:rPr>
-        <w:t xml:space="preserve"> ..</w:t>
-      </w:r>
-      <w:proofErr w:type="gramEnd"/>
-      <w:r>
-        <w:rPr>
-          <w:color w:val="000000" w:themeColor="text1"/>
-          <w:highlight w:val="green"/>
-        </w:rPr>
-        <w:t xml:space="preserve"> we will cover the whole thing like this ... just </w:t>
-      </w:r>
-      <w:proofErr w:type="spellStart"/>
-      <w:r>
-        <w:rPr>
-          <w:color w:val="000000" w:themeColor="text1"/>
-          <w:highlight w:val="green"/>
-        </w:rPr>
-        <w:t>ho</w:t>
-      </w:r>
-      <w:proofErr w:type="spellEnd"/>
-      <w:r>
-        <w:rPr>
-          <w:color w:val="000000" w:themeColor="text1"/>
-          <w:highlight w:val="green"/>
-        </w:rPr>
-        <w:t xml:space="preserve"> with the next</w:t>
-      </w:r>
-      <w:proofErr w:type="gramStart"/>
-      <w:r>
-        <w:rPr>
-          <w:color w:val="000000" w:themeColor="text1"/>
-          <w:highlight w:val="green"/>
-        </w:rPr>
-        <w:t xml:space="preserve"> ..</w:t>
-      </w:r>
-      <w:proofErr w:type="gramEnd"/>
-    </w:p>
-    <w:p>
-      <w:pPr>
-        <w:rPr>
-          <w:color w:val="1F3864" w:themeColor="accent1" w:themeShade="80"/>
-        </w:rPr>
-      </w:pPr>
-      <w:r>
-        <w:rPr>
-          <w:color w:val="000000" w:themeColor="text1"/>
-          <w:highlight w:val="green"/>
-        </w:rPr>
-        <w:t xml:space="preserve">You have </w:t>
-      </w:r>
-      <w:proofErr w:type="spellStart"/>
-      <w:r>
-        <w:rPr>
-          <w:color w:val="000000" w:themeColor="text1"/>
-          <w:highlight w:val="green"/>
-        </w:rPr>
-        <w:t>yo</w:t>
-      </w:r>
-      <w:proofErr w:type="spellEnd"/>
-      <w:r>
-        <w:rPr>
-          <w:color w:val="000000" w:themeColor="text1"/>
-          <w:highlight w:val="green"/>
-        </w:rPr>
-        <w:t xml:space="preserve"> choose by yourself that what we will learn next</w:t>
-      </w:r>
-      <w:proofErr w:type="gramStart"/>
-      <w:r>
-        <w:rPr>
-          <w:color w:val="000000" w:themeColor="text1"/>
-          <w:highlight w:val="green"/>
-        </w:rPr>
-        <w:t xml:space="preserve"> ..</w:t>
-      </w:r>
-      <w:proofErr w:type="gramEnd"/>
-      <w:r>
-        <w:rPr>
-          <w:color w:val="000000" w:themeColor="text1"/>
-          <w:highlight w:val="green"/>
-        </w:rPr>
-        <w:t xml:space="preserve"> but as </w:t>
-      </w:r>
-      <w:proofErr w:type="spellStart"/>
-      <w:r>
-        <w:rPr>
-          <w:color w:val="000000" w:themeColor="text1"/>
-          <w:highlight w:val="green"/>
-        </w:rPr>
-        <w:t>i</w:t>
-      </w:r>
-      <w:proofErr w:type="spellEnd"/>
-      <w:r>
-        <w:rPr>
-          <w:color w:val="000000" w:themeColor="text1"/>
-          <w:highlight w:val="green"/>
-        </w:rPr>
-        <w:t xml:space="preserve"> told you go deep as you have done so far</w:t>
-      </w:r>
-    </w:p>
-    <w:p>
-      <w:pPr>
-        <w:rPr>
-          <w:color w:val="000000" w:themeColor="text1"/>
-        </w:rPr>
-      </w:pPr>
-      <w:r>
-        <w:rPr>
-          <w:color w:val="000000" w:themeColor="text1"/>
-        </w:rPr>
         <w:t>I love that you are taking the reins and trusting the process.</w:t>
       </w:r>
     </w:p>
@@ -3887,7 +3880,6 @@
         <w:rPr>
           <w:color w:val="000000" w:themeColor="text1"/>
         </w:rPr>
-        <w:lastRenderedPageBreak/>
         <w:t>list_</w:t>
       </w:r>
       <w:proofErr w:type="gramStart"/>
@@ -4670,93 +4662,93 @@
         <w:rPr>
           <w:color w:val="000000" w:themeColor="text1"/>
         </w:rPr>
+        <w:t xml:space="preserve">Note: You might also see older Python code do this using slicing: </w:t>
+      </w:r>
+      <w:proofErr w:type="spellStart"/>
+      <w:r>
+        <w:rPr>
+          <w:color w:val="000000" w:themeColor="text1"/>
+        </w:rPr>
+        <w:t>list_B</w:t>
+      </w:r>
+      <w:proofErr w:type="spellEnd"/>
+      <w:r>
+        <w:rPr>
+          <w:color w:val="000000" w:themeColor="text1"/>
+        </w:rPr>
+        <w:t xml:space="preserve"> = </w:t>
+      </w:r>
+      <w:proofErr w:type="spellStart"/>
+      <w:r>
+        <w:rPr>
+          <w:color w:val="000000" w:themeColor="text1"/>
+        </w:rPr>
+        <w:t>list_</w:t>
+      </w:r>
+      <w:proofErr w:type="gramStart"/>
+      <w:r>
+        <w:rPr>
+          <w:color w:val="000000" w:themeColor="text1"/>
+        </w:rPr>
+        <w:t>A</w:t>
+      </w:r>
+      <w:proofErr w:type="spellEnd"/>
+      <w:r>
+        <w:rPr>
+          <w:color w:val="000000" w:themeColor="text1"/>
+        </w:rPr>
+        <w:t>[</w:t>
+      </w:r>
+      <w:proofErr w:type="gramEnd"/>
+      <w:r>
+        <w:rPr>
+          <w:color w:val="000000" w:themeColor="text1"/>
+        </w:rPr>
+        <w:t xml:space="preserve">:]. It does the exact same thing </w:t>
+      </w:r>
+      <w:proofErr w:type="gramStart"/>
+      <w:r>
+        <w:rPr>
+          <w:color w:val="000000" w:themeColor="text1"/>
+        </w:rPr>
+        <w:t>as .copy</w:t>
+      </w:r>
+      <w:proofErr w:type="gramEnd"/>
+      <w:r>
+        <w:rPr>
+          <w:color w:val="000000" w:themeColor="text1"/>
+        </w:rPr>
+        <w:t>().</w:t>
+      </w:r>
+    </w:p>
+    <w:p>
+      <w:pPr>
+        <w:rPr>
+          <w:b/>
+          <w:bCs/>
+          <w:color w:val="000000" w:themeColor="text1"/>
+        </w:rPr>
+      </w:pPr>
+      <w:r>
+        <w:rPr>
+          <w:b/>
+          <w:bCs/>
+          <w:color w:val="000000" w:themeColor="text1"/>
+        </w:rPr>
+        <w:t>Level 2: The FAANG Curveball (Deep Copy)</w:t>
+      </w:r>
+    </w:p>
+    <w:p>
+      <w:pPr>
+        <w:rPr>
+          <w:color w:val="000000" w:themeColor="text1"/>
+        </w:rPr>
+      </w:pPr>
+      <w:r>
+        <w:rPr>
+          <w:color w:val="000000" w:themeColor="text1"/>
+        </w:rPr>
         <w:lastRenderedPageBreak/>
-        <w:t xml:space="preserve">Note: You might also see older Python code do this using slicing: </w:t>
-      </w:r>
-      <w:proofErr w:type="spellStart"/>
-      <w:r>
-        <w:rPr>
-          <w:color w:val="000000" w:themeColor="text1"/>
-        </w:rPr>
-        <w:t>list_B</w:t>
-      </w:r>
-      <w:proofErr w:type="spellEnd"/>
-      <w:r>
-        <w:rPr>
-          <w:color w:val="000000" w:themeColor="text1"/>
-        </w:rPr>
-        <w:t xml:space="preserve"> = </w:t>
-      </w:r>
-      <w:proofErr w:type="spellStart"/>
-      <w:r>
-        <w:rPr>
-          <w:color w:val="000000" w:themeColor="text1"/>
-        </w:rPr>
-        <w:t>list_</w:t>
-      </w:r>
-      <w:proofErr w:type="gramStart"/>
-      <w:r>
-        <w:rPr>
-          <w:color w:val="000000" w:themeColor="text1"/>
-        </w:rPr>
-        <w:t>A</w:t>
-      </w:r>
-      <w:proofErr w:type="spellEnd"/>
-      <w:r>
-        <w:rPr>
-          <w:color w:val="000000" w:themeColor="text1"/>
-        </w:rPr>
-        <w:t>[</w:t>
-      </w:r>
-      <w:proofErr w:type="gramEnd"/>
-      <w:r>
-        <w:rPr>
-          <w:color w:val="000000" w:themeColor="text1"/>
-        </w:rPr>
-        <w:t xml:space="preserve">:]. It does the exact same thing </w:t>
-      </w:r>
-      <w:proofErr w:type="gramStart"/>
-      <w:r>
-        <w:rPr>
-          <w:color w:val="000000" w:themeColor="text1"/>
-        </w:rPr>
-        <w:t>as .copy</w:t>
-      </w:r>
-      <w:proofErr w:type="gramEnd"/>
-      <w:r>
-        <w:rPr>
-          <w:color w:val="000000" w:themeColor="text1"/>
-        </w:rPr>
-        <w:t>().</w:t>
-      </w:r>
-    </w:p>
-    <w:p>
-      <w:pPr>
-        <w:rPr>
-          <w:b/>
-          <w:bCs/>
-          <w:color w:val="000000" w:themeColor="text1"/>
-        </w:rPr>
-      </w:pPr>
-      <w:r>
-        <w:rPr>
-          <w:b/>
-          <w:bCs/>
-          <w:color w:val="000000" w:themeColor="text1"/>
-        </w:rPr>
-        <w:t>Level 2: The FAANG Curveball (Deep Copy)</w:t>
-      </w:r>
-    </w:p>
-    <w:p>
-      <w:pPr>
-        <w:rPr>
-          <w:color w:val="000000" w:themeColor="text1"/>
-        </w:rPr>
-      </w:pPr>
-      <w:r>
-        <w:rPr>
-          <w:color w:val="000000" w:themeColor="text1"/>
-        </w:rPr>
         <w:t>In Machine Learning, your data is rarely just a flat list of numbers. You often deal with matrices—lists inside of lists.</w:t>
       </w:r>
     </w:p>
@@ -5439,28 +5431,28 @@
           <w:color w:val="000000" w:themeColor="text1"/>
           <w:highlight w:val="green"/>
         </w:rPr>
+        <w:t>Because .copy</w:t>
+      </w:r>
+      <w:proofErr w:type="gramEnd"/>
+      <w:r>
+        <w:rPr>
+          <w:color w:val="000000" w:themeColor="text1"/>
+          <w:highlight w:val="green"/>
+        </w:rPr>
+        <w:t>() is a Shallow Copy. It only creates a new shell for the outermost list. If there are other mutable objects (like inner lists) tucked inside, it just copies their memory addresses, not the objects themselves.</w:t>
+      </w:r>
+    </w:p>
+    <w:p>
+      <w:pPr>
+        <w:rPr>
+          <w:color w:val="000000" w:themeColor="text1"/>
+        </w:rPr>
+      </w:pPr>
+      <w:r>
+        <w:rPr>
+          <w:color w:val="000000" w:themeColor="text1"/>
+        </w:rPr>
         <w:lastRenderedPageBreak/>
-        <w:t>Because .copy</w:t>
-      </w:r>
-      <w:proofErr w:type="gramEnd"/>
-      <w:r>
-        <w:rPr>
-          <w:color w:val="000000" w:themeColor="text1"/>
-          <w:highlight w:val="green"/>
-        </w:rPr>
-        <w:t>() is a Shallow Copy. It only creates a new shell for the outermost list. If there are other mutable objects (like inner lists) tucked inside, it just copies their memory addresses, not the objects themselves.</w:t>
-      </w:r>
-    </w:p>
-    <w:p>
-      <w:pPr>
-        <w:rPr>
-          <w:color w:val="000000" w:themeColor="text1"/>
-        </w:rPr>
-      </w:pPr>
-      <w:r>
-        <w:rPr>
-          <w:color w:val="000000" w:themeColor="text1"/>
-        </w:rPr>
         <w:t xml:space="preserve">What </w:t>
       </w:r>
       <w:proofErr w:type="spellStart"/>
@@ -6091,7 +6083,6 @@
         <w:rPr>
           <w:color w:val="000000" w:themeColor="text1"/>
         </w:rPr>
-        <w:lastRenderedPageBreak/>
         <w:t>If you take Notebook B, drive to Address 100, and paint the house red... when you later open Notebook A and drive to Address 100, the house will be red. You accidentally changed the original data because they were sharing the same houses in the Heap.</w:t>
       </w:r>
     </w:p>
@@ -6228,6 +6219,7 @@
         <w:rPr>
           <w:color w:val="000000" w:themeColor="text1"/>
         </w:rPr>
+        <w:lastRenderedPageBreak/>
         <w:t xml:space="preserve">The contractor buys a </w:t>
       </w:r>
       <w:proofErr w:type="gramStart"/>
@@ -6653,7 +6645,6 @@
           <w:bCs/>
           <w:color w:val="000000" w:themeColor="text1"/>
         </w:rPr>
-        <w:lastRenderedPageBreak/>
         <w:t>Reference Counting:</w:t>
       </w:r>
       <w:r>
@@ -6880,6 +6871,7 @@
           <w:bCs/>
           <w:color w:val="000000" w:themeColor="text1"/>
         </w:rPr>
+        <w:lastRenderedPageBreak/>
         <w:t xml:space="preserve">Shallow Copy </w:t>
       </w:r>
       <w:proofErr w:type="gramStart"/>
@@ -7256,7 +7248,6 @@
         <w:rPr>
           <w:color w:val="000000" w:themeColor="text1"/>
         </w:rPr>
-        <w:lastRenderedPageBreak/>
         <w:t>print(id(score))</w:t>
       </w:r>
     </w:p>
@@ -7476,6 +7467,7 @@
         <w:rPr>
           <w:color w:val="000000" w:themeColor="text1"/>
         </w:rPr>
+        <w:lastRenderedPageBreak/>
         <w:t xml:space="preserve">Using is </w:t>
       </w:r>
       <w:proofErr w:type="spellStart"/>
@@ -8195,7 +8187,6 @@
           <w:sz w:val="56"/>
           <w:szCs w:val="56"/>
         </w:rPr>
-        <w:lastRenderedPageBreak/>
         <w:t xml:space="preserve">BASICS OF PYTHON </w:t>
       </w:r>
     </w:p>
@@ -8505,6 +8496,7 @@
           <w:bCs/>
           <w:color w:val="000000" w:themeColor="text1"/>
         </w:rPr>
+        <w:lastRenderedPageBreak/>
         <w:t>"" (The Quotes)</w:t>
       </w:r>
       <w:r>
@@ -8671,7 +8663,6 @@
         <w:rPr>
           <w:color w:val="000000" w:themeColor="text1"/>
         </w:rPr>
-        <w:lastRenderedPageBreak/>
         <w:t xml:space="preserve">Most people use Python for years without realizing that </w:t>
       </w:r>
       <w:proofErr w:type="gramStart"/>
@@ -9069,6 +9060,7 @@
           <w:bCs/>
           <w:color w:val="000000" w:themeColor="text1"/>
         </w:rPr>
+        <w:lastRenderedPageBreak/>
         <w:t>3. end='\n' (The Invisible Line Break)</w:t>
       </w:r>
     </w:p>
@@ -9174,7 +9166,6 @@
         <w:rPr>
           <w:color w:val="000000" w:themeColor="text1"/>
         </w:rPr>
-        <w:lastRenderedPageBreak/>
         <w:t>You can override this too!</w:t>
       </w:r>
     </w:p>
@@ -9536,6 +9527,7 @@
         <w:rPr>
           <w:color w:val="000000" w:themeColor="text1"/>
         </w:rPr>
+        <w:lastRenderedPageBreak/>
         <w:t xml:space="preserve">Talking to the computer screen is computationally "expensive" (it's slow). So, the operating system uses a </w:t>
       </w:r>
       <w:r>
@@ -9685,7 +9677,6 @@
         <w:rPr>
           <w:color w:val="000000" w:themeColor="text1"/>
         </w:rPr>
-        <w:lastRenderedPageBreak/>
         <w:t xml:space="preserve">This commands the operating system: </w:t>
       </w:r>
       <w:r>
@@ -9723,6 +9714,1128 @@
         </w:rPr>
         <w:t>) function. You now know literally every mechanism inside it.</w:t>
       </w:r>
+    </w:p>
+    <w:p>
+      <w:pPr>
+        <w:rPr>
+          <w:color w:val="000000" w:themeColor="text1"/>
+          <w:sz w:val="24"/>
+          <w:szCs w:val="24"/>
+        </w:rPr>
+      </w:pPr>
+    </w:p>
+    <w:p>
+      <w:pPr>
+        <w:ind w:left="-142"/>
+        <w:rPr>
+          <w:b/>
+          <w:bCs/>
+          <w:color w:val="EE0000"/>
+          <w:sz w:val="28"/>
+          <w:szCs w:val="28"/>
+        </w:rPr>
+      </w:pPr>
+      <w:r>
+        <w:rPr>
+          <w:b/>
+          <w:bCs/>
+          <w:color w:val="EE0000"/>
+          <w:sz w:val="28"/>
+          <w:szCs w:val="28"/>
+        </w:rPr>
+        <w:t>Now that you understand how the print machine works, we need to make it actually useful.</w:t>
+      </w:r>
+    </w:p>
+    <w:p>
+      <w:pPr>
+        <w:ind w:left="-142"/>
+        <w:rPr>
+          <w:color w:val="000000" w:themeColor="text1"/>
+        </w:rPr>
+      </w:pPr>
+      <w:r>
+        <w:rPr>
+          <w:color w:val="000000" w:themeColor="text1"/>
+        </w:rPr>
+        <w:t xml:space="preserve">Printing static text like "Hello World" gets boring quickly. Real engineering involves printing data that changes—our </w:t>
+      </w:r>
+      <w:r>
+        <w:rPr>
+          <w:b/>
+          <w:bCs/>
+          <w:color w:val="000000" w:themeColor="text1"/>
+        </w:rPr>
+        <w:t>Variables</w:t>
+      </w:r>
+      <w:r>
+        <w:rPr>
+          <w:color w:val="000000" w:themeColor="text1"/>
+        </w:rPr>
+        <w:t>.</w:t>
+      </w:r>
+    </w:p>
+    <w:p>
+      <w:pPr>
+        <w:rPr>
+          <w:color w:val="000000" w:themeColor="text1"/>
+        </w:rPr>
+      </w:pPr>
+      <w:r>
+        <w:rPr>
+          <w:color w:val="000000" w:themeColor="text1"/>
+        </w:rPr>
+        <w:t xml:space="preserve">Today, we are diving into </w:t>
+      </w:r>
+      <w:r>
+        <w:rPr>
+          <w:b/>
+          <w:bCs/>
+          <w:color w:val="000000" w:themeColor="text1"/>
+        </w:rPr>
+        <w:t>String Formatting</w:t>
+      </w:r>
+      <w:r>
+        <w:rPr>
+          <w:color w:val="000000" w:themeColor="text1"/>
+        </w:rPr>
+        <w:t xml:space="preserve">. We are going to look at the old, broken ways people used to do this, and then I will show you the modern FAANG standard: the </w:t>
+      </w:r>
+      <w:r>
+        <w:rPr>
+          <w:b/>
+          <w:bCs/>
+          <w:color w:val="000000" w:themeColor="text1"/>
+        </w:rPr>
+        <w:t>f-string</w:t>
+      </w:r>
+      <w:r>
+        <w:rPr>
+          <w:color w:val="000000" w:themeColor="text1"/>
+        </w:rPr>
+        <w:t>.</w:t>
+      </w:r>
+    </w:p>
+    <w:p>
+      <w:pPr>
+        <w:rPr>
+          <w:b/>
+          <w:bCs/>
+          <w:color w:val="000000" w:themeColor="text1"/>
+        </w:rPr>
+      </w:pPr>
+      <w:r>
+        <w:rPr>
+          <w:b/>
+          <w:bCs/>
+          <w:color w:val="000000" w:themeColor="text1"/>
+        </w:rPr>
+        <w:t>The Problem: Mixing Text and Data</w:t>
+      </w:r>
+    </w:p>
+    <w:p>
+      <w:pPr>
+        <w:rPr>
+          <w:color w:val="000000" w:themeColor="text1"/>
+        </w:rPr>
+      </w:pPr>
+      <w:r>
+        <w:rPr>
+          <w:color w:val="000000" w:themeColor="text1"/>
+        </w:rPr>
+        <w:t>Let's say we have two variables sitting in our Stack, pointing to data in our Heap:</w:t>
+      </w:r>
+    </w:p>
+    <w:p>
+      <w:pPr>
+        <w:rPr>
+          <w:color w:val="000000" w:themeColor="text1"/>
+        </w:rPr>
+      </w:pPr>
+      <w:r>
+        <w:rPr>
+          <w:color w:val="000000" w:themeColor="text1"/>
+        </w:rPr>
+        <w:t>Python</w:t>
+      </w:r>
+    </w:p>
+    <w:p>
+      <w:pPr>
+        <w:rPr>
+          <w:color w:val="000000" w:themeColor="text1"/>
+        </w:rPr>
+      </w:pPr>
+      <w:proofErr w:type="spellStart"/>
+      <w:r>
+        <w:rPr>
+          <w:color w:val="000000" w:themeColor="text1"/>
+        </w:rPr>
+        <w:t>player_name</w:t>
+      </w:r>
+      <w:proofErr w:type="spellEnd"/>
+      <w:r>
+        <w:rPr>
+          <w:color w:val="000000" w:themeColor="text1"/>
+        </w:rPr>
+        <w:t xml:space="preserve"> = "</w:t>
+      </w:r>
+      <w:proofErr w:type="spellStart"/>
+      <w:r>
+        <w:rPr>
+          <w:color w:val="000000" w:themeColor="text1"/>
+        </w:rPr>
+        <w:t>Adeal</w:t>
+      </w:r>
+      <w:proofErr w:type="spellEnd"/>
+      <w:proofErr w:type="gramStart"/>
+      <w:r>
+        <w:rPr>
+          <w:color w:val="000000" w:themeColor="text1"/>
+        </w:rPr>
+        <w:t>"  #</w:t>
+      </w:r>
+      <w:proofErr w:type="gramEnd"/>
+      <w:r>
+        <w:rPr>
+          <w:color w:val="000000" w:themeColor="text1"/>
+        </w:rPr>
+        <w:t xml:space="preserve"> A String</w:t>
+      </w:r>
+    </w:p>
+    <w:p>
+      <w:pPr>
+        <w:rPr>
+          <w:color w:val="000000" w:themeColor="text1"/>
+        </w:rPr>
+      </w:pPr>
+      <w:r>
+        <w:rPr>
+          <w:color w:val="000000" w:themeColor="text1"/>
+        </w:rPr>
+        <w:t>score = 100            # An Integer</w:t>
+      </w:r>
+    </w:p>
+    <w:p>
+      <w:pPr>
+        <w:rPr>
+          <w:color w:val="000000" w:themeColor="text1"/>
+        </w:rPr>
+      </w:pPr>
+      <w:r>
+        <w:rPr>
+          <w:color w:val="000000" w:themeColor="text1"/>
+        </w:rPr>
+        <w:t xml:space="preserve">We want to print: </w:t>
+      </w:r>
+      <w:proofErr w:type="spellStart"/>
+      <w:r>
+        <w:rPr>
+          <w:color w:val="000000" w:themeColor="text1"/>
+        </w:rPr>
+        <w:t>Adeal</w:t>
+      </w:r>
+      <w:proofErr w:type="spellEnd"/>
+      <w:r>
+        <w:rPr>
+          <w:color w:val="000000" w:themeColor="text1"/>
+        </w:rPr>
+        <w:t xml:space="preserve"> has 100 points.</w:t>
+      </w:r>
+    </w:p>
+    <w:p>
+      <w:pPr>
+        <w:rPr>
+          <w:b/>
+          <w:bCs/>
+          <w:color w:val="000000" w:themeColor="text1"/>
+        </w:rPr>
+      </w:pPr>
+      <w:r>
+        <w:rPr>
+          <w:b/>
+          <w:bCs/>
+          <w:color w:val="000000" w:themeColor="text1"/>
+        </w:rPr>
+        <w:t>The Old, Clunky Way (Concatenation)</w:t>
+      </w:r>
+    </w:p>
+    <w:p>
+      <w:pPr>
+        <w:rPr>
+          <w:color w:val="000000" w:themeColor="text1"/>
+        </w:rPr>
+      </w:pPr>
+      <w:r>
+        <w:rPr>
+          <w:color w:val="000000" w:themeColor="text1"/>
+        </w:rPr>
+        <w:t>In the early days of Python, developers glued text and variables together using the + math symbol. This is called concatenation.</w:t>
+      </w:r>
+    </w:p>
+    <w:p>
+      <w:pPr>
+        <w:rPr>
+          <w:color w:val="000000" w:themeColor="text1"/>
+        </w:rPr>
+      </w:pPr>
+      <w:r>
+        <w:rPr>
+          <w:color w:val="000000" w:themeColor="text1"/>
+        </w:rPr>
+        <w:t>Python</w:t>
+      </w:r>
+    </w:p>
+    <w:p>
+      <w:pPr>
+        <w:rPr>
+          <w:color w:val="000000" w:themeColor="text1"/>
+        </w:rPr>
+      </w:pPr>
+      <w:proofErr w:type="gramStart"/>
+      <w:r>
+        <w:rPr>
+          <w:color w:val="000000" w:themeColor="text1"/>
+        </w:rPr>
+        <w:t>print(</w:t>
+      </w:r>
+      <w:proofErr w:type="spellStart"/>
+      <w:proofErr w:type="gramEnd"/>
+      <w:r>
+        <w:rPr>
+          <w:color w:val="000000" w:themeColor="text1"/>
+        </w:rPr>
+        <w:t>player_name</w:t>
+      </w:r>
+      <w:proofErr w:type="spellEnd"/>
+      <w:r>
+        <w:rPr>
+          <w:color w:val="000000" w:themeColor="text1"/>
+        </w:rPr>
+        <w:t xml:space="preserve"> + " has " + score + " points.") </w:t>
+      </w:r>
+    </w:p>
+    <w:p>
+      <w:pPr>
+        <w:rPr>
+          <w:color w:val="000000" w:themeColor="text1"/>
+        </w:rPr>
+      </w:pPr>
+      <w:r>
+        <w:rPr>
+          <w:color w:val="000000" w:themeColor="text1"/>
+        </w:rPr>
+        <w:t xml:space="preserve">If you run this, </w:t>
+      </w:r>
+      <w:r>
+        <w:rPr>
+          <w:b/>
+          <w:bCs/>
+          <w:color w:val="000000" w:themeColor="text1"/>
+        </w:rPr>
+        <w:t>your program will crash.</w:t>
+      </w:r>
+      <w:r>
+        <w:rPr>
+          <w:color w:val="000000" w:themeColor="text1"/>
+        </w:rPr>
+        <w:t xml:space="preserve"> Python will throw a </w:t>
+      </w:r>
+      <w:proofErr w:type="spellStart"/>
+      <w:r>
+        <w:rPr>
+          <w:color w:val="000000" w:themeColor="text1"/>
+        </w:rPr>
+        <w:t>TypeError</w:t>
+      </w:r>
+      <w:proofErr w:type="spellEnd"/>
+      <w:r>
+        <w:rPr>
+          <w:color w:val="000000" w:themeColor="text1"/>
+        </w:rPr>
+        <w:t>.</w:t>
+      </w:r>
+    </w:p>
+    <w:p>
+      <w:pPr>
+        <w:rPr>
+          <w:color w:val="000000" w:themeColor="text1"/>
+        </w:rPr>
+      </w:pPr>
+      <w:r>
+        <w:rPr>
+          <w:color w:val="000000" w:themeColor="text1"/>
+        </w:rPr>
+        <w:t xml:space="preserve">Why? Because Python is strictly typed. It looks at the + sign and panics. It says: </w:t>
+      </w:r>
+      <w:r>
+        <w:rPr>
+          <w:i/>
+          <w:iCs/>
+          <w:color w:val="000000" w:themeColor="text1"/>
+        </w:rPr>
+        <w:t>"You are asking me to do math between text ('</w:t>
+      </w:r>
+      <w:proofErr w:type="spellStart"/>
+      <w:r>
+        <w:rPr>
+          <w:i/>
+          <w:iCs/>
+          <w:color w:val="000000" w:themeColor="text1"/>
+        </w:rPr>
+        <w:t>Adeal</w:t>
+      </w:r>
+      <w:proofErr w:type="spellEnd"/>
+      <w:r>
+        <w:rPr>
+          <w:i/>
+          <w:iCs/>
+          <w:color w:val="000000" w:themeColor="text1"/>
+        </w:rPr>
+        <w:t>') and a raw number (100). I cannot add words and math together!"</w:t>
+      </w:r>
+    </w:p>
+    <w:p>
+      <w:pPr>
+        <w:rPr>
+          <w:color w:val="000000" w:themeColor="text1"/>
+        </w:rPr>
+      </w:pPr>
+      <w:r>
+        <w:rPr>
+          <w:color w:val="000000" w:themeColor="text1"/>
+        </w:rPr>
+        <w:lastRenderedPageBreak/>
+        <w:t xml:space="preserve">To fix this, older developers had to manually wrap every number in a string converter machine called </w:t>
+      </w:r>
+      <w:proofErr w:type="gramStart"/>
+      <w:r>
+        <w:rPr>
+          <w:color w:val="000000" w:themeColor="text1"/>
+        </w:rPr>
+        <w:t>str(</w:t>
+      </w:r>
+      <w:proofErr w:type="gramEnd"/>
+      <w:r>
+        <w:rPr>
+          <w:color w:val="000000" w:themeColor="text1"/>
+        </w:rPr>
+        <w:t>), like this: str(score). It made the code incredibly ugly and hard to read.</w:t>
+      </w:r>
+    </w:p>
+    <w:p>
+      <w:pPr>
+        <w:rPr>
+          <w:b/>
+          <w:bCs/>
+          <w:color w:val="000000" w:themeColor="text1"/>
+        </w:rPr>
+      </w:pPr>
+      <w:r>
+        <w:rPr>
+          <w:b/>
+          <w:bCs/>
+          <w:color w:val="000000" w:themeColor="text1"/>
+        </w:rPr>
+        <w:t>The FAANG Standard: The f-string</w:t>
+      </w:r>
+    </w:p>
+    <w:p>
+      <w:pPr>
+        <w:rPr>
+          <w:color w:val="000000" w:themeColor="text1"/>
+        </w:rPr>
+      </w:pPr>
+      <w:r>
+        <w:rPr>
+          <w:color w:val="000000" w:themeColor="text1"/>
+        </w:rPr>
+        <w:t xml:space="preserve">In Python 3.6, the creators of Python introduced a masterpiece: </w:t>
+      </w:r>
+      <w:r>
+        <w:rPr>
+          <w:b/>
+          <w:bCs/>
+          <w:color w:val="000000" w:themeColor="text1"/>
+        </w:rPr>
+        <w:t>Formatted String Literals</w:t>
+      </w:r>
+      <w:r>
+        <w:rPr>
+          <w:color w:val="000000" w:themeColor="text1"/>
+        </w:rPr>
+        <w:t xml:space="preserve">, known as </w:t>
+      </w:r>
+      <w:r>
+        <w:rPr>
+          <w:b/>
+          <w:bCs/>
+          <w:color w:val="000000" w:themeColor="text1"/>
+        </w:rPr>
+        <w:t>f-strings</w:t>
+      </w:r>
+      <w:r>
+        <w:rPr>
+          <w:color w:val="000000" w:themeColor="text1"/>
+        </w:rPr>
+        <w:t xml:space="preserve">. This is the </w:t>
+      </w:r>
+      <w:r>
+        <w:rPr>
+          <w:i/>
+          <w:iCs/>
+          <w:color w:val="000000" w:themeColor="text1"/>
+        </w:rPr>
+        <w:t>only</w:t>
+      </w:r>
+      <w:r>
+        <w:rPr>
+          <w:color w:val="000000" w:themeColor="text1"/>
+        </w:rPr>
+        <w:t xml:space="preserve"> way you should combine text and variables today.</w:t>
+      </w:r>
+    </w:p>
+    <w:p>
+      <w:pPr>
+        <w:rPr>
+          <w:color w:val="000000" w:themeColor="text1"/>
+        </w:rPr>
+      </w:pPr>
+      <w:r>
+        <w:rPr>
+          <w:color w:val="000000" w:themeColor="text1"/>
+        </w:rPr>
+        <w:t>Here is how you write it:</w:t>
+      </w:r>
+    </w:p>
+    <w:p>
+      <w:pPr>
+        <w:rPr>
+          <w:color w:val="000000" w:themeColor="text1"/>
+        </w:rPr>
+      </w:pPr>
+      <w:r>
+        <w:rPr>
+          <w:color w:val="000000" w:themeColor="text1"/>
+        </w:rPr>
+        <w:t>Python</w:t>
+      </w:r>
+    </w:p>
+    <w:p>
+      <w:pPr>
+        <w:rPr>
+          <w:color w:val="000000" w:themeColor="text1"/>
+        </w:rPr>
+      </w:pPr>
+      <w:proofErr w:type="spellStart"/>
+      <w:r>
+        <w:rPr>
+          <w:color w:val="000000" w:themeColor="text1"/>
+        </w:rPr>
+        <w:t>player_name</w:t>
+      </w:r>
+      <w:proofErr w:type="spellEnd"/>
+      <w:r>
+        <w:rPr>
+          <w:color w:val="000000" w:themeColor="text1"/>
+        </w:rPr>
+        <w:t xml:space="preserve"> = "</w:t>
+      </w:r>
+      <w:proofErr w:type="spellStart"/>
+      <w:r>
+        <w:rPr>
+          <w:color w:val="000000" w:themeColor="text1"/>
+        </w:rPr>
+        <w:t>Adeal</w:t>
+      </w:r>
+      <w:proofErr w:type="spellEnd"/>
+      <w:r>
+        <w:rPr>
+          <w:color w:val="000000" w:themeColor="text1"/>
+        </w:rPr>
+        <w:t>"</w:t>
+      </w:r>
+    </w:p>
+    <w:p>
+      <w:pPr>
+        <w:rPr>
+          <w:color w:val="000000" w:themeColor="text1"/>
+        </w:rPr>
+      </w:pPr>
+      <w:r>
+        <w:rPr>
+          <w:color w:val="000000" w:themeColor="text1"/>
+        </w:rPr>
+        <w:t>score = 100</w:t>
+      </w:r>
+    </w:p>
+    <w:p>
+      <w:pPr>
+        <w:rPr>
+          <w:color w:val="000000" w:themeColor="text1"/>
+        </w:rPr>
+      </w:pPr>
+    </w:p>
+    <w:p>
+      <w:pPr>
+        <w:rPr>
+          <w:color w:val="000000" w:themeColor="text1"/>
+        </w:rPr>
+      </w:pPr>
+      <w:r>
+        <w:rPr>
+          <w:color w:val="000000" w:themeColor="text1"/>
+        </w:rPr>
+        <w:t>print(f"{</w:t>
+      </w:r>
+      <w:proofErr w:type="spellStart"/>
+      <w:r>
+        <w:rPr>
+          <w:color w:val="000000" w:themeColor="text1"/>
+        </w:rPr>
+        <w:t>player_name</w:t>
+      </w:r>
+      <w:proofErr w:type="spellEnd"/>
+      <w:r>
+        <w:rPr>
+          <w:color w:val="000000" w:themeColor="text1"/>
+        </w:rPr>
+        <w:t>} has {score} points.")</w:t>
+      </w:r>
+    </w:p>
+    <w:p>
+      <w:pPr>
+        <w:rPr>
+          <w:color w:val="000000" w:themeColor="text1"/>
+        </w:rPr>
+      </w:pPr>
+      <w:r>
+        <w:rPr>
+          <w:color w:val="000000" w:themeColor="text1"/>
+        </w:rPr>
+        <w:t>Let’s go deep into the mechanics of why this works and what it is actually doing in memory.</w:t>
+      </w:r>
+    </w:p>
+    <w:p>
+      <w:pPr>
+        <w:rPr>
+          <w:b/>
+          <w:bCs/>
+          <w:color w:val="000000" w:themeColor="text1"/>
+        </w:rPr>
+      </w:pPr>
+      <w:r>
+        <w:rPr>
+          <w:b/>
+          <w:bCs/>
+          <w:color w:val="000000" w:themeColor="text1"/>
+        </w:rPr>
+        <w:t>The Mechanics of the f-string</w:t>
+      </w:r>
+    </w:p>
+    <w:p>
+      <w:pPr>
+        <w:numPr>
+          <w:ilvl w:val="0"/>
+          <w:numId w:val="26"/>
+        </w:numPr>
+        <w:rPr>
+          <w:color w:val="000000" w:themeColor="text1"/>
+        </w:rPr>
+      </w:pPr>
+      <w:r>
+        <w:rPr>
+          <w:b/>
+          <w:bCs/>
+          <w:color w:val="000000" w:themeColor="text1"/>
+        </w:rPr>
+        <w:t>The f Trigger:</w:t>
+      </w:r>
+      <w:r>
+        <w:rPr>
+          <w:color w:val="000000" w:themeColor="text1"/>
+        </w:rPr>
+        <w:t xml:space="preserve"> Notice the letter f sitting directly outside the quotation marks. This is a command to Python. Normally, anything inside quotes is treated as "dumb text"—Python just blindly prints it. But the f tells Python: </w:t>
+      </w:r>
+      <w:r>
+        <w:rPr>
+          <w:i/>
+          <w:iCs/>
+          <w:color w:val="000000" w:themeColor="text1"/>
+        </w:rPr>
+        <w:t>"Stop! Do not treat this as dumb text. Scan the inside of these quotes for hidden portals."</w:t>
+      </w:r>
+    </w:p>
+    <w:p>
+      <w:pPr>
+        <w:numPr>
+          <w:ilvl w:val="0"/>
+          <w:numId w:val="26"/>
+        </w:numPr>
+        <w:rPr>
+          <w:color w:val="000000" w:themeColor="text1"/>
+        </w:rPr>
+      </w:pPr>
+      <w:r>
+        <w:rPr>
+          <w:b/>
+          <w:bCs/>
+          <w:color w:val="000000" w:themeColor="text1"/>
+        </w:rPr>
+        <w:t>The {} Portals:</w:t>
+      </w:r>
+      <w:r>
+        <w:rPr>
+          <w:color w:val="000000" w:themeColor="text1"/>
+        </w:rPr>
+        <w:t xml:space="preserve"> The curly braces {} act as live windows looking directly into your Stack memory.</w:t>
+      </w:r>
+    </w:p>
+    <w:p>
+      <w:pPr>
+        <w:numPr>
+          <w:ilvl w:val="0"/>
+          <w:numId w:val="26"/>
+        </w:numPr>
+        <w:rPr>
+          <w:color w:val="000000" w:themeColor="text1"/>
+        </w:rPr>
+      </w:pPr>
+      <w:r>
+        <w:rPr>
+          <w:b/>
+          <w:bCs/>
+          <w:color w:val="000000" w:themeColor="text1"/>
+        </w:rPr>
+        <w:t>The Extraction:</w:t>
+      </w:r>
+      <w:r>
+        <w:rPr>
+          <w:color w:val="000000" w:themeColor="text1"/>
+        </w:rPr>
+        <w:t xml:space="preserve"> When Python scans the text and finds {</w:t>
+      </w:r>
+      <w:proofErr w:type="spellStart"/>
+      <w:r>
+        <w:rPr>
+          <w:color w:val="000000" w:themeColor="text1"/>
+        </w:rPr>
+        <w:t>player_name</w:t>
+      </w:r>
+      <w:proofErr w:type="spellEnd"/>
+      <w:r>
+        <w:rPr>
+          <w:color w:val="000000" w:themeColor="text1"/>
+        </w:rPr>
+        <w:t xml:space="preserve">}, it reaches through that window, goes into the Stack, finds the name tag </w:t>
+      </w:r>
+      <w:proofErr w:type="spellStart"/>
+      <w:r>
+        <w:rPr>
+          <w:color w:val="000000" w:themeColor="text1"/>
+        </w:rPr>
+        <w:t>player_name</w:t>
+      </w:r>
+      <w:proofErr w:type="spellEnd"/>
+      <w:r>
+        <w:rPr>
+          <w:color w:val="000000" w:themeColor="text1"/>
+        </w:rPr>
+        <w:t>, follows the pointer to the Heap, grabs the string "</w:t>
+      </w:r>
+      <w:proofErr w:type="spellStart"/>
+      <w:r>
+        <w:rPr>
+          <w:color w:val="000000" w:themeColor="text1"/>
+        </w:rPr>
+        <w:t>Adeal</w:t>
+      </w:r>
+      <w:proofErr w:type="spellEnd"/>
+      <w:r>
+        <w:rPr>
+          <w:color w:val="000000" w:themeColor="text1"/>
+        </w:rPr>
+        <w:t>", and injects it into the text.</w:t>
+      </w:r>
+    </w:p>
+    <w:p>
+      <w:pPr>
+        <w:numPr>
+          <w:ilvl w:val="0"/>
+          <w:numId w:val="26"/>
+        </w:numPr>
+        <w:rPr>
+          <w:color w:val="000000" w:themeColor="text1"/>
+        </w:rPr>
+      </w:pPr>
+      <w:r>
+        <w:rPr>
+          <w:b/>
+          <w:bCs/>
+          <w:color w:val="000000" w:themeColor="text1"/>
+        </w:rPr>
+        <w:t>The Automatic Conversion:</w:t>
+      </w:r>
+      <w:r>
+        <w:rPr>
+          <w:color w:val="000000" w:themeColor="text1"/>
+        </w:rPr>
+        <w:t xml:space="preserve"> When it hits {score}, it grabs the integer 100 from the Heap. Because it is an f-string, Python </w:t>
+      </w:r>
+      <w:r>
+        <w:rPr>
+          <w:i/>
+          <w:iCs/>
+          <w:color w:val="000000" w:themeColor="text1"/>
+        </w:rPr>
+        <w:t>automatically</w:t>
+      </w:r>
+      <w:r>
+        <w:rPr>
+          <w:color w:val="000000" w:themeColor="text1"/>
+        </w:rPr>
+        <w:t xml:space="preserve"> converts the integer into a text string behind the scenes so the program doesn't crash.</w:t>
+      </w:r>
+    </w:p>
+    <w:p>
+      <w:pPr>
+        <w:rPr>
+          <w:b/>
+          <w:bCs/>
+          <w:color w:val="000000" w:themeColor="text1"/>
+        </w:rPr>
+      </w:pPr>
+      <w:r>
+        <w:rPr>
+          <w:b/>
+          <w:bCs/>
+          <w:color w:val="000000" w:themeColor="text1"/>
+        </w:rPr>
+        <w:t>The Hidden Power of f-strings</w:t>
+      </w:r>
+    </w:p>
+    <w:p>
+      <w:pPr>
+        <w:rPr>
+          <w:color w:val="000000" w:themeColor="text1"/>
+        </w:rPr>
+      </w:pPr>
+      <w:r>
+        <w:rPr>
+          <w:color w:val="000000" w:themeColor="text1"/>
+        </w:rPr>
+        <w:t xml:space="preserve">Because the {} are live portals to your computer's brain, you don't just have to put variable names inside them. You can put </w:t>
+      </w:r>
+      <w:r>
+        <w:rPr>
+          <w:b/>
+          <w:bCs/>
+          <w:color w:val="000000" w:themeColor="text1"/>
+        </w:rPr>
+        <w:t>actual math and logic</w:t>
+      </w:r>
+      <w:r>
+        <w:rPr>
+          <w:color w:val="000000" w:themeColor="text1"/>
+        </w:rPr>
+        <w:t xml:space="preserve"> inside the braces, and Python will calculate it </w:t>
+      </w:r>
+      <w:r>
+        <w:rPr>
+          <w:i/>
+          <w:iCs/>
+          <w:color w:val="000000" w:themeColor="text1"/>
+        </w:rPr>
+        <w:t>before</w:t>
+      </w:r>
+      <w:r>
+        <w:rPr>
+          <w:color w:val="000000" w:themeColor="text1"/>
+        </w:rPr>
+        <w:t xml:space="preserve"> it prints the sentence.</w:t>
+      </w:r>
+    </w:p>
+    <w:p>
+      <w:pPr>
+        <w:rPr>
+          <w:color w:val="000000" w:themeColor="text1"/>
+        </w:rPr>
+      </w:pPr>
+      <w:r>
+        <w:rPr>
+          <w:color w:val="000000" w:themeColor="text1"/>
+        </w:rPr>
+        <w:t>Look at this:</w:t>
+      </w:r>
+    </w:p>
+    <w:p>
+      <w:pPr>
+        <w:rPr>
+          <w:color w:val="000000" w:themeColor="text1"/>
+        </w:rPr>
+      </w:pPr>
+      <w:r>
+        <w:rPr>
+          <w:color w:val="000000" w:themeColor="text1"/>
+        </w:rPr>
+        <w:t>Python</w:t>
+      </w:r>
+    </w:p>
+    <w:p>
+      <w:pPr>
+        <w:rPr>
+          <w:color w:val="000000" w:themeColor="text1"/>
+        </w:rPr>
+      </w:pPr>
+      <w:r>
+        <w:rPr>
+          <w:color w:val="000000" w:themeColor="text1"/>
+        </w:rPr>
+        <w:t>score = 100</w:t>
+      </w:r>
+    </w:p>
+    <w:p>
+      <w:pPr>
+        <w:rPr>
+          <w:color w:val="000000" w:themeColor="text1"/>
+        </w:rPr>
+      </w:pPr>
+    </w:p>
+    <w:p>
+      <w:pPr>
+        <w:rPr>
+          <w:color w:val="000000" w:themeColor="text1"/>
+        </w:rPr>
+      </w:pPr>
+      <w:proofErr w:type="gramStart"/>
+      <w:r>
+        <w:rPr>
+          <w:color w:val="000000" w:themeColor="text1"/>
+        </w:rPr>
+        <w:t>print(</w:t>
+      </w:r>
+      <w:proofErr w:type="spellStart"/>
+      <w:proofErr w:type="gramEnd"/>
+      <w:r>
+        <w:rPr>
+          <w:color w:val="000000" w:themeColor="text1"/>
+        </w:rPr>
+        <w:t>f"Double</w:t>
+      </w:r>
+      <w:proofErr w:type="spellEnd"/>
+      <w:r>
+        <w:rPr>
+          <w:color w:val="000000" w:themeColor="text1"/>
+        </w:rPr>
+        <w:t xml:space="preserve"> the score is {score * 2}.")</w:t>
+      </w:r>
+    </w:p>
+    <w:p>
+      <w:pPr>
+        <w:rPr>
+          <w:color w:val="000000" w:themeColor="text1"/>
+        </w:rPr>
+      </w:pPr>
+      <w:r>
+        <w:rPr>
+          <w:b/>
+          <w:bCs/>
+          <w:color w:val="000000" w:themeColor="text1"/>
+        </w:rPr>
+        <w:t>Output:</w:t>
+      </w:r>
+      <w:r>
+        <w:rPr>
+          <w:color w:val="000000" w:themeColor="text1"/>
+        </w:rPr>
+        <w:t xml:space="preserve"> Double the score is 200.</w:t>
+      </w:r>
+    </w:p>
+    <w:p>
+      <w:pPr>
+        <w:rPr>
+          <w:color w:val="000000" w:themeColor="text1"/>
+        </w:rPr>
+      </w:pPr>
+      <w:r>
+        <w:rPr>
+          <w:color w:val="000000" w:themeColor="text1"/>
+        </w:rPr>
+        <w:t>Python goes into the {} portal, does the multiplication operation on the processor, gets the result, turns it into text, and prints it.</w:t>
+      </w:r>
+    </w:p>
+    <w:p>
+      <w:pPr>
+        <w:rPr>
+          <w:b/>
+          <w:bCs/>
+          <w:color w:val="000000" w:themeColor="text1"/>
+        </w:rPr>
+      </w:pPr>
+      <w:r>
+        <w:rPr>
+          <w:b/>
+          <w:bCs/>
+          <w:color w:val="000000" w:themeColor="text1"/>
+        </w:rPr>
+        <w:t>Formatting Decimals (The ML Use Case)</w:t>
+      </w:r>
+    </w:p>
+    <w:p>
+      <w:pPr>
+        <w:rPr>
+          <w:color w:val="000000" w:themeColor="text1"/>
+        </w:rPr>
+      </w:pPr>
+      <w:r>
+        <w:rPr>
+          <w:color w:val="000000" w:themeColor="text1"/>
+        </w:rPr>
+        <w:lastRenderedPageBreak/>
+        <w:t>As an ML engineer, your models will often spit out crazy, long numbers like 0.849382749. You don't want to print all of that to the user. F-strings have a secret mini-language inside them to control how things look.</w:t>
+      </w:r>
+    </w:p>
+    <w:p>
+      <w:pPr>
+        <w:rPr>
+          <w:color w:val="000000" w:themeColor="text1"/>
+        </w:rPr>
+      </w:pPr>
+      <w:r>
+        <w:rPr>
+          <w:color w:val="000000" w:themeColor="text1"/>
+        </w:rPr>
+        <w:t>Python</w:t>
+      </w:r>
+    </w:p>
+    <w:p>
+      <w:pPr>
+        <w:rPr>
+          <w:color w:val="000000" w:themeColor="text1"/>
+        </w:rPr>
+      </w:pPr>
+      <w:r>
+        <w:rPr>
+          <w:color w:val="000000" w:themeColor="text1"/>
+        </w:rPr>
+        <w:t>accuracy = 0.849382749</w:t>
+      </w:r>
+    </w:p>
+    <w:p>
+      <w:pPr>
+        <w:rPr>
+          <w:color w:val="000000" w:themeColor="text1"/>
+        </w:rPr>
+      </w:pPr>
+    </w:p>
+    <w:p>
+      <w:pPr>
+        <w:rPr>
+          <w:color w:val="000000" w:themeColor="text1"/>
+        </w:rPr>
+      </w:pPr>
+      <w:r>
+        <w:rPr>
+          <w:color w:val="000000" w:themeColor="text1"/>
+        </w:rPr>
+        <w:t xml:space="preserve"># </w:t>
+      </w:r>
+      <w:proofErr w:type="gramStart"/>
+      <w:r>
+        <w:rPr>
+          <w:color w:val="000000" w:themeColor="text1"/>
+        </w:rPr>
+        <w:t>The :</w:t>
+      </w:r>
+      <w:proofErr w:type="gramEnd"/>
+      <w:r>
+        <w:rPr>
+          <w:color w:val="000000" w:themeColor="text1"/>
+        </w:rPr>
+        <w:t xml:space="preserve">.2f tells Python </w:t>
+      </w:r>
+      <w:proofErr w:type="gramStart"/>
+      <w:r>
+        <w:rPr>
+          <w:color w:val="000000" w:themeColor="text1"/>
+        </w:rPr>
+        <w:t>"format</w:t>
+      </w:r>
+      <w:proofErr w:type="gramEnd"/>
+      <w:r>
+        <w:rPr>
+          <w:color w:val="000000" w:themeColor="text1"/>
+        </w:rPr>
+        <w:t xml:space="preserve"> this as a Float, but chop it off after 2 decimal places"</w:t>
+      </w:r>
+    </w:p>
+    <w:p>
+      <w:pPr>
+        <w:rPr>
+          <w:color w:val="000000" w:themeColor="text1"/>
+        </w:rPr>
+      </w:pPr>
+      <w:proofErr w:type="gramStart"/>
+      <w:r>
+        <w:rPr>
+          <w:color w:val="000000" w:themeColor="text1"/>
+        </w:rPr>
+        <w:t>print(</w:t>
+      </w:r>
+      <w:proofErr w:type="spellStart"/>
+      <w:proofErr w:type="gramEnd"/>
+      <w:r>
+        <w:rPr>
+          <w:color w:val="000000" w:themeColor="text1"/>
+        </w:rPr>
+        <w:t>f"The</w:t>
+      </w:r>
+      <w:proofErr w:type="spellEnd"/>
+      <w:r>
+        <w:rPr>
+          <w:color w:val="000000" w:themeColor="text1"/>
+        </w:rPr>
+        <w:t xml:space="preserve"> model's accuracy is {accuracy:.2f}")</w:t>
+      </w:r>
+    </w:p>
+    <w:p>
+      <w:pPr>
+        <w:rPr>
+          <w:color w:val="000000" w:themeColor="text1"/>
+        </w:rPr>
+      </w:pPr>
+      <w:r>
+        <w:rPr>
+          <w:b/>
+          <w:bCs/>
+          <w:color w:val="000000" w:themeColor="text1"/>
+        </w:rPr>
+        <w:t>Output:</w:t>
+      </w:r>
+      <w:r>
+        <w:rPr>
+          <w:color w:val="000000" w:themeColor="text1"/>
+        </w:rPr>
+        <w:t xml:space="preserve"> The model's accuracy is 0.85</w:t>
+      </w:r>
+    </w:p>
+    <w:p>
+      <w:pPr>
+        <w:rPr>
+          <w:color w:val="000000" w:themeColor="text1"/>
+        </w:rPr>
+      </w:pPr>
+      <w:r>
+        <w:rPr>
+          <w:color w:val="000000" w:themeColor="text1"/>
+        </w:rPr>
+        <w:t>You now know how to output data perfectly. But a program is a two-way street. It shouldn't just talk to the user; it needs to listen to them.</w:t>
+      </w:r>
+    </w:p>
+    <w:p>
+      <w:pPr>
+        <w:rPr>
+          <w:color w:val="000000" w:themeColor="text1"/>
+        </w:rPr>
+      </w:pPr>
     </w:p>
     <w:p>
       <w:pPr>
@@ -9762,7 +10875,7 @@
     <w:p/>
     <w:sectPr>
       <w:pgSz w:w="11906" w:h="16838"/>
-      <w:pgMar w:top="1440" w:right="1440" w:bottom="1440" w:left="1440" w:header="708" w:footer="708" w:gutter="0"/>
+      <w:pgMar w:top="1440" w:right="707" w:bottom="993" w:left="709" w:header="708" w:footer="708" w:gutter="0"/>
       <w:cols w:space="708"/>
       <w:docGrid w:linePitch="360"/>
     </w:sectPr>
@@ -10934,6 +12047,119 @@
     </w:lvl>
   </w:abstractNum>
   <w:abstractNum w:abstractNumId="9" w15:restartNumberingAfterBreak="0">
+    <w:nsid w:val="2BF5247C"/>
+    <w:multiLevelType w:val="multilevel"/>
+    <w:tmpl w:val="DAA80C4E"/>
+    <w:lvl w:ilvl="0">
+      <w:start w:val="1"/>
+      <w:numFmt w:val="decimal"/>
+      <w:lvlText w:val="%1."/>
+      <w:lvlJc w:val="left"/>
+      <w:pPr>
+        <w:tabs>
+          <w:tab w:val="num" w:pos="720"/>
+        </w:tabs>
+        <w:ind w:left="720" w:hanging="360"/>
+      </w:pPr>
+    </w:lvl>
+    <w:lvl w:ilvl="1" w:tentative="1">
+      <w:start w:val="1"/>
+      <w:numFmt w:val="decimal"/>
+      <w:lvlText w:val="%2."/>
+      <w:lvlJc w:val="left"/>
+      <w:pPr>
+        <w:tabs>
+          <w:tab w:val="num" w:pos="1440"/>
+        </w:tabs>
+        <w:ind w:left="1440" w:hanging="360"/>
+      </w:pPr>
+    </w:lvl>
+    <w:lvl w:ilvl="2" w:tentative="1">
+      <w:start w:val="1"/>
+      <w:numFmt w:val="decimal"/>
+      <w:lvlText w:val="%3."/>
+      <w:lvlJc w:val="left"/>
+      <w:pPr>
+        <w:tabs>
+          <w:tab w:val="num" w:pos="2160"/>
+        </w:tabs>
+        <w:ind w:left="2160" w:hanging="360"/>
+      </w:pPr>
+    </w:lvl>
+    <w:lvl w:ilvl="3" w:tentative="1">
+      <w:start w:val="1"/>
+      <w:numFmt w:val="decimal"/>
+      <w:lvlText w:val="%4."/>
+      <w:lvlJc w:val="left"/>
+      <w:pPr>
+        <w:tabs>
+          <w:tab w:val="num" w:pos="2880"/>
+        </w:tabs>
+        <w:ind w:left="2880" w:hanging="360"/>
+      </w:pPr>
+    </w:lvl>
+    <w:lvl w:ilvl="4" w:tentative="1">
+      <w:start w:val="1"/>
+      <w:numFmt w:val="decimal"/>
+      <w:lvlText w:val="%5."/>
+      <w:lvlJc w:val="left"/>
+      <w:pPr>
+        <w:tabs>
+          <w:tab w:val="num" w:pos="3600"/>
+        </w:tabs>
+        <w:ind w:left="3600" w:hanging="360"/>
+      </w:pPr>
+    </w:lvl>
+    <w:lvl w:ilvl="5" w:tentative="1">
+      <w:start w:val="1"/>
+      <w:numFmt w:val="decimal"/>
+      <w:lvlText w:val="%6."/>
+      <w:lvlJc w:val="left"/>
+      <w:pPr>
+        <w:tabs>
+          <w:tab w:val="num" w:pos="4320"/>
+        </w:tabs>
+        <w:ind w:left="4320" w:hanging="360"/>
+      </w:pPr>
+    </w:lvl>
+    <w:lvl w:ilvl="6" w:tentative="1">
+      <w:start w:val="1"/>
+      <w:numFmt w:val="decimal"/>
+      <w:lvlText w:val="%7."/>
+      <w:lvlJc w:val="left"/>
+      <w:pPr>
+        <w:tabs>
+          <w:tab w:val="num" w:pos="5040"/>
+        </w:tabs>
+        <w:ind w:left="5040" w:hanging="360"/>
+      </w:pPr>
+    </w:lvl>
+    <w:lvl w:ilvl="7" w:tentative="1">
+      <w:start w:val="1"/>
+      <w:numFmt w:val="decimal"/>
+      <w:lvlText w:val="%8."/>
+      <w:lvlJc w:val="left"/>
+      <w:pPr>
+        <w:tabs>
+          <w:tab w:val="num" w:pos="5760"/>
+        </w:tabs>
+        <w:ind w:left="5760" w:hanging="360"/>
+      </w:pPr>
+    </w:lvl>
+    <w:lvl w:ilvl="8" w:tentative="1">
+      <w:start w:val="1"/>
+      <w:numFmt w:val="decimal"/>
+      <w:lvlText w:val="%9."/>
+      <w:lvlJc w:val="left"/>
+      <w:pPr>
+        <w:tabs>
+          <w:tab w:val="num" w:pos="6480"/>
+        </w:tabs>
+        <w:ind w:left="6480" w:hanging="360"/>
+      </w:pPr>
+    </w:lvl>
+  </w:abstractNum>
+  <w:abstractNum w:abstractNumId="10" w15:restartNumberingAfterBreak="0">
     <w:nsid w:val="30F5671C"/>
     <w:multiLevelType w:val="multilevel"/>
     <w:tmpl w:val="CDD4DB56"/>
@@ -11082,7 +12308,7 @@
       </w:rPr>
     </w:lvl>
   </w:abstractNum>
-  <w:abstractNum w:abstractNumId="10" w15:restartNumberingAfterBreak="0">
+  <w:abstractNum w:abstractNumId="11" w15:restartNumberingAfterBreak="0">
     <w:nsid w:val="32657EC3"/>
     <w:multiLevelType w:val="multilevel"/>
     <w:tmpl w:val="9F005220"/>
@@ -11231,7 +12457,7 @@
       </w:rPr>
     </w:lvl>
   </w:abstractNum>
-  <w:abstractNum w:abstractNumId="11" w15:restartNumberingAfterBreak="0">
+  <w:abstractNum w:abstractNumId="12" w15:restartNumberingAfterBreak="0">
     <w:nsid w:val="34281421"/>
     <w:multiLevelType w:val="multilevel"/>
     <w:tmpl w:val="FA4A835C"/>
@@ -11380,7 +12606,7 @@
       </w:rPr>
     </w:lvl>
   </w:abstractNum>
-  <w:abstractNum w:abstractNumId="12" w15:restartNumberingAfterBreak="0">
+  <w:abstractNum w:abstractNumId="13" w15:restartNumberingAfterBreak="0">
     <w:nsid w:val="35037B4D"/>
     <w:multiLevelType w:val="multilevel"/>
     <w:tmpl w:val="25A45094"/>
@@ -11529,7 +12755,7 @@
       </w:rPr>
     </w:lvl>
   </w:abstractNum>
-  <w:abstractNum w:abstractNumId="13" w15:restartNumberingAfterBreak="0">
+  <w:abstractNum w:abstractNumId="14" w15:restartNumberingAfterBreak="0">
     <w:nsid w:val="368F3C4C"/>
     <w:multiLevelType w:val="multilevel"/>
     <w:tmpl w:val="EC5E60B6"/>
@@ -11678,7 +12904,7 @@
       </w:rPr>
     </w:lvl>
   </w:abstractNum>
-  <w:abstractNum w:abstractNumId="14" w15:restartNumberingAfterBreak="0">
+  <w:abstractNum w:abstractNumId="15" w15:restartNumberingAfterBreak="0">
     <w:nsid w:val="38525D97"/>
     <w:multiLevelType w:val="multilevel"/>
     <w:tmpl w:val="547C83F2"/>
@@ -11827,7 +13053,7 @@
       </w:rPr>
     </w:lvl>
   </w:abstractNum>
-  <w:abstractNum w:abstractNumId="15" w15:restartNumberingAfterBreak="0">
+  <w:abstractNum w:abstractNumId="16" w15:restartNumberingAfterBreak="0">
     <w:nsid w:val="41907999"/>
     <w:multiLevelType w:val="multilevel"/>
     <w:tmpl w:val="65504056"/>
@@ -11940,7 +13166,7 @@
       </w:pPr>
     </w:lvl>
   </w:abstractNum>
-  <w:abstractNum w:abstractNumId="16" w15:restartNumberingAfterBreak="0">
+  <w:abstractNum w:abstractNumId="17" w15:restartNumberingAfterBreak="0">
     <w:nsid w:val="586610AB"/>
     <w:multiLevelType w:val="multilevel"/>
     <w:tmpl w:val="54AA77F4"/>
@@ -12053,7 +13279,7 @@
       </w:pPr>
     </w:lvl>
   </w:abstractNum>
-  <w:abstractNum w:abstractNumId="17" w15:restartNumberingAfterBreak="0">
+  <w:abstractNum w:abstractNumId="18" w15:restartNumberingAfterBreak="0">
     <w:nsid w:val="5BFC2A2B"/>
     <w:multiLevelType w:val="multilevel"/>
     <w:tmpl w:val="F68044EC"/>
@@ -12166,7 +13392,7 @@
       </w:pPr>
     </w:lvl>
   </w:abstractNum>
-  <w:abstractNum w:abstractNumId="18" w15:restartNumberingAfterBreak="0">
+  <w:abstractNum w:abstractNumId="19" w15:restartNumberingAfterBreak="0">
     <w:nsid w:val="5F436771"/>
     <w:multiLevelType w:val="multilevel"/>
     <w:tmpl w:val="3320C6A2"/>
@@ -12279,7 +13505,7 @@
       </w:pPr>
     </w:lvl>
   </w:abstractNum>
-  <w:abstractNum w:abstractNumId="19" w15:restartNumberingAfterBreak="0">
+  <w:abstractNum w:abstractNumId="20" w15:restartNumberingAfterBreak="0">
     <w:nsid w:val="60E335AB"/>
     <w:multiLevelType w:val="multilevel"/>
     <w:tmpl w:val="22AC81BE"/>
@@ -12392,7 +13618,7 @@
       </w:pPr>
     </w:lvl>
   </w:abstractNum>
-  <w:abstractNum w:abstractNumId="20" w15:restartNumberingAfterBreak="0">
+  <w:abstractNum w:abstractNumId="21" w15:restartNumberingAfterBreak="0">
     <w:nsid w:val="66811F00"/>
     <w:multiLevelType w:val="multilevel"/>
     <w:tmpl w:val="D24C34E4"/>
@@ -12505,7 +13731,7 @@
       </w:pPr>
     </w:lvl>
   </w:abstractNum>
-  <w:abstractNum w:abstractNumId="21" w15:restartNumberingAfterBreak="0">
+  <w:abstractNum w:abstractNumId="22" w15:restartNumberingAfterBreak="0">
     <w:nsid w:val="74967BA0"/>
     <w:multiLevelType w:val="multilevel"/>
     <w:tmpl w:val="022A8502"/>
@@ -12654,7 +13880,7 @@
       </w:rPr>
     </w:lvl>
   </w:abstractNum>
-  <w:abstractNum w:abstractNumId="22" w15:restartNumberingAfterBreak="0">
+  <w:abstractNum w:abstractNumId="23" w15:restartNumberingAfterBreak="0">
     <w:nsid w:val="78F23F18"/>
     <w:multiLevelType w:val="multilevel"/>
     <w:tmpl w:val="91169836"/>
@@ -12767,7 +13993,7 @@
       </w:pPr>
     </w:lvl>
   </w:abstractNum>
-  <w:abstractNum w:abstractNumId="23" w15:restartNumberingAfterBreak="0">
+  <w:abstractNum w:abstractNumId="24" w15:restartNumberingAfterBreak="0">
     <w:nsid w:val="79865D90"/>
     <w:multiLevelType w:val="multilevel"/>
     <w:tmpl w:val="4C8E399E"/>
@@ -12880,7 +14106,7 @@
       </w:pPr>
     </w:lvl>
   </w:abstractNum>
-  <w:abstractNum w:abstractNumId="24" w15:restartNumberingAfterBreak="0">
+  <w:abstractNum w:abstractNumId="25" w15:restartNumberingAfterBreak="0">
     <w:nsid w:val="7A666CB5"/>
     <w:multiLevelType w:val="multilevel"/>
     <w:tmpl w:val="5602EB2E"/>
@@ -13030,7 +14256,7 @@
     </w:lvl>
   </w:abstractNum>
   <w:num w:numId="1" w16cid:durableId="1099566421">
-    <w:abstractNumId w:val="14"/>
+    <w:abstractNumId w:val="15"/>
   </w:num>
   <w:num w:numId="2" w16cid:durableId="2116751180">
     <w:abstractNumId w:val="5"/>
@@ -13039,19 +14265,19 @@
     <w:abstractNumId w:val="3"/>
   </w:num>
   <w:num w:numId="4" w16cid:durableId="49109621">
-    <w:abstractNumId w:val="9"/>
+    <w:abstractNumId w:val="10"/>
   </w:num>
   <w:num w:numId="5" w16cid:durableId="1631398879">
+    <w:abstractNumId w:val="14"/>
+  </w:num>
+  <w:num w:numId="6" w16cid:durableId="1628199336">
     <w:abstractNumId w:val="13"/>
   </w:num>
-  <w:num w:numId="6" w16cid:durableId="1628199336">
-    <w:abstractNumId w:val="12"/>
-  </w:num>
   <w:num w:numId="7" w16cid:durableId="1074161061">
-    <w:abstractNumId w:val="15"/>
+    <w:abstractNumId w:val="16"/>
   </w:num>
   <w:num w:numId="8" w16cid:durableId="1518034576">
-    <w:abstractNumId w:val="22"/>
+    <w:abstractNumId w:val="23"/>
   </w:num>
   <w:num w:numId="9" w16cid:durableId="1561164621">
     <w:abstractNumId w:val="4"/>
@@ -13063,37 +14289,37 @@
     <w:abstractNumId w:val="6"/>
   </w:num>
   <w:num w:numId="12" w16cid:durableId="1559971753">
-    <w:abstractNumId w:val="18"/>
+    <w:abstractNumId w:val="19"/>
   </w:num>
   <w:num w:numId="13" w16cid:durableId="1625500408">
-    <w:abstractNumId w:val="19"/>
+    <w:abstractNumId w:val="20"/>
   </w:num>
   <w:num w:numId="14" w16cid:durableId="1103452895">
     <w:abstractNumId w:val="7"/>
   </w:num>
   <w:num w:numId="15" w16cid:durableId="1325015138">
+    <w:abstractNumId w:val="18"/>
+  </w:num>
+  <w:num w:numId="16" w16cid:durableId="889653411">
+    <w:abstractNumId w:val="21"/>
+  </w:num>
+  <w:num w:numId="17" w16cid:durableId="1952055407">
+    <w:abstractNumId w:val="24"/>
+  </w:num>
+  <w:num w:numId="18" w16cid:durableId="942152649">
     <w:abstractNumId w:val="17"/>
   </w:num>
-  <w:num w:numId="16" w16cid:durableId="889653411">
-    <w:abstractNumId w:val="20"/>
-  </w:num>
-  <w:num w:numId="17" w16cid:durableId="1952055407">
-    <w:abstractNumId w:val="23"/>
-  </w:num>
-  <w:num w:numId="18" w16cid:durableId="942152649">
-    <w:abstractNumId w:val="16"/>
-  </w:num>
   <w:num w:numId="19" w16cid:durableId="157113166">
-    <w:abstractNumId w:val="10"/>
+    <w:abstractNumId w:val="11"/>
   </w:num>
   <w:num w:numId="20" w16cid:durableId="586619119">
-    <w:abstractNumId w:val="21"/>
+    <w:abstractNumId w:val="22"/>
   </w:num>
   <w:num w:numId="21" w16cid:durableId="10840090">
-    <w:abstractNumId w:val="11"/>
+    <w:abstractNumId w:val="12"/>
   </w:num>
   <w:num w:numId="22" w16cid:durableId="1623464123">
-    <w:abstractNumId w:val="24"/>
+    <w:abstractNumId w:val="25"/>
   </w:num>
   <w:num w:numId="23" w16cid:durableId="1779173879">
     <w:abstractNumId w:val="0"/>
@@ -13103,6 +14329,9 @@
   </w:num>
   <w:num w:numId="25" w16cid:durableId="856891005">
     <w:abstractNumId w:val="2"/>
+  </w:num>
+  <w:num w:numId="26" w16cid:durableId="1153520976">
+    <w:abstractNumId w:val="9"/>
   </w:num>
 </w:numbering>
 </file>
@@ -13710,7 +14939,6 @@
   <w:style w:type="character" w:default="1" w:styleId="DefaultParagraphFont">
     <w:name w:val="Default Paragraph Font"/>
     <w:uiPriority w:val="1"/>
-    <w:semiHidden/>
     <w:unhideWhenUsed/>
   </w:style>
   <w:style w:type="table" w:default="1" w:styleId="TableNormal">

</xml_diff>

<commit_message>
Basic Input  and Conversion
</commit_message>
<xml_diff>
--- a/extra notes.docx
+++ b/extra notes.docx
@@ -15533,6 +15533,2734 @@
     <w:p>
       <w:pPr>
         <w:rPr>
+          <w:color w:val="000000" w:themeColor="text1"/>
+        </w:rPr>
+      </w:pPr>
+    </w:p>
+    <w:p>
+      <w:pPr>
+        <w:rPr>
+          <w:b/>
+          <w:bCs/>
+          <w:color w:val="000000" w:themeColor="text1"/>
+        </w:rPr>
+      </w:pPr>
+      <w:r>
+        <w:rPr>
+          <w:b/>
+          <w:bCs/>
+          <w:color w:val="000000" w:themeColor="text1"/>
+          <w:highlight w:val="green"/>
+        </w:rPr>
+        <w:t>1. The Absence of Data: The None Type</w:t>
+      </w:r>
+    </w:p>
+    <w:p>
+      <w:pPr>
+        <w:rPr>
+          <w:color w:val="000000" w:themeColor="text1"/>
+        </w:rPr>
+      </w:pPr>
+      <w:r>
+        <w:rPr>
+          <w:color w:val="000000" w:themeColor="text1"/>
+        </w:rPr>
+        <w:t>Sometimes, you want to create a variable (a name tag in the Stack) because you know you will need it later, but you don't have the data for it right now.</w:t>
+      </w:r>
+    </w:p>
+    <w:p>
+      <w:pPr>
+        <w:rPr>
+          <w:color w:val="000000" w:themeColor="text1"/>
+        </w:rPr>
+      </w:pPr>
+      <w:r>
+        <w:rPr>
+          <w:color w:val="000000" w:themeColor="text1"/>
+        </w:rPr>
+        <w:t xml:space="preserve">You can't point it to 0 or "" (an empty string), because 0 is an actual mathematical number and "" is actual text. To represent the </w:t>
+      </w:r>
+      <w:r>
+        <w:rPr>
+          <w:i/>
+          <w:iCs/>
+          <w:color w:val="000000" w:themeColor="text1"/>
+        </w:rPr>
+        <w:t>pure absence of value</w:t>
+      </w:r>
+      <w:r>
+        <w:rPr>
+          <w:color w:val="000000" w:themeColor="text1"/>
+        </w:rPr>
+        <w:t xml:space="preserve">, Python has a special data type called </w:t>
+      </w:r>
+      <w:r>
+        <w:rPr>
+          <w:b/>
+          <w:bCs/>
+          <w:color w:val="000000" w:themeColor="text1"/>
+        </w:rPr>
+        <w:t>None</w:t>
+      </w:r>
+      <w:r>
+        <w:rPr>
+          <w:color w:val="000000" w:themeColor="text1"/>
+        </w:rPr>
+        <w:t>.</w:t>
+      </w:r>
+    </w:p>
+    <w:p>
+      <w:pPr>
+        <w:rPr>
+          <w:color w:val="000000" w:themeColor="text1"/>
+        </w:rPr>
+      </w:pPr>
+      <w:r>
+        <w:rPr>
+          <w:color w:val="000000" w:themeColor="text1"/>
+        </w:rPr>
+        <w:t>Python</w:t>
+      </w:r>
+    </w:p>
+    <w:p>
+      <w:pPr>
+        <w:rPr>
+          <w:color w:val="000000" w:themeColor="text1"/>
+        </w:rPr>
+      </w:pPr>
+      <w:r>
+        <w:rPr>
+          <w:color w:val="000000" w:themeColor="text1"/>
+        </w:rPr>
+        <w:t># The user hasn't uploaded a profile picture yet</w:t>
+      </w:r>
+    </w:p>
+    <w:p>
+      <w:pPr>
+        <w:rPr>
+          <w:color w:val="000000" w:themeColor="text1"/>
+        </w:rPr>
+      </w:pPr>
+      <w:proofErr w:type="spellStart"/>
+      <w:r>
+        <w:rPr>
+          <w:color w:val="000000" w:themeColor="text1"/>
+        </w:rPr>
+        <w:t>profile_picture</w:t>
+      </w:r>
+      <w:proofErr w:type="spellEnd"/>
+      <w:r>
+        <w:rPr>
+          <w:color w:val="000000" w:themeColor="text1"/>
+        </w:rPr>
+        <w:t xml:space="preserve"> = None </w:t>
+      </w:r>
+    </w:p>
+    <w:p>
+      <w:pPr>
+        <w:rPr>
+          <w:color w:val="000000" w:themeColor="text1"/>
+        </w:rPr>
+      </w:pPr>
+      <w:r>
+        <w:rPr>
+          <w:b/>
+          <w:bCs/>
+          <w:color w:val="000000" w:themeColor="text1"/>
+        </w:rPr>
+        <w:t>What happens in memory:</w:t>
+      </w:r>
+      <w:r>
+        <w:rPr>
+          <w:color w:val="000000" w:themeColor="text1"/>
+        </w:rPr>
+        <w:t xml:space="preserve"> When Python starts running, it builds one single, immortal object in the Heap called the None object. It cannot be changed, and it is never destroyed. Whenever you set a variable to None, Python just points that name tag to this immortal "empty" object.</w:t>
+      </w:r>
+    </w:p>
+    <w:p>
+      <w:pPr>
+        <w:rPr>
+          <w:color w:val="000000" w:themeColor="text1"/>
+        </w:rPr>
+      </w:pPr>
+      <w:r>
+        <w:rPr>
+          <w:i/>
+          <w:iCs/>
+          <w:color w:val="000000" w:themeColor="text1"/>
+        </w:rPr>
+        <w:t>Note: In other languages like C++ or Java, this is called null. In Python, it is strictly capitalized None.</w:t>
+      </w:r>
+    </w:p>
+    <w:p>
+      <w:pPr>
+        <w:rPr>
+          <w:b/>
+          <w:bCs/>
+          <w:color w:val="000000" w:themeColor="text1"/>
+        </w:rPr>
+      </w:pPr>
+      <w:r>
+        <w:rPr>
+          <w:b/>
+          <w:bCs/>
+          <w:color w:val="000000" w:themeColor="text1"/>
+        </w:rPr>
+        <w:t>2. Constants (The "Honor System")</w:t>
+      </w:r>
+    </w:p>
+    <w:p>
+      <w:pPr>
+        <w:rPr>
+          <w:color w:val="000000" w:themeColor="text1"/>
+        </w:rPr>
+      </w:pPr>
+      <w:r>
+        <w:rPr>
+          <w:color w:val="000000" w:themeColor="text1"/>
+        </w:rPr>
+        <w:t xml:space="preserve">In software engineering, you often have variables that should </w:t>
+      </w:r>
+      <w:r>
+        <w:rPr>
+          <w:i/>
+          <w:iCs/>
+          <w:color w:val="000000" w:themeColor="text1"/>
+        </w:rPr>
+        <w:t>never</w:t>
+      </w:r>
+      <w:r>
+        <w:rPr>
+          <w:color w:val="000000" w:themeColor="text1"/>
+        </w:rPr>
+        <w:t xml:space="preserve"> change while the program is running—like the value of Pi (3.14159), or a maximum speed limit.</w:t>
+      </w:r>
+    </w:p>
+    <w:p>
+      <w:pPr>
+        <w:rPr>
+          <w:color w:val="000000" w:themeColor="text1"/>
+        </w:rPr>
+      </w:pPr>
+      <w:r>
+        <w:rPr>
+          <w:color w:val="000000" w:themeColor="text1"/>
+        </w:rPr>
+        <w:t xml:space="preserve">In other languages, you can physically lock a variable so no one can change it. </w:t>
+      </w:r>
+      <w:r>
+        <w:rPr>
+          <w:b/>
+          <w:bCs/>
+          <w:color w:val="000000" w:themeColor="text1"/>
+        </w:rPr>
+        <w:t>Python does not have this feature.</w:t>
+      </w:r>
+      <w:r>
+        <w:rPr>
+          <w:color w:val="000000" w:themeColor="text1"/>
+        </w:rPr>
+        <w:t xml:space="preserve"> Everything can be changed.</w:t>
+      </w:r>
+    </w:p>
+    <w:p>
+      <w:pPr>
+        <w:rPr>
+          <w:color w:val="000000" w:themeColor="text1"/>
+        </w:rPr>
+      </w:pPr>
+      <w:r>
+        <w:rPr>
+          <w:color w:val="000000" w:themeColor="text1"/>
+        </w:rPr>
+        <w:t xml:space="preserve">Because of this, FAANG engineers created a strict visual rule to warn other programmers: </w:t>
+      </w:r>
+      <w:r>
+        <w:rPr>
+          <w:b/>
+          <w:bCs/>
+          <w:color w:val="000000" w:themeColor="text1"/>
+        </w:rPr>
+        <w:t>If a variable name is written in ALL CAPS, it is a Constant. Do not touch it.</w:t>
+      </w:r>
+    </w:p>
+    <w:p>
+      <w:pPr>
+        <w:rPr>
+          <w:color w:val="000000" w:themeColor="text1"/>
+          <w:highlight w:val="yellow"/>
+        </w:rPr>
+      </w:pPr>
+      <w:r>
+        <w:rPr>
+          <w:color w:val="000000" w:themeColor="text1"/>
+          <w:highlight w:val="yellow"/>
+        </w:rPr>
+        <w:t>Python</w:t>
+      </w:r>
+    </w:p>
+    <w:p>
+      <w:pPr>
+        <w:rPr>
+          <w:color w:val="000000" w:themeColor="text1"/>
+          <w:highlight w:val="yellow"/>
+        </w:rPr>
+      </w:pPr>
+      <w:r>
+        <w:rPr>
+          <w:color w:val="000000" w:themeColor="text1"/>
+          <w:highlight w:val="yellow"/>
+        </w:rPr>
+        <w:lastRenderedPageBreak/>
+        <w:t># Standard variables (Snake Case - you can change these)</w:t>
+      </w:r>
+    </w:p>
+    <w:p>
+      <w:pPr>
+        <w:rPr>
+          <w:color w:val="000000" w:themeColor="text1"/>
+          <w:highlight w:val="yellow"/>
+        </w:rPr>
+      </w:pPr>
+      <w:proofErr w:type="spellStart"/>
+      <w:r>
+        <w:rPr>
+          <w:color w:val="000000" w:themeColor="text1"/>
+          <w:highlight w:val="yellow"/>
+        </w:rPr>
+        <w:t>player_score</w:t>
+      </w:r>
+      <w:proofErr w:type="spellEnd"/>
+      <w:r>
+        <w:rPr>
+          <w:color w:val="000000" w:themeColor="text1"/>
+          <w:highlight w:val="yellow"/>
+        </w:rPr>
+        <w:t xml:space="preserve"> = 0</w:t>
+      </w:r>
+    </w:p>
+    <w:p>
+      <w:pPr>
+        <w:rPr>
+          <w:color w:val="000000" w:themeColor="text1"/>
+        </w:rPr>
+      </w:pPr>
+      <w:proofErr w:type="spellStart"/>
+      <w:r>
+        <w:rPr>
+          <w:color w:val="000000" w:themeColor="text1"/>
+          <w:highlight w:val="yellow"/>
+        </w:rPr>
+        <w:t>current_level</w:t>
+      </w:r>
+      <w:proofErr w:type="spellEnd"/>
+      <w:r>
+        <w:rPr>
+          <w:color w:val="000000" w:themeColor="text1"/>
+          <w:highlight w:val="yellow"/>
+        </w:rPr>
+        <w:t xml:space="preserve"> = 1</w:t>
+      </w:r>
+    </w:p>
+    <w:p>
+      <w:pPr>
+        <w:rPr>
+          <w:color w:val="000000" w:themeColor="text1"/>
+        </w:rPr>
+      </w:pPr>
+    </w:p>
+    <w:p>
+      <w:pPr>
+        <w:rPr>
+          <w:color w:val="000000" w:themeColor="text1"/>
+          <w:highlight w:val="yellow"/>
+        </w:rPr>
+      </w:pPr>
+      <w:r>
+        <w:rPr>
+          <w:color w:val="000000" w:themeColor="text1"/>
+          <w:highlight w:val="yellow"/>
+        </w:rPr>
+        <w:t># Constants (ALL CAPS - hands off!)</w:t>
+      </w:r>
+    </w:p>
+    <w:p>
+      <w:pPr>
+        <w:rPr>
+          <w:color w:val="000000" w:themeColor="text1"/>
+          <w:highlight w:val="yellow"/>
+        </w:rPr>
+      </w:pPr>
+      <w:r>
+        <w:rPr>
+          <w:color w:val="000000" w:themeColor="text1"/>
+          <w:highlight w:val="yellow"/>
+        </w:rPr>
+        <w:t>MAX_HEALTH = 100</w:t>
+      </w:r>
+    </w:p>
+    <w:p>
+      <w:pPr>
+        <w:rPr>
+          <w:color w:val="000000" w:themeColor="text1"/>
+        </w:rPr>
+      </w:pPr>
+      <w:r>
+        <w:rPr>
+          <w:color w:val="000000" w:themeColor="text1"/>
+          <w:highlight w:val="yellow"/>
+        </w:rPr>
+        <w:t>SERVER_URL = "https://aws.amazon.com/my-server"</w:t>
+      </w:r>
+    </w:p>
+    <w:p>
+      <w:pPr>
+        <w:rPr>
+          <w:color w:val="000000" w:themeColor="text1"/>
+        </w:rPr>
+      </w:pPr>
+      <w:r>
+        <w:rPr>
+          <w:color w:val="000000" w:themeColor="text1"/>
+        </w:rPr>
+        <w:t xml:space="preserve">Python will technically let you change MAX_HEALTH = 50 later in the code, but doing so will make a senior engineer very angry. It is an </w:t>
+      </w:r>
+      <w:proofErr w:type="spellStart"/>
+      <w:r>
+        <w:rPr>
+          <w:color w:val="000000" w:themeColor="text1"/>
+        </w:rPr>
+        <w:t>honor</w:t>
+      </w:r>
+      <w:proofErr w:type="spellEnd"/>
+      <w:r>
+        <w:rPr>
+          <w:color w:val="000000" w:themeColor="text1"/>
+        </w:rPr>
+        <w:t xml:space="preserve"> system.</w:t>
+      </w:r>
+    </w:p>
+    <w:p>
+      <w:pPr>
+        <w:rPr>
+          <w:color w:val="000000" w:themeColor="text1"/>
+        </w:rPr>
+      </w:pPr>
+    </w:p>
+    <w:p>
+      <w:pPr>
+        <w:rPr>
+          <w:color w:val="000000" w:themeColor="text1"/>
+        </w:rPr>
+      </w:pPr>
+    </w:p>
+    <w:p>
+      <w:pPr>
+        <w:rPr>
+          <w:color w:val="000000" w:themeColor="text1"/>
+          <w:sz w:val="24"/>
+          <w:szCs w:val="24"/>
+        </w:rPr>
+      </w:pPr>
+    </w:p>
+    <w:p>
+      <w:pPr>
+        <w:rPr>
+          <w:b/>
+          <w:bCs/>
+          <w:color w:val="EE0000"/>
+          <w:sz w:val="24"/>
+          <w:szCs w:val="24"/>
+        </w:rPr>
+      </w:pPr>
+      <w:r>
+        <w:rPr>
+          <w:b/>
+          <w:bCs/>
+          <w:color w:val="EE0000"/>
+          <w:sz w:val="24"/>
+          <w:szCs w:val="24"/>
+        </w:rPr>
+        <w:t>Basic Input &amp; Conversion</w:t>
+      </w:r>
+    </w:p>
+    <w:p>
+      <w:pPr>
+        <w:rPr>
+          <w:color w:val="000000" w:themeColor="text1"/>
+        </w:rPr>
+      </w:pPr>
+      <w:r>
+        <w:rPr>
+          <w:color w:val="000000" w:themeColor="text1"/>
+        </w:rPr>
+        <w:t>We actually covered the core of this step when I accidentally jumped ahead earlier, but let's officially formalize it so our roadmap is clean.</w:t>
+      </w:r>
+    </w:p>
+    <w:p>
+      <w:pPr>
+        <w:rPr>
+          <w:color w:val="000000" w:themeColor="text1"/>
+        </w:rPr>
+      </w:pPr>
+      <w:r>
+        <w:rPr>
+          <w:color w:val="000000" w:themeColor="text1"/>
+        </w:rPr>
+        <w:t>We now know that:</w:t>
+      </w:r>
+    </w:p>
+    <w:p>
+      <w:pPr>
+        <w:numPr>
+          <w:ilvl w:val="0"/>
+          <w:numId w:val="34"/>
+        </w:numPr>
+        <w:rPr>
+          <w:color w:val="000000" w:themeColor="text1"/>
+        </w:rPr>
+      </w:pPr>
+      <w:proofErr w:type="gramStart"/>
+      <w:r>
+        <w:rPr>
+          <w:b/>
+          <w:bCs/>
+          <w:color w:val="000000" w:themeColor="text1"/>
+        </w:rPr>
+        <w:t>input(</w:t>
+      </w:r>
+      <w:proofErr w:type="gramEnd"/>
+      <w:r>
+        <w:rPr>
+          <w:b/>
+          <w:bCs/>
+          <w:color w:val="000000" w:themeColor="text1"/>
+        </w:rPr>
+        <w:t>)</w:t>
+      </w:r>
+      <w:r>
+        <w:rPr>
+          <w:color w:val="000000" w:themeColor="text1"/>
+        </w:rPr>
+        <w:t xml:space="preserve"> freezes the Execution Thread, listens to the keyboard, and </w:t>
+      </w:r>
+      <w:r>
+        <w:rPr>
+          <w:b/>
+          <w:bCs/>
+          <w:color w:val="000000" w:themeColor="text1"/>
+        </w:rPr>
+        <w:t>always</w:t>
+      </w:r>
+      <w:r>
+        <w:rPr>
+          <w:color w:val="000000" w:themeColor="text1"/>
+        </w:rPr>
+        <w:t xml:space="preserve"> creates a String (str) object in the Heap, even if you type numbers.</w:t>
+      </w:r>
+    </w:p>
+    <w:p>
+      <w:pPr>
+        <w:numPr>
+          <w:ilvl w:val="0"/>
+          <w:numId w:val="34"/>
+        </w:numPr>
+        <w:rPr>
+          <w:color w:val="000000" w:themeColor="text1"/>
+        </w:rPr>
+      </w:pPr>
+      <w:r>
+        <w:rPr>
+          <w:b/>
+          <w:bCs/>
+          <w:color w:val="000000" w:themeColor="text1"/>
+        </w:rPr>
+        <w:t>Type Casting</w:t>
+      </w:r>
+      <w:r>
+        <w:rPr>
+          <w:color w:val="000000" w:themeColor="text1"/>
+        </w:rPr>
+        <w:t xml:space="preserve"> (</w:t>
+      </w:r>
+      <w:proofErr w:type="gramStart"/>
+      <w:r>
+        <w:rPr>
+          <w:color w:val="000000" w:themeColor="text1"/>
+        </w:rPr>
+        <w:t>int(</w:t>
+      </w:r>
+      <w:proofErr w:type="gramEnd"/>
+      <w:r>
+        <w:rPr>
+          <w:color w:val="000000" w:themeColor="text1"/>
+        </w:rPr>
+        <w:t xml:space="preserve">), </w:t>
+      </w:r>
+      <w:proofErr w:type="gramStart"/>
+      <w:r>
+        <w:rPr>
+          <w:color w:val="000000" w:themeColor="text1"/>
+        </w:rPr>
+        <w:t>float(</w:t>
+      </w:r>
+      <w:proofErr w:type="gramEnd"/>
+      <w:r>
+        <w:rPr>
+          <w:color w:val="000000" w:themeColor="text1"/>
+        </w:rPr>
+        <w:t xml:space="preserve">)) reads that String and builds a </w:t>
+      </w:r>
+      <w:proofErr w:type="gramStart"/>
+      <w:r>
+        <w:rPr>
+          <w:color w:val="000000" w:themeColor="text1"/>
+        </w:rPr>
+        <w:t>brand new</w:t>
+      </w:r>
+      <w:proofErr w:type="gramEnd"/>
+      <w:r>
+        <w:rPr>
+          <w:color w:val="000000" w:themeColor="text1"/>
+        </w:rPr>
+        <w:t xml:space="preserve"> number object in the Heap.</w:t>
+      </w:r>
+    </w:p>
+    <w:p>
+      <w:pPr>
+        <w:rPr>
+          <w:color w:val="000000" w:themeColor="text1"/>
+        </w:rPr>
+      </w:pPr>
+      <w:r>
+        <w:rPr>
+          <w:color w:val="000000" w:themeColor="text1"/>
+        </w:rPr>
+        <w:t>To formally complete Step 4, here is the master template for taking user input and safely converting it into the exact data types you need for Machine Learning or cloud apps:</w:t>
+      </w:r>
+    </w:p>
+    <w:p>
+      <w:pPr>
+        <w:rPr>
+          <w:color w:val="000000" w:themeColor="text1"/>
+          <w:highlight w:val="yellow"/>
+        </w:rPr>
+      </w:pPr>
+      <w:r>
+        <w:rPr>
+          <w:color w:val="000000" w:themeColor="text1"/>
+          <w:highlight w:val="yellow"/>
+        </w:rPr>
+        <w:t>Python</w:t>
+      </w:r>
+    </w:p>
+    <w:p>
+      <w:pPr>
+        <w:rPr>
+          <w:color w:val="000000" w:themeColor="text1"/>
+          <w:highlight w:val="yellow"/>
+        </w:rPr>
+      </w:pPr>
+      <w:r>
+        <w:rPr>
+          <w:color w:val="000000" w:themeColor="text1"/>
+          <w:highlight w:val="yellow"/>
+        </w:rPr>
+        <w:t># 1. Taking a String (No conversion needed)</w:t>
+      </w:r>
+    </w:p>
+    <w:p>
+      <w:pPr>
+        <w:rPr>
+          <w:color w:val="000000" w:themeColor="text1"/>
+          <w:highlight w:val="yellow"/>
+        </w:rPr>
+      </w:pPr>
+      <w:proofErr w:type="spellStart"/>
+      <w:r>
+        <w:rPr>
+          <w:color w:val="000000" w:themeColor="text1"/>
+          <w:highlight w:val="yellow"/>
+        </w:rPr>
+        <w:t>first_name</w:t>
+      </w:r>
+      <w:proofErr w:type="spellEnd"/>
+      <w:r>
+        <w:rPr>
+          <w:color w:val="000000" w:themeColor="text1"/>
+          <w:highlight w:val="yellow"/>
+        </w:rPr>
+        <w:t xml:space="preserve"> = </w:t>
+      </w:r>
+      <w:proofErr w:type="gramStart"/>
+      <w:r>
+        <w:rPr>
+          <w:color w:val="000000" w:themeColor="text1"/>
+          <w:highlight w:val="yellow"/>
+        </w:rPr>
+        <w:t>input(</w:t>
+      </w:r>
+      <w:proofErr w:type="gramEnd"/>
+      <w:r>
+        <w:rPr>
+          <w:color w:val="000000" w:themeColor="text1"/>
+          <w:highlight w:val="yellow"/>
+        </w:rPr>
+        <w:t>"Enter your first name: ")</w:t>
+      </w:r>
+    </w:p>
+    <w:p>
+      <w:pPr>
+        <w:rPr>
+          <w:color w:val="000000" w:themeColor="text1"/>
+          <w:highlight w:val="yellow"/>
+        </w:rPr>
+      </w:pPr>
+    </w:p>
+    <w:p>
+      <w:pPr>
+        <w:rPr>
+          <w:color w:val="000000" w:themeColor="text1"/>
+          <w:highlight w:val="yellow"/>
+        </w:rPr>
+      </w:pPr>
+      <w:r>
+        <w:rPr>
+          <w:color w:val="000000" w:themeColor="text1"/>
+          <w:highlight w:val="yellow"/>
+        </w:rPr>
+        <w:t># 2. Taking an Integer (Whole number conversion)</w:t>
+      </w:r>
+    </w:p>
+    <w:p>
+      <w:pPr>
+        <w:rPr>
+          <w:color w:val="000000" w:themeColor="text1"/>
+          <w:highlight w:val="yellow"/>
+        </w:rPr>
+      </w:pPr>
+      <w:r>
+        <w:rPr>
+          <w:color w:val="000000" w:themeColor="text1"/>
+          <w:highlight w:val="yellow"/>
+        </w:rPr>
+        <w:t xml:space="preserve"># We wrap the </w:t>
+      </w:r>
+      <w:proofErr w:type="gramStart"/>
+      <w:r>
+        <w:rPr>
+          <w:color w:val="000000" w:themeColor="text1"/>
+          <w:highlight w:val="yellow"/>
+        </w:rPr>
+        <w:t>input(</w:t>
+      </w:r>
+      <w:proofErr w:type="gramEnd"/>
+      <w:r>
+        <w:rPr>
+          <w:color w:val="000000" w:themeColor="text1"/>
+          <w:highlight w:val="yellow"/>
+        </w:rPr>
+        <w:t xml:space="preserve">) machine inside the </w:t>
+      </w:r>
+      <w:proofErr w:type="gramStart"/>
+      <w:r>
+        <w:rPr>
+          <w:color w:val="000000" w:themeColor="text1"/>
+          <w:highlight w:val="yellow"/>
+        </w:rPr>
+        <w:t>int(</w:t>
+      </w:r>
+      <w:proofErr w:type="gramEnd"/>
+      <w:r>
+        <w:rPr>
+          <w:color w:val="000000" w:themeColor="text1"/>
+          <w:highlight w:val="yellow"/>
+        </w:rPr>
+        <w:t>) machine</w:t>
+      </w:r>
+    </w:p>
+    <w:p>
+      <w:pPr>
+        <w:rPr>
+          <w:color w:val="000000" w:themeColor="text1"/>
+        </w:rPr>
+      </w:pPr>
+      <w:r>
+        <w:rPr>
+          <w:color w:val="000000" w:themeColor="text1"/>
+          <w:highlight w:val="yellow"/>
+        </w:rPr>
+        <w:t xml:space="preserve">age = </w:t>
+      </w:r>
+      <w:proofErr w:type="gramStart"/>
+      <w:r>
+        <w:rPr>
+          <w:color w:val="000000" w:themeColor="text1"/>
+          <w:highlight w:val="yellow"/>
+        </w:rPr>
+        <w:t>int(input(</w:t>
+      </w:r>
+      <w:proofErr w:type="gramEnd"/>
+      <w:r>
+        <w:rPr>
+          <w:color w:val="000000" w:themeColor="text1"/>
+          <w:highlight w:val="yellow"/>
+        </w:rPr>
+        <w:t>"Enter your age: "))</w:t>
+      </w:r>
+    </w:p>
+    <w:p>
+      <w:pPr>
+        <w:rPr>
+          <w:color w:val="000000" w:themeColor="text1"/>
+        </w:rPr>
+      </w:pPr>
+    </w:p>
+    <w:p>
+      <w:pPr>
+        <w:rPr>
+          <w:color w:val="000000" w:themeColor="text1"/>
+        </w:rPr>
+      </w:pPr>
+      <w:r>
+        <w:rPr>
+          <w:color w:val="000000" w:themeColor="text1"/>
+        </w:rPr>
+        <w:t># 3. Taking a Float (Decimal conversion)</w:t>
+      </w:r>
+    </w:p>
+    <w:p>
+      <w:pPr>
+        <w:rPr>
+          <w:color w:val="000000" w:themeColor="text1"/>
+        </w:rPr>
+      </w:pPr>
+      <w:r>
+        <w:rPr>
+          <w:color w:val="000000" w:themeColor="text1"/>
+        </w:rPr>
+        <w:t xml:space="preserve"># We wrap the </w:t>
+      </w:r>
+      <w:proofErr w:type="gramStart"/>
+      <w:r>
+        <w:rPr>
+          <w:color w:val="000000" w:themeColor="text1"/>
+        </w:rPr>
+        <w:t>input(</w:t>
+      </w:r>
+      <w:proofErr w:type="gramEnd"/>
+      <w:r>
+        <w:rPr>
+          <w:color w:val="000000" w:themeColor="text1"/>
+        </w:rPr>
+        <w:t xml:space="preserve">) machine inside the </w:t>
+      </w:r>
+      <w:proofErr w:type="gramStart"/>
+      <w:r>
+        <w:rPr>
+          <w:color w:val="000000" w:themeColor="text1"/>
+        </w:rPr>
+        <w:t>float(</w:t>
+      </w:r>
+      <w:proofErr w:type="gramEnd"/>
+      <w:r>
+        <w:rPr>
+          <w:color w:val="000000" w:themeColor="text1"/>
+        </w:rPr>
+        <w:t>) machine</w:t>
+      </w:r>
+    </w:p>
+    <w:p>
+      <w:pPr>
+        <w:rPr>
+          <w:color w:val="000000" w:themeColor="text1"/>
+        </w:rPr>
+      </w:pPr>
+      <w:r>
+        <w:rPr>
+          <w:color w:val="000000" w:themeColor="text1"/>
+        </w:rPr>
+        <w:t xml:space="preserve">weight = </w:t>
+      </w:r>
+      <w:proofErr w:type="gramStart"/>
+      <w:r>
+        <w:rPr>
+          <w:color w:val="000000" w:themeColor="text1"/>
+        </w:rPr>
+        <w:t>float(input(</w:t>
+      </w:r>
+      <w:proofErr w:type="gramEnd"/>
+      <w:r>
+        <w:rPr>
+          <w:color w:val="000000" w:themeColor="text1"/>
+        </w:rPr>
+        <w:t>"Enter your weight in kg (e.g., 75.5): "))</w:t>
+      </w:r>
+    </w:p>
+    <w:p>
+      <w:pPr>
+        <w:rPr>
+          <w:color w:val="000000" w:themeColor="text1"/>
+        </w:rPr>
+      </w:pPr>
+    </w:p>
+    <w:p>
+      <w:pPr>
+        <w:rPr>
+          <w:color w:val="000000" w:themeColor="text1"/>
+        </w:rPr>
+      </w:pPr>
+    </w:p>
+    <w:p>
+      <w:pPr>
+        <w:rPr>
+          <w:b/>
+          <w:bCs/>
+          <w:color w:val="EE0000"/>
+        </w:rPr>
+      </w:pPr>
+      <w:r>
+        <w:rPr>
+          <w:b/>
+          <w:bCs/>
+          <w:color w:val="EE0000"/>
+        </w:rPr>
+        <w:lastRenderedPageBreak/>
+        <w:t>1. Advanced Variable Assignment (The Python Shortcut)</w:t>
+      </w:r>
+    </w:p>
+    <w:p>
+      <w:pPr>
+        <w:rPr>
+          <w:color w:val="000000" w:themeColor="text1"/>
+        </w:rPr>
+      </w:pPr>
+      <w:r>
+        <w:rPr>
+          <w:color w:val="000000" w:themeColor="text1"/>
+        </w:rPr>
+        <w:t>Until now, we have assigned one variable per line. But Python has a feature that allows you to assign multiple variables instantly.</w:t>
+      </w:r>
+    </w:p>
+    <w:p>
+      <w:pPr>
+        <w:rPr>
+          <w:color w:val="000000" w:themeColor="text1"/>
+        </w:rPr>
+      </w:pPr>
+      <w:r>
+        <w:rPr>
+          <w:b/>
+          <w:bCs/>
+          <w:color w:val="000000" w:themeColor="text1"/>
+        </w:rPr>
+        <w:t>Multiple Assignment:</w:t>
+      </w:r>
+      <w:r>
+        <w:rPr>
+          <w:color w:val="000000" w:themeColor="text1"/>
+        </w:rPr>
+        <w:t xml:space="preserve"> Instead of taking up three lines, you can declare them on one line separated by commas. Python will perfectly match the Stack name tags to the Heap objects from left to right.</w:t>
+      </w:r>
+    </w:p>
+    <w:p>
+      <w:pPr>
+        <w:rPr>
+          <w:color w:val="000000" w:themeColor="text1"/>
+          <w:highlight w:val="yellow"/>
+        </w:rPr>
+      </w:pPr>
+      <w:r>
+        <w:rPr>
+          <w:color w:val="000000" w:themeColor="text1"/>
+          <w:highlight w:val="yellow"/>
+        </w:rPr>
+        <w:t>Python</w:t>
+      </w:r>
+    </w:p>
+    <w:p>
+      <w:pPr>
+        <w:rPr>
+          <w:color w:val="000000" w:themeColor="text1"/>
+          <w:highlight w:val="yellow"/>
+        </w:rPr>
+      </w:pPr>
+      <w:r>
+        <w:rPr>
+          <w:color w:val="000000" w:themeColor="text1"/>
+          <w:highlight w:val="yellow"/>
+        </w:rPr>
+        <w:t># The professional way to assign coordinates or related data</w:t>
+      </w:r>
+    </w:p>
+    <w:p>
+      <w:pPr>
+        <w:rPr>
+          <w:color w:val="000000" w:themeColor="text1"/>
+        </w:rPr>
+      </w:pPr>
+      <w:r>
+        <w:rPr>
+          <w:color w:val="000000" w:themeColor="text1"/>
+          <w:highlight w:val="yellow"/>
+        </w:rPr>
+        <w:t>x, y, z = 10, 20, 30</w:t>
+      </w:r>
+    </w:p>
+    <w:p>
+      <w:pPr>
+        <w:rPr>
+          <w:color w:val="000000" w:themeColor="text1"/>
+        </w:rPr>
+      </w:pPr>
+      <w:r>
+        <w:rPr>
+          <w:b/>
+          <w:bCs/>
+          <w:color w:val="000000" w:themeColor="text1"/>
+        </w:rPr>
+        <w:t>Chained Assignment:</w:t>
+      </w:r>
+      <w:r>
+        <w:rPr>
+          <w:color w:val="000000" w:themeColor="text1"/>
+        </w:rPr>
+        <w:t xml:space="preserve"> What if you want three variables to all point to the exact same 0 in the Heap?</w:t>
+      </w:r>
+    </w:p>
+    <w:p>
+      <w:pPr>
+        <w:rPr>
+          <w:color w:val="000000" w:themeColor="text1"/>
+          <w:highlight w:val="yellow"/>
+        </w:rPr>
+      </w:pPr>
+      <w:r>
+        <w:rPr>
+          <w:color w:val="000000" w:themeColor="text1"/>
+          <w:highlight w:val="yellow"/>
+        </w:rPr>
+        <w:t>Python</w:t>
+      </w:r>
+    </w:p>
+    <w:p>
+      <w:pPr>
+        <w:rPr>
+          <w:color w:val="000000" w:themeColor="text1"/>
+          <w:highlight w:val="yellow"/>
+        </w:rPr>
+      </w:pPr>
+      <w:r>
+        <w:rPr>
+          <w:color w:val="000000" w:themeColor="text1"/>
+          <w:highlight w:val="yellow"/>
+        </w:rPr>
+        <w:t># Player 1, 2, and 3 all start with a score of 0</w:t>
+      </w:r>
+    </w:p>
+    <w:p>
+      <w:pPr>
+        <w:rPr>
+          <w:color w:val="000000" w:themeColor="text1"/>
+        </w:rPr>
+      </w:pPr>
+      <w:r>
+        <w:rPr>
+          <w:color w:val="000000" w:themeColor="text1"/>
+          <w:highlight w:val="yellow"/>
+        </w:rPr>
+        <w:t>score_1 = score_2 = score_3 = 0</w:t>
+      </w:r>
+    </w:p>
+    <w:p>
+      <w:pPr>
+        <w:rPr>
+          <w:color w:val="000000" w:themeColor="text1"/>
+        </w:rPr>
+      </w:pPr>
+      <w:r>
+        <w:rPr>
+          <w:i/>
+          <w:iCs/>
+          <w:color w:val="000000" w:themeColor="text1"/>
+        </w:rPr>
+        <w:t>Memory Check:</w:t>
+      </w:r>
+      <w:r>
+        <w:rPr>
+          <w:color w:val="000000" w:themeColor="text1"/>
+        </w:rPr>
+        <w:t xml:space="preserve"> Python builds a single 0 in the Heap, and points all three name tags to it instantly.</w:t>
+      </w:r>
+    </w:p>
+    <w:p>
+      <w:pPr>
+        <w:rPr>
+          <w:b/>
+          <w:bCs/>
+          <w:color w:val="000000" w:themeColor="text1"/>
+        </w:rPr>
+      </w:pPr>
+      <w:r>
+        <w:rPr>
+          <w:b/>
+          <w:bCs/>
+          <w:color w:val="000000" w:themeColor="text1"/>
+        </w:rPr>
+        <w:t>2. "Truthy" and "</w:t>
+      </w:r>
+      <w:proofErr w:type="spellStart"/>
+      <w:r>
+        <w:rPr>
+          <w:b/>
+          <w:bCs/>
+          <w:color w:val="000000" w:themeColor="text1"/>
+        </w:rPr>
+        <w:t>Falsy</w:t>
+      </w:r>
+      <w:proofErr w:type="spellEnd"/>
+      <w:r>
+        <w:rPr>
+          <w:b/>
+          <w:bCs/>
+          <w:color w:val="000000" w:themeColor="text1"/>
+        </w:rPr>
+        <w:t>" Values (The Boolean Secret)</w:t>
+      </w:r>
+    </w:p>
+    <w:p>
+      <w:pPr>
+        <w:rPr>
+          <w:color w:val="000000" w:themeColor="text1"/>
+        </w:rPr>
+      </w:pPr>
+      <w:r>
+        <w:rPr>
+          <w:color w:val="000000" w:themeColor="text1"/>
+        </w:rPr>
+        <w:t xml:space="preserve">We learned that </w:t>
+      </w:r>
+      <w:proofErr w:type="gramStart"/>
+      <w:r>
+        <w:rPr>
+          <w:color w:val="000000" w:themeColor="text1"/>
+        </w:rPr>
+        <w:t>bool(</w:t>
+      </w:r>
+      <w:proofErr w:type="gramEnd"/>
+      <w:r>
+        <w:rPr>
+          <w:color w:val="000000" w:themeColor="text1"/>
+        </w:rPr>
+        <w:t>) can cast data into True or False. But how does the computer decide if a word or a number is true or false?</w:t>
+      </w:r>
+    </w:p>
+    <w:p>
+      <w:pPr>
+        <w:rPr>
+          <w:color w:val="000000" w:themeColor="text1"/>
+        </w:rPr>
+      </w:pPr>
+      <w:r>
+        <w:rPr>
+          <w:color w:val="000000" w:themeColor="text1"/>
+        </w:rPr>
+        <w:t>Python has strict rules about what contains "substance" (Truthy) and what is "empty" (</w:t>
+      </w:r>
+      <w:proofErr w:type="spellStart"/>
+      <w:r>
+        <w:rPr>
+          <w:color w:val="000000" w:themeColor="text1"/>
+        </w:rPr>
+        <w:t>Falsy</w:t>
+      </w:r>
+      <w:proofErr w:type="spellEnd"/>
+      <w:r>
+        <w:rPr>
+          <w:color w:val="000000" w:themeColor="text1"/>
+        </w:rPr>
+        <w:t>).</w:t>
+      </w:r>
+    </w:p>
+    <w:p>
+      <w:pPr>
+        <w:rPr>
+          <w:color w:val="000000" w:themeColor="text1"/>
+        </w:rPr>
+      </w:pPr>
+      <w:proofErr w:type="spellStart"/>
+      <w:r>
+        <w:rPr>
+          <w:b/>
+          <w:bCs/>
+          <w:color w:val="000000" w:themeColor="text1"/>
+        </w:rPr>
+        <w:t>Falsy</w:t>
+      </w:r>
+      <w:proofErr w:type="spellEnd"/>
+      <w:r>
+        <w:rPr>
+          <w:b/>
+          <w:bCs/>
+          <w:color w:val="000000" w:themeColor="text1"/>
+        </w:rPr>
+        <w:t xml:space="preserve"> (Evaluates </w:t>
+      </w:r>
+      <w:proofErr w:type="gramStart"/>
+      <w:r>
+        <w:rPr>
+          <w:b/>
+          <w:bCs/>
+          <w:color w:val="000000" w:themeColor="text1"/>
+        </w:rPr>
+        <w:t>to</w:t>
+      </w:r>
+      <w:proofErr w:type="gramEnd"/>
+      <w:r>
+        <w:rPr>
+          <w:b/>
+          <w:bCs/>
+          <w:color w:val="000000" w:themeColor="text1"/>
+        </w:rPr>
+        <w:t xml:space="preserve"> False):</w:t>
+      </w:r>
+    </w:p>
+    <w:p>
+      <w:pPr>
+        <w:numPr>
+          <w:ilvl w:val="0"/>
+          <w:numId w:val="35"/>
+        </w:numPr>
+        <w:rPr>
+          <w:color w:val="000000" w:themeColor="text1"/>
+        </w:rPr>
+      </w:pPr>
+      <w:r>
+        <w:rPr>
+          <w:color w:val="000000" w:themeColor="text1"/>
+        </w:rPr>
+        <w:t>0 or 0.0 (Zero)</w:t>
+      </w:r>
+    </w:p>
+    <w:p>
+      <w:pPr>
+        <w:numPr>
+          <w:ilvl w:val="0"/>
+          <w:numId w:val="35"/>
+        </w:numPr>
+        <w:rPr>
+          <w:color w:val="000000" w:themeColor="text1"/>
+        </w:rPr>
+      </w:pPr>
+      <w:r>
+        <w:rPr>
+          <w:color w:val="000000" w:themeColor="text1"/>
+        </w:rPr>
+        <w:t>"" (An absolutely empty string)</w:t>
+      </w:r>
+    </w:p>
+    <w:p>
+      <w:pPr>
+        <w:numPr>
+          <w:ilvl w:val="0"/>
+          <w:numId w:val="35"/>
+        </w:numPr>
+        <w:rPr>
+          <w:color w:val="000000" w:themeColor="text1"/>
+        </w:rPr>
+      </w:pPr>
+      <w:r>
+        <w:rPr>
+          <w:color w:val="000000" w:themeColor="text1"/>
+        </w:rPr>
+        <w:t>None (The absence of value)</w:t>
+      </w:r>
+    </w:p>
+    <w:p>
+      <w:pPr>
+        <w:numPr>
+          <w:ilvl w:val="0"/>
+          <w:numId w:val="35"/>
+        </w:numPr>
+        <w:rPr>
+          <w:color w:val="000000" w:themeColor="text1"/>
+        </w:rPr>
+      </w:pPr>
+      <w:r>
+        <w:rPr>
+          <w:color w:val="000000" w:themeColor="text1"/>
+        </w:rPr>
+        <w:t>[] (An empty list)</w:t>
+      </w:r>
+    </w:p>
+    <w:p>
+      <w:pPr>
+        <w:rPr>
+          <w:color w:val="000000" w:themeColor="text1"/>
+        </w:rPr>
+      </w:pPr>
+      <w:r>
+        <w:rPr>
+          <w:b/>
+          <w:bCs/>
+          <w:color w:val="000000" w:themeColor="text1"/>
+        </w:rPr>
+        <w:t>Truthy (Evaluates to True):</w:t>
+      </w:r>
+    </w:p>
+    <w:p>
+      <w:pPr>
+        <w:numPr>
+          <w:ilvl w:val="0"/>
+          <w:numId w:val="36"/>
+        </w:numPr>
+        <w:rPr>
+          <w:color w:val="000000" w:themeColor="text1"/>
+        </w:rPr>
+      </w:pPr>
+      <w:r>
+        <w:rPr>
+          <w:b/>
+          <w:bCs/>
+          <w:color w:val="000000" w:themeColor="text1"/>
+        </w:rPr>
+        <w:t>Absolutely everything else.</w:t>
+      </w:r>
+    </w:p>
+    <w:p>
+      <w:pPr>
+        <w:rPr>
+          <w:color w:val="000000" w:themeColor="text1"/>
+        </w:rPr>
+      </w:pPr>
+      <w:r>
+        <w:rPr>
+          <w:i/>
+          <w:iCs/>
+          <w:color w:val="000000" w:themeColor="text1"/>
+        </w:rPr>
+        <w:t>The FAANG Trap:</w:t>
+      </w:r>
+      <w:r>
+        <w:rPr>
+          <w:color w:val="000000" w:themeColor="text1"/>
+        </w:rPr>
+        <w:t xml:space="preserve"> What does bool("False") evaluate to? It evaluates to </w:t>
+      </w:r>
+      <w:r>
+        <w:rPr>
+          <w:b/>
+          <w:bCs/>
+          <w:color w:val="000000" w:themeColor="text1"/>
+        </w:rPr>
+        <w:t>True</w:t>
+      </w:r>
+      <w:r>
+        <w:rPr>
+          <w:color w:val="000000" w:themeColor="text1"/>
+        </w:rPr>
+        <w:t>! Why? Because it has quotation marks around it, meaning it is a String. It is not empty, so Python says, "There are letters inside this string, therefore it has substance, therefore it is True."</w:t>
+      </w:r>
+    </w:p>
+    <w:p>
+      <w:pPr>
+        <w:rPr>
+          <w:b/>
+          <w:bCs/>
+          <w:color w:val="000000" w:themeColor="text1"/>
+        </w:rPr>
+      </w:pPr>
+      <w:r>
+        <w:rPr>
+          <w:b/>
+          <w:bCs/>
+          <w:color w:val="000000" w:themeColor="text1"/>
+        </w:rPr>
+        <w:t>3. Cleaning User Input (</w:t>
+      </w:r>
+      <w:proofErr w:type="gramStart"/>
+      <w:r>
+        <w:rPr>
+          <w:b/>
+          <w:bCs/>
+          <w:color w:val="000000" w:themeColor="text1"/>
+        </w:rPr>
+        <w:t>Sanitization)</w:t>
+      </w:r>
+      <w:r>
+        <w:rPr>
+          <w:b/>
+          <w:bCs/>
+          <w:color w:val="000000" w:themeColor="text1"/>
+        </w:rPr>
+        <w:t xml:space="preserve">   </w:t>
+      </w:r>
+      <w:proofErr w:type="gramEnd"/>
+      <w:r>
+        <w:rPr>
+          <w:b/>
+          <w:bCs/>
+          <w:color w:val="EE0000"/>
+          <w:sz w:val="36"/>
+          <w:szCs w:val="36"/>
+          <w:highlight w:val="yellow"/>
+        </w:rPr>
+        <w:t>.</w:t>
+      </w:r>
+      <w:proofErr w:type="gramStart"/>
+      <w:r>
+        <w:rPr>
+          <w:b/>
+          <w:bCs/>
+          <w:color w:val="EE0000"/>
+          <w:sz w:val="36"/>
+          <w:szCs w:val="36"/>
+          <w:highlight w:val="yellow"/>
+        </w:rPr>
+        <w:t>strip(</w:t>
+      </w:r>
+      <w:proofErr w:type="gramEnd"/>
+      <w:r>
+        <w:rPr>
+          <w:b/>
+          <w:bCs/>
+          <w:color w:val="EE0000"/>
+          <w:sz w:val="36"/>
+          <w:szCs w:val="36"/>
+          <w:highlight w:val="yellow"/>
+        </w:rPr>
+        <w:t>)</w:t>
+      </w:r>
+    </w:p>
+    <w:p>
+      <w:pPr>
+        <w:rPr>
+          <w:color w:val="000000" w:themeColor="text1"/>
+        </w:rPr>
+      </w:pPr>
+      <w:r>
+        <w:rPr>
+          <w:color w:val="000000" w:themeColor="text1"/>
+        </w:rPr>
+        <w:t>When dealing with human input, you must assume the human will make a mistake.</w:t>
+      </w:r>
+    </w:p>
+    <w:p>
+      <w:pPr>
+        <w:rPr>
+          <w:color w:val="000000" w:themeColor="text1"/>
+        </w:rPr>
+      </w:pPr>
+      <w:r>
+        <w:rPr>
+          <w:color w:val="000000" w:themeColor="text1"/>
+        </w:rPr>
+        <w:t xml:space="preserve">If you ask a user for their name, and their finger accidentally brushes the spacebar before they hit enter, </w:t>
+      </w:r>
+      <w:proofErr w:type="gramStart"/>
+      <w:r>
+        <w:rPr>
+          <w:color w:val="000000" w:themeColor="text1"/>
+        </w:rPr>
+        <w:t>input(</w:t>
+      </w:r>
+      <w:proofErr w:type="gramEnd"/>
+      <w:r>
+        <w:rPr>
+          <w:color w:val="000000" w:themeColor="text1"/>
+        </w:rPr>
+        <w:t xml:space="preserve">) will store " </w:t>
+      </w:r>
+      <w:proofErr w:type="spellStart"/>
+      <w:r>
+        <w:rPr>
+          <w:color w:val="000000" w:themeColor="text1"/>
+        </w:rPr>
+        <w:t>Adeal</w:t>
+      </w:r>
+      <w:proofErr w:type="spellEnd"/>
+      <w:r>
+        <w:rPr>
+          <w:color w:val="000000" w:themeColor="text1"/>
+        </w:rPr>
+        <w:t>" instead of "</w:t>
+      </w:r>
+      <w:proofErr w:type="spellStart"/>
+      <w:r>
+        <w:rPr>
+          <w:color w:val="000000" w:themeColor="text1"/>
+        </w:rPr>
+        <w:t>Adeal</w:t>
+      </w:r>
+      <w:proofErr w:type="spellEnd"/>
+      <w:r>
+        <w:rPr>
+          <w:color w:val="000000" w:themeColor="text1"/>
+        </w:rPr>
+        <w:t>". In a database, those are two completely different names.</w:t>
+      </w:r>
+    </w:p>
+    <w:p>
+      <w:pPr>
+        <w:rPr>
+          <w:color w:val="000000" w:themeColor="text1"/>
+        </w:rPr>
+      </w:pPr>
+      <w:r>
+        <w:rPr>
+          <w:color w:val="000000" w:themeColor="text1"/>
+        </w:rPr>
+        <w:t xml:space="preserve">Production engineers always "sanitize" (clean) strings the millisecond they receive them using a built-in string machine </w:t>
+      </w:r>
+      <w:proofErr w:type="gramStart"/>
+      <w:r>
+        <w:rPr>
+          <w:color w:val="000000" w:themeColor="text1"/>
+        </w:rPr>
+        <w:t xml:space="preserve">called </w:t>
+      </w:r>
+      <w:r>
+        <w:rPr>
+          <w:b/>
+          <w:bCs/>
+          <w:color w:val="000000" w:themeColor="text1"/>
+          <w:highlight w:val="yellow"/>
+        </w:rPr>
+        <w:t>.strip</w:t>
+      </w:r>
+      <w:proofErr w:type="gramEnd"/>
+      <w:r>
+        <w:rPr>
+          <w:b/>
+          <w:bCs/>
+          <w:color w:val="000000" w:themeColor="text1"/>
+          <w:highlight w:val="yellow"/>
+        </w:rPr>
+        <w:t>()</w:t>
+      </w:r>
+      <w:r>
+        <w:rPr>
+          <w:color w:val="000000" w:themeColor="text1"/>
+          <w:highlight w:val="yellow"/>
+        </w:rPr>
+        <w:t>.</w:t>
+      </w:r>
+    </w:p>
+    <w:p>
+      <w:pPr>
+        <w:rPr>
+          <w:color w:val="000000" w:themeColor="text1"/>
+        </w:rPr>
+      </w:pPr>
+      <w:proofErr w:type="gramStart"/>
+      <w:r>
+        <w:rPr>
+          <w:color w:val="000000" w:themeColor="text1"/>
+        </w:rPr>
+        <w:t>What .strip</w:t>
+      </w:r>
+      <w:proofErr w:type="gramEnd"/>
+      <w:r>
+        <w:rPr>
+          <w:color w:val="000000" w:themeColor="text1"/>
+        </w:rPr>
+        <w:t>() does is invisibly chop off any spaces or hidden "Enter" keys at the very beginning and very end of the string.</w:t>
+      </w:r>
+    </w:p>
+    <w:p>
+      <w:pPr>
+        <w:rPr>
+          <w:color w:val="000000" w:themeColor="text1"/>
+          <w:highlight w:val="yellow"/>
+        </w:rPr>
+      </w:pPr>
+      <w:r>
+        <w:rPr>
+          <w:color w:val="000000" w:themeColor="text1"/>
+          <w:highlight w:val="yellow"/>
+        </w:rPr>
+        <w:lastRenderedPageBreak/>
+        <w:t>Python</w:t>
+      </w:r>
+    </w:p>
+    <w:p>
+      <w:pPr>
+        <w:rPr>
+          <w:color w:val="000000" w:themeColor="text1"/>
+          <w:highlight w:val="yellow"/>
+        </w:rPr>
+      </w:pPr>
+      <w:r>
+        <w:rPr>
+          <w:color w:val="000000" w:themeColor="text1"/>
+          <w:highlight w:val="yellow"/>
+        </w:rPr>
+        <w:t xml:space="preserve"># We </w:t>
+      </w:r>
+      <w:proofErr w:type="gramStart"/>
+      <w:r>
+        <w:rPr>
+          <w:color w:val="000000" w:themeColor="text1"/>
+          <w:highlight w:val="yellow"/>
+        </w:rPr>
+        <w:t>chain .strip</w:t>
+      </w:r>
+      <w:proofErr w:type="gramEnd"/>
+      <w:r>
+        <w:rPr>
+          <w:color w:val="000000" w:themeColor="text1"/>
+          <w:highlight w:val="yellow"/>
+        </w:rPr>
+        <w:t xml:space="preserve">() right to the end of </w:t>
+      </w:r>
+      <w:proofErr w:type="gramStart"/>
+      <w:r>
+        <w:rPr>
+          <w:color w:val="000000" w:themeColor="text1"/>
+          <w:highlight w:val="yellow"/>
+        </w:rPr>
+        <w:t>input(</w:t>
+      </w:r>
+      <w:proofErr w:type="gramEnd"/>
+      <w:r>
+        <w:rPr>
+          <w:color w:val="000000" w:themeColor="text1"/>
+          <w:highlight w:val="yellow"/>
+        </w:rPr>
+        <w:t>)</w:t>
+      </w:r>
+    </w:p>
+    <w:p>
+      <w:pPr>
+        <w:rPr>
+          <w:color w:val="000000" w:themeColor="text1"/>
+        </w:rPr>
+      </w:pPr>
+      <w:proofErr w:type="spellStart"/>
+      <w:r>
+        <w:rPr>
+          <w:color w:val="000000" w:themeColor="text1"/>
+          <w:highlight w:val="yellow"/>
+        </w:rPr>
+        <w:t>player_name</w:t>
+      </w:r>
+      <w:proofErr w:type="spellEnd"/>
+      <w:r>
+        <w:rPr>
+          <w:color w:val="000000" w:themeColor="text1"/>
+          <w:highlight w:val="yellow"/>
+        </w:rPr>
+        <w:t xml:space="preserve"> = </w:t>
+      </w:r>
+      <w:proofErr w:type="gramStart"/>
+      <w:r>
+        <w:rPr>
+          <w:color w:val="000000" w:themeColor="text1"/>
+          <w:highlight w:val="yellow"/>
+        </w:rPr>
+        <w:t>input(</w:t>
+      </w:r>
+      <w:proofErr w:type="gramEnd"/>
+      <w:r>
+        <w:rPr>
+          <w:color w:val="000000" w:themeColor="text1"/>
+          <w:highlight w:val="yellow"/>
+        </w:rPr>
+        <w:t>"Enter your name: "</w:t>
+      </w:r>
+      <w:proofErr w:type="gramStart"/>
+      <w:r>
+        <w:rPr>
+          <w:color w:val="000000" w:themeColor="text1"/>
+          <w:highlight w:val="yellow"/>
+        </w:rPr>
+        <w:t>).strip</w:t>
+      </w:r>
+      <w:proofErr w:type="gramEnd"/>
+      <w:r>
+        <w:rPr>
+          <w:color w:val="000000" w:themeColor="text1"/>
+          <w:highlight w:val="yellow"/>
+        </w:rPr>
+        <w:t>()</w:t>
+      </w:r>
+    </w:p>
+    <w:p>
+      <w:pPr>
+        <w:rPr>
+          <w:color w:val="000000" w:themeColor="text1"/>
+        </w:rPr>
+      </w:pPr>
+      <w:r>
+        <w:rPr>
+          <w:i/>
+          <w:iCs/>
+          <w:color w:val="000000" w:themeColor="text1"/>
+        </w:rPr>
+        <w:t>What happens in memory:</w:t>
+      </w:r>
+    </w:p>
+    <w:p>
+      <w:pPr>
+        <w:numPr>
+          <w:ilvl w:val="0"/>
+          <w:numId w:val="37"/>
+        </w:numPr>
+        <w:rPr>
+          <w:color w:val="000000" w:themeColor="text1"/>
+        </w:rPr>
+      </w:pPr>
+      <w:r>
+        <w:rPr>
+          <w:color w:val="000000" w:themeColor="text1"/>
+        </w:rPr>
+        <w:t>User types [Space]</w:t>
+      </w:r>
+      <w:proofErr w:type="spellStart"/>
+      <w:proofErr w:type="gramStart"/>
+      <w:r>
+        <w:rPr>
+          <w:color w:val="000000" w:themeColor="text1"/>
+        </w:rPr>
+        <w:t>Adeal</w:t>
+      </w:r>
+      <w:proofErr w:type="spellEnd"/>
+      <w:r>
+        <w:rPr>
+          <w:color w:val="000000" w:themeColor="text1"/>
+        </w:rPr>
+        <w:t>[</w:t>
+      </w:r>
+      <w:proofErr w:type="gramEnd"/>
+      <w:r>
+        <w:rPr>
+          <w:color w:val="000000" w:themeColor="text1"/>
+        </w:rPr>
+        <w:t>Space] and hits Enter.</w:t>
+      </w:r>
+    </w:p>
+    <w:p>
+      <w:pPr>
+        <w:numPr>
+          <w:ilvl w:val="0"/>
+          <w:numId w:val="37"/>
+        </w:numPr>
+        <w:rPr>
+          <w:color w:val="000000" w:themeColor="text1"/>
+        </w:rPr>
+      </w:pPr>
+      <w:proofErr w:type="gramStart"/>
+      <w:r>
+        <w:rPr>
+          <w:color w:val="000000" w:themeColor="text1"/>
+        </w:rPr>
+        <w:t>input(</w:t>
+      </w:r>
+      <w:proofErr w:type="gramEnd"/>
+      <w:r>
+        <w:rPr>
+          <w:color w:val="000000" w:themeColor="text1"/>
+        </w:rPr>
+        <w:t xml:space="preserve">) builds the string " </w:t>
+      </w:r>
+      <w:proofErr w:type="spellStart"/>
+      <w:r>
+        <w:rPr>
+          <w:color w:val="000000" w:themeColor="text1"/>
+        </w:rPr>
+        <w:t>Adeal</w:t>
+      </w:r>
+      <w:proofErr w:type="spellEnd"/>
+      <w:r>
+        <w:rPr>
+          <w:color w:val="000000" w:themeColor="text1"/>
+        </w:rPr>
+        <w:t xml:space="preserve"> " in the Heap.</w:t>
+      </w:r>
+    </w:p>
+    <w:p>
+      <w:pPr>
+        <w:numPr>
+          <w:ilvl w:val="0"/>
+          <w:numId w:val="37"/>
+        </w:numPr>
+        <w:rPr>
+          <w:color w:val="000000" w:themeColor="text1"/>
+        </w:rPr>
+      </w:pPr>
+      <w:proofErr w:type="gramStart"/>
+      <w:r>
+        <w:rPr>
+          <w:color w:val="000000" w:themeColor="text1"/>
+        </w:rPr>
+        <w:t>.strip</w:t>
+      </w:r>
+      <w:proofErr w:type="gramEnd"/>
+      <w:r>
+        <w:rPr>
+          <w:color w:val="000000" w:themeColor="text1"/>
+        </w:rPr>
+        <w:t xml:space="preserve">() instantly looks at it, builds a </w:t>
+      </w:r>
+      <w:r>
+        <w:rPr>
+          <w:i/>
+          <w:iCs/>
+          <w:color w:val="000000" w:themeColor="text1"/>
+        </w:rPr>
+        <w:t>brand new, clean</w:t>
+      </w:r>
+      <w:r>
+        <w:rPr>
+          <w:color w:val="000000" w:themeColor="text1"/>
+        </w:rPr>
+        <w:t xml:space="preserve"> string "</w:t>
+      </w:r>
+      <w:proofErr w:type="spellStart"/>
+      <w:r>
+        <w:rPr>
+          <w:color w:val="000000" w:themeColor="text1"/>
+        </w:rPr>
+        <w:t>Adeal</w:t>
+      </w:r>
+      <w:proofErr w:type="spellEnd"/>
+      <w:r>
+        <w:rPr>
+          <w:color w:val="000000" w:themeColor="text1"/>
+        </w:rPr>
+        <w:t>" in the Heap.</w:t>
+      </w:r>
+    </w:p>
+    <w:p>
+      <w:pPr>
+        <w:numPr>
+          <w:ilvl w:val="0"/>
+          <w:numId w:val="37"/>
+        </w:numPr>
+        <w:rPr>
+          <w:color w:val="000000" w:themeColor="text1"/>
+        </w:rPr>
+      </w:pPr>
+      <w:r>
+        <w:rPr>
+          <w:color w:val="000000" w:themeColor="text1"/>
+        </w:rPr>
+        <w:t xml:space="preserve">The Stack variable </w:t>
+      </w:r>
+      <w:proofErr w:type="spellStart"/>
+      <w:r>
+        <w:rPr>
+          <w:color w:val="000000" w:themeColor="text1"/>
+        </w:rPr>
+        <w:t>player_name</w:t>
+      </w:r>
+      <w:proofErr w:type="spellEnd"/>
+      <w:r>
+        <w:rPr>
+          <w:color w:val="000000" w:themeColor="text1"/>
+        </w:rPr>
+        <w:t xml:space="preserve"> points to the clean string, and the Garbage Collector destroys the messy one.</w:t>
+      </w:r>
+    </w:p>
+    <w:p>
+      <w:pPr>
+        <w:rPr>
+          <w:color w:val="000000" w:themeColor="text1"/>
+        </w:rPr>
+      </w:pPr>
+    </w:p>
+    <w:p>
+      <w:pPr>
+        <w:rPr>
+          <w:b/>
+          <w:bCs/>
+          <w:color w:val="EE0000"/>
+        </w:rPr>
+      </w:pPr>
+      <w:r>
+        <w:rPr>
+          <w:b/>
+          <w:bCs/>
+          <w:color w:val="EE0000"/>
+        </w:rPr>
+        <w:t>1. Large Numbers and Visual Memory (The Underscore Rule)</w:t>
+      </w:r>
+    </w:p>
+    <w:p>
+      <w:pPr>
+        <w:rPr>
+          <w:color w:val="000000" w:themeColor="text1"/>
+        </w:rPr>
+      </w:pPr>
+      <w:r>
+        <w:rPr>
+          <w:color w:val="000000" w:themeColor="text1"/>
+        </w:rPr>
+        <w:t>As an ML engineer, you will deal with massive numbers (e.g., training a model on 5,000,000 images).</w:t>
+      </w:r>
+    </w:p>
+    <w:p>
+      <w:pPr>
+        <w:rPr>
+          <w:color w:val="000000" w:themeColor="text1"/>
+        </w:rPr>
+      </w:pPr>
+      <w:r>
+        <w:rPr>
+          <w:color w:val="000000" w:themeColor="text1"/>
+        </w:rPr>
+        <w:t>If you type images = 5000000, it is very hard for a human to read. Did you type 5 million or 500 thousand? In math, we use commas (5,000,000), but Python doesn't allow commas in integers.</w:t>
+      </w:r>
+    </w:p>
+    <w:p>
+      <w:pPr>
+        <w:rPr>
+          <w:color w:val="000000" w:themeColor="text1"/>
+        </w:rPr>
+      </w:pPr>
+      <w:r>
+        <w:rPr>
+          <w:b/>
+          <w:bCs/>
+          <w:color w:val="000000" w:themeColor="text1"/>
+        </w:rPr>
+        <w:t>The FAANG Trick:</w:t>
+      </w:r>
+      <w:r>
+        <w:rPr>
+          <w:color w:val="000000" w:themeColor="text1"/>
+        </w:rPr>
+        <w:t xml:space="preserve"> Python allows you to use underscores _ as visual separators in numbers. The computer completely ignores them, but it saves human eyes.</w:t>
+      </w:r>
+    </w:p>
+    <w:p>
+      <w:pPr>
+        <w:rPr>
+          <w:color w:val="000000" w:themeColor="text1"/>
+          <w:highlight w:val="yellow"/>
+        </w:rPr>
+      </w:pPr>
+      <w:r>
+        <w:rPr>
+          <w:color w:val="000000" w:themeColor="text1"/>
+          <w:highlight w:val="yellow"/>
+        </w:rPr>
+        <w:t>Python</w:t>
+      </w:r>
+    </w:p>
+    <w:p>
+      <w:pPr>
+        <w:rPr>
+          <w:color w:val="000000" w:themeColor="text1"/>
+          <w:highlight w:val="yellow"/>
+        </w:rPr>
+      </w:pPr>
+      <w:r>
+        <w:rPr>
+          <w:color w:val="000000" w:themeColor="text1"/>
+          <w:highlight w:val="yellow"/>
+        </w:rPr>
+        <w:t># The computer sees this exactly as 5000000 in the Heap</w:t>
+      </w:r>
+    </w:p>
+    <w:p>
+      <w:pPr>
+        <w:rPr>
+          <w:color w:val="000000" w:themeColor="text1"/>
+          <w:highlight w:val="yellow"/>
+        </w:rPr>
+      </w:pPr>
+      <w:proofErr w:type="spellStart"/>
+      <w:r>
+        <w:rPr>
+          <w:color w:val="000000" w:themeColor="text1"/>
+          <w:highlight w:val="yellow"/>
+        </w:rPr>
+        <w:t>total_images</w:t>
+      </w:r>
+      <w:proofErr w:type="spellEnd"/>
+      <w:r>
+        <w:rPr>
+          <w:color w:val="000000" w:themeColor="text1"/>
+          <w:highlight w:val="yellow"/>
+        </w:rPr>
+        <w:t xml:space="preserve"> = 5_000_000  </w:t>
+      </w:r>
+    </w:p>
+    <w:p>
+      <w:pPr>
+        <w:rPr>
+          <w:color w:val="000000" w:themeColor="text1"/>
+        </w:rPr>
+      </w:pPr>
+      <w:proofErr w:type="spellStart"/>
+      <w:r>
+        <w:rPr>
+          <w:color w:val="000000" w:themeColor="text1"/>
+          <w:highlight w:val="yellow"/>
+        </w:rPr>
+        <w:t>learning_rate</w:t>
+      </w:r>
+      <w:proofErr w:type="spellEnd"/>
+      <w:r>
+        <w:rPr>
+          <w:color w:val="000000" w:themeColor="text1"/>
+          <w:highlight w:val="yellow"/>
+        </w:rPr>
+        <w:t xml:space="preserve"> = 0.000_001</w:t>
+      </w:r>
+    </w:p>
+    <w:p>
+      <w:pPr>
+        <w:rPr>
+          <w:b/>
+          <w:bCs/>
+          <w:color w:val="000000" w:themeColor="text1"/>
+        </w:rPr>
+      </w:pPr>
+      <w:r>
+        <w:rPr>
+          <w:b/>
+          <w:bCs/>
+          <w:color w:val="000000" w:themeColor="text1"/>
+        </w:rPr>
+        <w:t>2. The File Path Trap (Raw Strings)</w:t>
+      </w:r>
+    </w:p>
+    <w:p>
+      <w:pPr>
+        <w:rPr>
+          <w:color w:val="000000" w:themeColor="text1"/>
+        </w:rPr>
+      </w:pPr>
+      <w:r>
+        <w:rPr>
+          <w:color w:val="000000" w:themeColor="text1"/>
+        </w:rPr>
+        <w:t>When you build an ML model, you have to tell Python where your data is stored on your computer.</w:t>
+      </w:r>
+    </w:p>
+    <w:p>
+      <w:pPr>
+        <w:rPr>
+          <w:color w:val="000000" w:themeColor="text1"/>
+        </w:rPr>
+      </w:pPr>
+      <w:r>
+        <w:rPr>
+          <w:color w:val="000000" w:themeColor="text1"/>
+        </w:rPr>
+        <w:t>A beginner will write this:</w:t>
+      </w:r>
+    </w:p>
+    <w:p>
+      <w:pPr>
+        <w:rPr>
+          <w:color w:val="000000" w:themeColor="text1"/>
+          <w:highlight w:val="yellow"/>
+        </w:rPr>
+      </w:pPr>
+      <w:r>
+        <w:rPr>
+          <w:color w:val="000000" w:themeColor="text1"/>
+          <w:highlight w:val="yellow"/>
+        </w:rPr>
+        <w:t>Python</w:t>
+      </w:r>
+    </w:p>
+    <w:p>
+      <w:pPr>
+        <w:rPr>
+          <w:color w:val="000000" w:themeColor="text1"/>
+        </w:rPr>
+      </w:pPr>
+      <w:proofErr w:type="spellStart"/>
+      <w:r>
+        <w:rPr>
+          <w:color w:val="000000" w:themeColor="text1"/>
+          <w:highlight w:val="yellow"/>
+        </w:rPr>
+        <w:t>dataset_path</w:t>
+      </w:r>
+      <w:proofErr w:type="spellEnd"/>
+      <w:r>
+        <w:rPr>
+          <w:color w:val="000000" w:themeColor="text1"/>
+          <w:highlight w:val="yellow"/>
+        </w:rPr>
+        <w:t xml:space="preserve"> = "C:\network\train_data"</w:t>
+      </w:r>
+    </w:p>
+    <w:p>
+      <w:pPr>
+        <w:rPr>
+          <w:color w:val="000000" w:themeColor="text1"/>
+        </w:rPr>
+      </w:pPr>
+      <w:r>
+        <w:rPr>
+          <w:b/>
+          <w:bCs/>
+          <w:color w:val="000000" w:themeColor="text1"/>
+        </w:rPr>
+        <w:t>This will crash your program.</w:t>
+      </w:r>
+      <w:r>
+        <w:rPr>
+          <w:color w:val="000000" w:themeColor="text1"/>
+        </w:rPr>
+        <w:t xml:space="preserve"> Why? Because \n and \t </w:t>
+      </w:r>
+      <w:proofErr w:type="gramStart"/>
+      <w:r>
+        <w:rPr>
+          <w:color w:val="000000" w:themeColor="text1"/>
+        </w:rPr>
+        <w:t>are</w:t>
+      </w:r>
+      <w:proofErr w:type="gramEnd"/>
+      <w:r>
+        <w:rPr>
+          <w:color w:val="000000" w:themeColor="text1"/>
+        </w:rPr>
+        <w:t xml:space="preserve"> secret "Escape Characters" in Python.</w:t>
+      </w:r>
+    </w:p>
+    <w:p>
+      <w:pPr>
+        <w:numPr>
+          <w:ilvl w:val="0"/>
+          <w:numId w:val="38"/>
+        </w:numPr>
+        <w:rPr>
+          <w:color w:val="000000" w:themeColor="text1"/>
+        </w:rPr>
+      </w:pPr>
+      <w:r>
+        <w:rPr>
+          <w:color w:val="000000" w:themeColor="text1"/>
+        </w:rPr>
+        <w:t>\n means "Hit the Enter key".</w:t>
+      </w:r>
+    </w:p>
+    <w:p>
+      <w:pPr>
+        <w:numPr>
+          <w:ilvl w:val="0"/>
+          <w:numId w:val="38"/>
+        </w:numPr>
+        <w:rPr>
+          <w:color w:val="000000" w:themeColor="text1"/>
+        </w:rPr>
+      </w:pPr>
+      <w:r>
+        <w:rPr>
+          <w:color w:val="000000" w:themeColor="text1"/>
+        </w:rPr>
+        <w:t>\t means "Hit the Tab key".</w:t>
+      </w:r>
+    </w:p>
+    <w:p>
+      <w:pPr>
+        <w:rPr>
+          <w:color w:val="000000" w:themeColor="text1"/>
+        </w:rPr>
+      </w:pPr>
+      <w:r>
+        <w:rPr>
+          <w:color w:val="000000" w:themeColor="text1"/>
+        </w:rPr>
+        <w:t>Python reads "C:\network\train_data", sees the \n and the \t, and corrupts your text into a broken mess.</w:t>
+      </w:r>
+    </w:p>
+    <w:p>
+      <w:pPr>
+        <w:rPr>
+          <w:color w:val="000000" w:themeColor="text1"/>
+        </w:rPr>
+      </w:pPr>
+      <w:r>
+        <w:rPr>
+          <w:b/>
+          <w:bCs/>
+          <w:color w:val="000000" w:themeColor="text1"/>
+        </w:rPr>
+        <w:t xml:space="preserve">The Solution: </w:t>
+      </w:r>
+      <w:r>
+        <w:rPr>
+          <w:b/>
+          <w:bCs/>
+          <w:color w:val="000000" w:themeColor="text1"/>
+          <w:highlight w:val="yellow"/>
+        </w:rPr>
+        <w:t>Raw Strings (r</w:t>
+      </w:r>
+      <w:r>
+        <w:rPr>
+          <w:b/>
+          <w:bCs/>
+          <w:color w:val="000000" w:themeColor="text1"/>
+        </w:rPr>
+        <w:t>)</w:t>
+      </w:r>
+      <w:r>
+        <w:rPr>
+          <w:color w:val="000000" w:themeColor="text1"/>
+        </w:rPr>
+        <w:t xml:space="preserve"> Just like we put an f outside the quotes for f-strings, we put an r outside the quotes for </w:t>
+      </w:r>
+      <w:r>
+        <w:rPr>
+          <w:b/>
+          <w:bCs/>
+          <w:color w:val="000000" w:themeColor="text1"/>
+        </w:rPr>
+        <w:t>Raw Strings</w:t>
+      </w:r>
+      <w:r>
+        <w:rPr>
+          <w:color w:val="000000" w:themeColor="text1"/>
+        </w:rPr>
+        <w:t xml:space="preserve">. This tells Python: </w:t>
+      </w:r>
+      <w:r>
+        <w:rPr>
+          <w:i/>
+          <w:iCs/>
+          <w:color w:val="000000" w:themeColor="text1"/>
+        </w:rPr>
+        <w:t>"Turn off all escape characters. Read this string absolutely literally."</w:t>
+      </w:r>
+    </w:p>
+    <w:p>
+      <w:pPr>
+        <w:rPr>
+          <w:color w:val="000000" w:themeColor="text1"/>
+          <w:highlight w:val="yellow"/>
+        </w:rPr>
+      </w:pPr>
+      <w:r>
+        <w:rPr>
+          <w:color w:val="000000" w:themeColor="text1"/>
+          <w:highlight w:val="yellow"/>
+        </w:rPr>
+        <w:t>Python</w:t>
+      </w:r>
+    </w:p>
+    <w:p>
+      <w:pPr>
+        <w:rPr>
+          <w:color w:val="000000" w:themeColor="text1"/>
+          <w:highlight w:val="yellow"/>
+        </w:rPr>
+      </w:pPr>
+      <w:r>
+        <w:rPr>
+          <w:color w:val="000000" w:themeColor="text1"/>
+          <w:highlight w:val="yellow"/>
+        </w:rPr>
+        <w:t># The 'r' saves the day. It treats the slashes as normal text.</w:t>
+      </w:r>
+    </w:p>
+    <w:p>
+      <w:pPr>
+        <w:rPr>
+          <w:color w:val="000000" w:themeColor="text1"/>
+        </w:rPr>
+      </w:pPr>
+      <w:proofErr w:type="spellStart"/>
+      <w:r>
+        <w:rPr>
+          <w:color w:val="000000" w:themeColor="text1"/>
+          <w:highlight w:val="yellow"/>
+        </w:rPr>
+        <w:t>dataset_path</w:t>
+      </w:r>
+      <w:proofErr w:type="spellEnd"/>
+      <w:r>
+        <w:rPr>
+          <w:color w:val="000000" w:themeColor="text1"/>
+          <w:highlight w:val="yellow"/>
+        </w:rPr>
+        <w:t xml:space="preserve"> = </w:t>
+      </w:r>
+      <w:proofErr w:type="spellStart"/>
+      <w:r>
+        <w:rPr>
+          <w:color w:val="000000" w:themeColor="text1"/>
+          <w:highlight w:val="yellow"/>
+        </w:rPr>
+        <w:t>r"C</w:t>
+      </w:r>
+      <w:proofErr w:type="spellEnd"/>
+      <w:r>
+        <w:rPr>
+          <w:color w:val="000000" w:themeColor="text1"/>
+          <w:highlight w:val="yellow"/>
+        </w:rPr>
+        <w:t>:\network\train_data"</w:t>
+      </w:r>
+    </w:p>
+    <w:p>
+      <w:pPr>
+        <w:rPr>
+          <w:b/>
+          <w:bCs/>
+          <w:color w:val="000000" w:themeColor="text1"/>
+        </w:rPr>
+      </w:pPr>
+      <w:r>
+        <w:rPr>
+          <w:b/>
+          <w:bCs/>
+          <w:color w:val="000000" w:themeColor="text1"/>
+        </w:rPr>
+        <w:t>3. The Cloud Server Reality (Command-Line Arguments)</w:t>
+      </w:r>
+    </w:p>
+    <w:p>
+      <w:pPr>
+        <w:rPr>
+          <w:color w:val="000000" w:themeColor="text1"/>
+        </w:rPr>
+      </w:pPr>
+      <w:r>
+        <w:rPr>
+          <w:color w:val="000000" w:themeColor="text1"/>
+        </w:rPr>
+        <w:lastRenderedPageBreak/>
+        <w:t xml:space="preserve">We spent a lot of time perfecting the </w:t>
+      </w:r>
+      <w:proofErr w:type="gramStart"/>
+      <w:r>
+        <w:rPr>
+          <w:color w:val="000000" w:themeColor="text1"/>
+        </w:rPr>
+        <w:t>input(</w:t>
+      </w:r>
+      <w:proofErr w:type="gramEnd"/>
+      <w:r>
+        <w:rPr>
+          <w:color w:val="000000" w:themeColor="text1"/>
+        </w:rPr>
+        <w:t xml:space="preserve">) function. But here is a harsh reality of production engineering: </w:t>
+      </w:r>
+      <w:r>
+        <w:rPr>
+          <w:b/>
+          <w:bCs/>
+          <w:color w:val="000000" w:themeColor="text1"/>
+        </w:rPr>
+        <w:t xml:space="preserve">You almost never use </w:t>
+      </w:r>
+      <w:proofErr w:type="gramStart"/>
+      <w:r>
+        <w:rPr>
+          <w:b/>
+          <w:bCs/>
+          <w:color w:val="000000" w:themeColor="text1"/>
+        </w:rPr>
+        <w:t>input(</w:t>
+      </w:r>
+      <w:proofErr w:type="gramEnd"/>
+      <w:r>
+        <w:rPr>
+          <w:b/>
+          <w:bCs/>
+          <w:color w:val="000000" w:themeColor="text1"/>
+        </w:rPr>
+        <w:t>) in the cloud.</w:t>
+      </w:r>
+    </w:p>
+    <w:p>
+      <w:pPr>
+        <w:rPr>
+          <w:color w:val="000000" w:themeColor="text1"/>
+        </w:rPr>
+      </w:pPr>
+      <w:r>
+        <w:rPr>
+          <w:color w:val="000000" w:themeColor="text1"/>
+        </w:rPr>
+        <w:t xml:space="preserve">Why? Because your code will be running on an AWS server in a warehouse. There is no human with a keyboard sitting in front of it. If your code hits an </w:t>
+      </w:r>
+      <w:proofErr w:type="gramStart"/>
+      <w:r>
+        <w:rPr>
+          <w:color w:val="000000" w:themeColor="text1"/>
+        </w:rPr>
+        <w:t>input(</w:t>
+      </w:r>
+      <w:proofErr w:type="gramEnd"/>
+      <w:r>
+        <w:rPr>
+          <w:color w:val="000000" w:themeColor="text1"/>
+        </w:rPr>
+        <w:t>) function, it will freeze forever waiting for someone to type, and your app will die.</w:t>
+      </w:r>
+    </w:p>
+    <w:p>
+      <w:pPr>
+        <w:rPr>
+          <w:color w:val="000000" w:themeColor="text1"/>
+        </w:rPr>
+      </w:pPr>
+      <w:r>
+        <w:rPr>
+          <w:b/>
+          <w:bCs/>
+          <w:color w:val="000000" w:themeColor="text1"/>
+        </w:rPr>
+        <w:t>How do production scripts take input?</w:t>
+      </w:r>
+      <w:r>
+        <w:rPr>
+          <w:color w:val="000000" w:themeColor="text1"/>
+        </w:rPr>
+        <w:t xml:space="preserve"> Instead of pausing the program to ask a question, we hand the program the data </w:t>
+      </w:r>
+      <w:r>
+        <w:rPr>
+          <w:i/>
+          <w:iCs/>
+          <w:color w:val="000000" w:themeColor="text1"/>
+        </w:rPr>
+        <w:t>at the exact moment we start it</w:t>
+      </w:r>
+      <w:r>
+        <w:rPr>
+          <w:color w:val="000000" w:themeColor="text1"/>
+        </w:rPr>
+        <w:t xml:space="preserve">. We do this using </w:t>
+      </w:r>
+      <w:r>
+        <w:rPr>
+          <w:b/>
+          <w:bCs/>
+          <w:color w:val="000000" w:themeColor="text1"/>
+        </w:rPr>
+        <w:t>Command-Line Arguments</w:t>
+      </w:r>
+      <w:r>
+        <w:rPr>
+          <w:color w:val="000000" w:themeColor="text1"/>
+        </w:rPr>
+        <w:t>.</w:t>
+      </w:r>
+    </w:p>
+    <w:p>
+      <w:pPr>
+        <w:rPr>
+          <w:color w:val="000000" w:themeColor="text1"/>
+        </w:rPr>
+      </w:pPr>
+      <w:r>
+        <w:rPr>
+          <w:color w:val="000000" w:themeColor="text1"/>
+        </w:rPr>
+        <w:t xml:space="preserve">You use a built-in tool called </w:t>
+      </w:r>
+      <w:proofErr w:type="spellStart"/>
+      <w:proofErr w:type="gramStart"/>
+      <w:r>
+        <w:rPr>
+          <w:color w:val="000000" w:themeColor="text1"/>
+        </w:rPr>
+        <w:t>sys.argv</w:t>
+      </w:r>
+      <w:proofErr w:type="spellEnd"/>
+      <w:proofErr w:type="gramEnd"/>
+      <w:r>
+        <w:rPr>
+          <w:color w:val="000000" w:themeColor="text1"/>
+        </w:rPr>
+        <w:t xml:space="preserve"> (System Argument Values). When you start the script in your terminal, you pass the data right next to the file name:</w:t>
+      </w:r>
+    </w:p>
+    <w:p>
+      <w:pPr>
+        <w:rPr>
+          <w:color w:val="000000" w:themeColor="text1"/>
+        </w:rPr>
+      </w:pPr>
+      <w:r>
+        <w:rPr>
+          <w:i/>
+          <w:iCs/>
+          <w:color w:val="000000" w:themeColor="text1"/>
+        </w:rPr>
+        <w:t>How you run the script:</w:t>
+      </w:r>
+      <w:r>
+        <w:rPr>
+          <w:color w:val="000000" w:themeColor="text1"/>
+        </w:rPr>
+        <w:t xml:space="preserve"> python app.py </w:t>
+      </w:r>
+      <w:proofErr w:type="spellStart"/>
+      <w:r>
+        <w:rPr>
+          <w:color w:val="000000" w:themeColor="text1"/>
+        </w:rPr>
+        <w:t>Adeal</w:t>
+      </w:r>
+      <w:proofErr w:type="spellEnd"/>
+    </w:p>
+    <w:p>
+      <w:pPr>
+        <w:rPr>
+          <w:color w:val="000000" w:themeColor="text1"/>
+        </w:rPr>
+      </w:pPr>
+      <w:r>
+        <w:rPr>
+          <w:i/>
+          <w:iCs/>
+          <w:color w:val="000000" w:themeColor="text1"/>
+        </w:rPr>
+        <w:t>How the code handles it:</w:t>
+      </w:r>
+    </w:p>
+    <w:p>
+      <w:pPr>
+        <w:rPr>
+          <w:color w:val="000000" w:themeColor="text1"/>
+          <w:highlight w:val="yellow"/>
+        </w:rPr>
+      </w:pPr>
+      <w:r>
+        <w:rPr>
+          <w:color w:val="000000" w:themeColor="text1"/>
+          <w:highlight w:val="yellow"/>
+        </w:rPr>
+        <w:t>Python</w:t>
+      </w:r>
+    </w:p>
+    <w:p>
+      <w:pPr>
+        <w:rPr>
+          <w:color w:val="000000" w:themeColor="text1"/>
+          <w:highlight w:val="yellow"/>
+        </w:rPr>
+      </w:pPr>
+      <w:r>
+        <w:rPr>
+          <w:color w:val="000000" w:themeColor="text1"/>
+          <w:highlight w:val="yellow"/>
+        </w:rPr>
+        <w:t>import sys # Bring in the system tool</w:t>
+      </w:r>
+    </w:p>
+    <w:p>
+      <w:pPr>
+        <w:rPr>
+          <w:color w:val="000000" w:themeColor="text1"/>
+          <w:highlight w:val="yellow"/>
+        </w:rPr>
+      </w:pPr>
+    </w:p>
+    <w:p>
+      <w:pPr>
+        <w:rPr>
+          <w:color w:val="000000" w:themeColor="text1"/>
+          <w:highlight w:val="yellow"/>
+        </w:rPr>
+      </w:pPr>
+      <w:r>
+        <w:rPr>
+          <w:color w:val="000000" w:themeColor="text1"/>
+          <w:highlight w:val="yellow"/>
+        </w:rPr>
+        <w:t xml:space="preserve"># </w:t>
+      </w:r>
+      <w:proofErr w:type="spellStart"/>
+      <w:proofErr w:type="gramStart"/>
+      <w:r>
+        <w:rPr>
+          <w:color w:val="000000" w:themeColor="text1"/>
+          <w:highlight w:val="yellow"/>
+        </w:rPr>
+        <w:t>sys.argv</w:t>
+      </w:r>
+      <w:proofErr w:type="spellEnd"/>
+      <w:proofErr w:type="gramEnd"/>
+      <w:r>
+        <w:rPr>
+          <w:color w:val="000000" w:themeColor="text1"/>
+          <w:highlight w:val="yellow"/>
+        </w:rPr>
+        <w:t xml:space="preserve"> is automatically a List of what was typed in the terminal</w:t>
+      </w:r>
+    </w:p>
+    <w:p>
+      <w:pPr>
+        <w:rPr>
+          <w:color w:val="000000" w:themeColor="text1"/>
+          <w:highlight w:val="yellow"/>
+        </w:rPr>
+      </w:pPr>
+      <w:r>
+        <w:rPr>
+          <w:color w:val="000000" w:themeColor="text1"/>
+          <w:highlight w:val="yellow"/>
+        </w:rPr>
+        <w:t># Item 0 is the file name ('app.py')</w:t>
+      </w:r>
+    </w:p>
+    <w:p>
+      <w:pPr>
+        <w:rPr>
+          <w:color w:val="000000" w:themeColor="text1"/>
+          <w:highlight w:val="yellow"/>
+        </w:rPr>
+      </w:pPr>
+      <w:r>
+        <w:rPr>
+          <w:color w:val="000000" w:themeColor="text1"/>
+          <w:highlight w:val="yellow"/>
+        </w:rPr>
+        <w:t># Item 1 is your data ('</w:t>
+      </w:r>
+      <w:proofErr w:type="spellStart"/>
+      <w:r>
+        <w:rPr>
+          <w:color w:val="000000" w:themeColor="text1"/>
+          <w:highlight w:val="yellow"/>
+        </w:rPr>
+        <w:t>Adeal</w:t>
+      </w:r>
+      <w:proofErr w:type="spellEnd"/>
+      <w:r>
+        <w:rPr>
+          <w:color w:val="000000" w:themeColor="text1"/>
+          <w:highlight w:val="yellow"/>
+        </w:rPr>
+        <w:t>')</w:t>
+      </w:r>
+    </w:p>
+    <w:p>
+      <w:pPr>
+        <w:rPr>
+          <w:color w:val="000000" w:themeColor="text1"/>
+          <w:highlight w:val="yellow"/>
+        </w:rPr>
+      </w:pPr>
+    </w:p>
+    <w:p>
+      <w:pPr>
+        <w:rPr>
+          <w:color w:val="000000" w:themeColor="text1"/>
+          <w:highlight w:val="yellow"/>
+        </w:rPr>
+      </w:pPr>
+      <w:proofErr w:type="spellStart"/>
+      <w:r>
+        <w:rPr>
+          <w:color w:val="000000" w:themeColor="text1"/>
+          <w:highlight w:val="yellow"/>
+        </w:rPr>
+        <w:t>player_name</w:t>
+      </w:r>
+      <w:proofErr w:type="spellEnd"/>
+      <w:r>
+        <w:rPr>
+          <w:color w:val="000000" w:themeColor="text1"/>
+          <w:highlight w:val="yellow"/>
+        </w:rPr>
+        <w:t xml:space="preserve"> = </w:t>
+      </w:r>
+      <w:proofErr w:type="spellStart"/>
+      <w:proofErr w:type="gramStart"/>
+      <w:r>
+        <w:rPr>
+          <w:color w:val="000000" w:themeColor="text1"/>
+          <w:highlight w:val="yellow"/>
+        </w:rPr>
+        <w:t>sys.argv</w:t>
+      </w:r>
+      <w:proofErr w:type="spellEnd"/>
+      <w:proofErr w:type="gramEnd"/>
+      <w:r>
+        <w:rPr>
+          <w:color w:val="000000" w:themeColor="text1"/>
+          <w:highlight w:val="yellow"/>
+        </w:rPr>
+        <w:t xml:space="preserve">[1] </w:t>
+      </w:r>
+    </w:p>
+    <w:p>
+      <w:pPr>
+        <w:rPr>
+          <w:color w:val="000000" w:themeColor="text1"/>
+        </w:rPr>
+      </w:pPr>
+      <w:proofErr w:type="gramStart"/>
+      <w:r>
+        <w:rPr>
+          <w:color w:val="000000" w:themeColor="text1"/>
+          <w:highlight w:val="yellow"/>
+        </w:rPr>
+        <w:t>print(</w:t>
+      </w:r>
+      <w:proofErr w:type="spellStart"/>
+      <w:proofErr w:type="gramEnd"/>
+      <w:r>
+        <w:rPr>
+          <w:color w:val="000000" w:themeColor="text1"/>
+          <w:highlight w:val="yellow"/>
+        </w:rPr>
+        <w:t>f"Server</w:t>
+      </w:r>
+      <w:proofErr w:type="spellEnd"/>
+      <w:r>
+        <w:rPr>
+          <w:color w:val="000000" w:themeColor="text1"/>
+          <w:highlight w:val="yellow"/>
+        </w:rPr>
+        <w:t xml:space="preserve"> started for user: {</w:t>
+      </w:r>
+      <w:proofErr w:type="spellStart"/>
+      <w:r>
+        <w:rPr>
+          <w:color w:val="000000" w:themeColor="text1"/>
+          <w:highlight w:val="yellow"/>
+        </w:rPr>
+        <w:t>player_name</w:t>
+      </w:r>
+      <w:proofErr w:type="spellEnd"/>
+      <w:r>
+        <w:rPr>
+          <w:color w:val="000000" w:themeColor="text1"/>
+          <w:highlight w:val="yellow"/>
+        </w:rPr>
+        <w:t>}")</w:t>
+      </w:r>
+    </w:p>
+    <w:p>
+      <w:pPr>
+        <w:rPr>
+          <w:color w:val="000000" w:themeColor="text1"/>
+        </w:rPr>
+      </w:pPr>
+    </w:p>
+    <w:p>
+      <w:pPr>
+        <w:rPr>
+          <w:color w:val="000000" w:themeColor="text1"/>
+        </w:rPr>
+      </w:pPr>
+    </w:p>
+    <w:p>
+      <w:pPr>
+        <w:rPr>
+          <w:color w:val="000000" w:themeColor="text1"/>
+        </w:rPr>
+      </w:pPr>
+    </w:p>
+    <w:p>
+      <w:pPr>
+        <w:rPr>
           <w:color w:val="2F5496" w:themeColor="accent1" w:themeShade="BF"/>
         </w:rPr>
       </w:pPr>
@@ -15962,6 +18690,155 @@
     </w:lvl>
   </w:abstractNum>
   <w:abstractNum w:abstractNumId="3" w15:restartNumberingAfterBreak="0">
+    <w:nsid w:val="0FA30F5F"/>
+    <w:multiLevelType w:val="multilevel"/>
+    <w:tmpl w:val="A7E8F182"/>
+    <w:lvl w:ilvl="0">
+      <w:start w:val="1"/>
+      <w:numFmt w:val="bullet"/>
+      <w:lvlText w:val=""/>
+      <w:lvlJc w:val="left"/>
+      <w:pPr>
+        <w:tabs>
+          <w:tab w:val="num" w:pos="720"/>
+        </w:tabs>
+        <w:ind w:left="720" w:hanging="360"/>
+      </w:pPr>
+      <w:rPr>
+        <w:rFonts w:ascii="Symbol" w:hAnsi="Symbol" w:hint="default"/>
+        <w:sz w:val="20"/>
+      </w:rPr>
+    </w:lvl>
+    <w:lvl w:ilvl="1" w:tentative="1">
+      <w:start w:val="1"/>
+      <w:numFmt w:val="bullet"/>
+      <w:lvlText w:val="o"/>
+      <w:lvlJc w:val="left"/>
+      <w:pPr>
+        <w:tabs>
+          <w:tab w:val="num" w:pos="1440"/>
+        </w:tabs>
+        <w:ind w:left="1440" w:hanging="360"/>
+      </w:pPr>
+      <w:rPr>
+        <w:rFonts w:ascii="Courier New" w:hAnsi="Courier New" w:hint="default"/>
+        <w:sz w:val="20"/>
+      </w:rPr>
+    </w:lvl>
+    <w:lvl w:ilvl="2" w:tentative="1">
+      <w:start w:val="1"/>
+      <w:numFmt w:val="bullet"/>
+      <w:lvlText w:val=""/>
+      <w:lvlJc w:val="left"/>
+      <w:pPr>
+        <w:tabs>
+          <w:tab w:val="num" w:pos="2160"/>
+        </w:tabs>
+        <w:ind w:left="2160" w:hanging="360"/>
+      </w:pPr>
+      <w:rPr>
+        <w:rFonts w:ascii="Wingdings" w:hAnsi="Wingdings" w:hint="default"/>
+        <w:sz w:val="20"/>
+      </w:rPr>
+    </w:lvl>
+    <w:lvl w:ilvl="3" w:tentative="1">
+      <w:start w:val="1"/>
+      <w:numFmt w:val="bullet"/>
+      <w:lvlText w:val=""/>
+      <w:lvlJc w:val="left"/>
+      <w:pPr>
+        <w:tabs>
+          <w:tab w:val="num" w:pos="2880"/>
+        </w:tabs>
+        <w:ind w:left="2880" w:hanging="360"/>
+      </w:pPr>
+      <w:rPr>
+        <w:rFonts w:ascii="Wingdings" w:hAnsi="Wingdings" w:hint="default"/>
+        <w:sz w:val="20"/>
+      </w:rPr>
+    </w:lvl>
+    <w:lvl w:ilvl="4" w:tentative="1">
+      <w:start w:val="1"/>
+      <w:numFmt w:val="bullet"/>
+      <w:lvlText w:val=""/>
+      <w:lvlJc w:val="left"/>
+      <w:pPr>
+        <w:tabs>
+          <w:tab w:val="num" w:pos="3600"/>
+        </w:tabs>
+        <w:ind w:left="3600" w:hanging="360"/>
+      </w:pPr>
+      <w:rPr>
+        <w:rFonts w:ascii="Wingdings" w:hAnsi="Wingdings" w:hint="default"/>
+        <w:sz w:val="20"/>
+      </w:rPr>
+    </w:lvl>
+    <w:lvl w:ilvl="5" w:tentative="1">
+      <w:start w:val="1"/>
+      <w:numFmt w:val="bullet"/>
+      <w:lvlText w:val=""/>
+      <w:lvlJc w:val="left"/>
+      <w:pPr>
+        <w:tabs>
+          <w:tab w:val="num" w:pos="4320"/>
+        </w:tabs>
+        <w:ind w:left="4320" w:hanging="360"/>
+      </w:pPr>
+      <w:rPr>
+        <w:rFonts w:ascii="Wingdings" w:hAnsi="Wingdings" w:hint="default"/>
+        <w:sz w:val="20"/>
+      </w:rPr>
+    </w:lvl>
+    <w:lvl w:ilvl="6" w:tentative="1">
+      <w:start w:val="1"/>
+      <w:numFmt w:val="bullet"/>
+      <w:lvlText w:val=""/>
+      <w:lvlJc w:val="left"/>
+      <w:pPr>
+        <w:tabs>
+          <w:tab w:val="num" w:pos="5040"/>
+        </w:tabs>
+        <w:ind w:left="5040" w:hanging="360"/>
+      </w:pPr>
+      <w:rPr>
+        <w:rFonts w:ascii="Wingdings" w:hAnsi="Wingdings" w:hint="default"/>
+        <w:sz w:val="20"/>
+      </w:rPr>
+    </w:lvl>
+    <w:lvl w:ilvl="7" w:tentative="1">
+      <w:start w:val="1"/>
+      <w:numFmt w:val="bullet"/>
+      <w:lvlText w:val=""/>
+      <w:lvlJc w:val="left"/>
+      <w:pPr>
+        <w:tabs>
+          <w:tab w:val="num" w:pos="5760"/>
+        </w:tabs>
+        <w:ind w:left="5760" w:hanging="360"/>
+      </w:pPr>
+      <w:rPr>
+        <w:rFonts w:ascii="Wingdings" w:hAnsi="Wingdings" w:hint="default"/>
+        <w:sz w:val="20"/>
+      </w:rPr>
+    </w:lvl>
+    <w:lvl w:ilvl="8" w:tentative="1">
+      <w:start w:val="1"/>
+      <w:numFmt w:val="bullet"/>
+      <w:lvlText w:val=""/>
+      <w:lvlJc w:val="left"/>
+      <w:pPr>
+        <w:tabs>
+          <w:tab w:val="num" w:pos="6480"/>
+        </w:tabs>
+        <w:ind w:left="6480" w:hanging="360"/>
+      </w:pPr>
+      <w:rPr>
+        <w:rFonts w:ascii="Wingdings" w:hAnsi="Wingdings" w:hint="default"/>
+        <w:sz w:val="20"/>
+      </w:rPr>
+    </w:lvl>
+  </w:abstractNum>
+  <w:abstractNum w:abstractNumId="4" w15:restartNumberingAfterBreak="0">
     <w:nsid w:val="14E0785A"/>
     <w:multiLevelType w:val="multilevel"/>
     <w:tmpl w:val="F1E45954"/>
@@ -16110,7 +18987,7 @@
       </w:rPr>
     </w:lvl>
   </w:abstractNum>
-  <w:abstractNum w:abstractNumId="4" w15:restartNumberingAfterBreak="0">
+  <w:abstractNum w:abstractNumId="5" w15:restartNumberingAfterBreak="0">
     <w:nsid w:val="16A748FF"/>
     <w:multiLevelType w:val="multilevel"/>
     <w:tmpl w:val="3DCAC8A4"/>
@@ -16223,7 +19100,7 @@
       </w:pPr>
     </w:lvl>
   </w:abstractNum>
-  <w:abstractNum w:abstractNumId="5" w15:restartNumberingAfterBreak="0">
+  <w:abstractNum w:abstractNumId="6" w15:restartNumberingAfterBreak="0">
     <w:nsid w:val="1868764F"/>
     <w:multiLevelType w:val="multilevel"/>
     <w:tmpl w:val="F2125E60"/>
@@ -16372,7 +19249,7 @@
       </w:rPr>
     </w:lvl>
   </w:abstractNum>
-  <w:abstractNum w:abstractNumId="6" w15:restartNumberingAfterBreak="0">
+  <w:abstractNum w:abstractNumId="7" w15:restartNumberingAfterBreak="0">
     <w:nsid w:val="191D1044"/>
     <w:multiLevelType w:val="multilevel"/>
     <w:tmpl w:val="76809062"/>
@@ -16485,7 +19362,7 @@
       </w:pPr>
     </w:lvl>
   </w:abstractNum>
-  <w:abstractNum w:abstractNumId="7" w15:restartNumberingAfterBreak="0">
+  <w:abstractNum w:abstractNumId="8" w15:restartNumberingAfterBreak="0">
     <w:nsid w:val="1A3F171F"/>
     <w:multiLevelType w:val="multilevel"/>
     <w:tmpl w:val="52726B72"/>
@@ -16598,7 +19475,7 @@
       </w:pPr>
     </w:lvl>
   </w:abstractNum>
-  <w:abstractNum w:abstractNumId="8" w15:restartNumberingAfterBreak="0">
+  <w:abstractNum w:abstractNumId="9" w15:restartNumberingAfterBreak="0">
     <w:nsid w:val="1F564DF1"/>
     <w:multiLevelType w:val="multilevel"/>
     <w:tmpl w:val="B596AA1C"/>
@@ -16747,7 +19624,7 @@
       </w:rPr>
     </w:lvl>
   </w:abstractNum>
-  <w:abstractNum w:abstractNumId="9" w15:restartNumberingAfterBreak="0">
+  <w:abstractNum w:abstractNumId="10" w15:restartNumberingAfterBreak="0">
     <w:nsid w:val="29DF1325"/>
     <w:multiLevelType w:val="multilevel"/>
     <w:tmpl w:val="37169D22"/>
@@ -16860,7 +19737,7 @@
       </w:pPr>
     </w:lvl>
   </w:abstractNum>
-  <w:abstractNum w:abstractNumId="10" w15:restartNumberingAfterBreak="0">
+  <w:abstractNum w:abstractNumId="11" w15:restartNumberingAfterBreak="0">
     <w:nsid w:val="2B1E6729"/>
     <w:multiLevelType w:val="multilevel"/>
     <w:tmpl w:val="DE90F7B6"/>
@@ -16973,7 +19850,7 @@
       </w:pPr>
     </w:lvl>
   </w:abstractNum>
-  <w:abstractNum w:abstractNumId="11" w15:restartNumberingAfterBreak="0">
+  <w:abstractNum w:abstractNumId="12" w15:restartNumberingAfterBreak="0">
     <w:nsid w:val="2BF5247C"/>
     <w:multiLevelType w:val="multilevel"/>
     <w:tmpl w:val="DAA80C4E"/>
@@ -17086,7 +19963,156 @@
       </w:pPr>
     </w:lvl>
   </w:abstractNum>
-  <w:abstractNum w:abstractNumId="12" w15:restartNumberingAfterBreak="0">
+  <w:abstractNum w:abstractNumId="13" w15:restartNumberingAfterBreak="0">
+    <w:nsid w:val="2CC837FC"/>
+    <w:multiLevelType w:val="multilevel"/>
+    <w:tmpl w:val="F2925D28"/>
+    <w:lvl w:ilvl="0">
+      <w:start w:val="1"/>
+      <w:numFmt w:val="bullet"/>
+      <w:lvlText w:val=""/>
+      <w:lvlJc w:val="left"/>
+      <w:pPr>
+        <w:tabs>
+          <w:tab w:val="num" w:pos="720"/>
+        </w:tabs>
+        <w:ind w:left="720" w:hanging="360"/>
+      </w:pPr>
+      <w:rPr>
+        <w:rFonts w:ascii="Symbol" w:hAnsi="Symbol" w:hint="default"/>
+        <w:sz w:val="20"/>
+      </w:rPr>
+    </w:lvl>
+    <w:lvl w:ilvl="1" w:tentative="1">
+      <w:start w:val="1"/>
+      <w:numFmt w:val="bullet"/>
+      <w:lvlText w:val="o"/>
+      <w:lvlJc w:val="left"/>
+      <w:pPr>
+        <w:tabs>
+          <w:tab w:val="num" w:pos="1440"/>
+        </w:tabs>
+        <w:ind w:left="1440" w:hanging="360"/>
+      </w:pPr>
+      <w:rPr>
+        <w:rFonts w:ascii="Courier New" w:hAnsi="Courier New" w:hint="default"/>
+        <w:sz w:val="20"/>
+      </w:rPr>
+    </w:lvl>
+    <w:lvl w:ilvl="2" w:tentative="1">
+      <w:start w:val="1"/>
+      <w:numFmt w:val="bullet"/>
+      <w:lvlText w:val=""/>
+      <w:lvlJc w:val="left"/>
+      <w:pPr>
+        <w:tabs>
+          <w:tab w:val="num" w:pos="2160"/>
+        </w:tabs>
+        <w:ind w:left="2160" w:hanging="360"/>
+      </w:pPr>
+      <w:rPr>
+        <w:rFonts w:ascii="Wingdings" w:hAnsi="Wingdings" w:hint="default"/>
+        <w:sz w:val="20"/>
+      </w:rPr>
+    </w:lvl>
+    <w:lvl w:ilvl="3" w:tentative="1">
+      <w:start w:val="1"/>
+      <w:numFmt w:val="bullet"/>
+      <w:lvlText w:val=""/>
+      <w:lvlJc w:val="left"/>
+      <w:pPr>
+        <w:tabs>
+          <w:tab w:val="num" w:pos="2880"/>
+        </w:tabs>
+        <w:ind w:left="2880" w:hanging="360"/>
+      </w:pPr>
+      <w:rPr>
+        <w:rFonts w:ascii="Wingdings" w:hAnsi="Wingdings" w:hint="default"/>
+        <w:sz w:val="20"/>
+      </w:rPr>
+    </w:lvl>
+    <w:lvl w:ilvl="4" w:tentative="1">
+      <w:start w:val="1"/>
+      <w:numFmt w:val="bullet"/>
+      <w:lvlText w:val=""/>
+      <w:lvlJc w:val="left"/>
+      <w:pPr>
+        <w:tabs>
+          <w:tab w:val="num" w:pos="3600"/>
+        </w:tabs>
+        <w:ind w:left="3600" w:hanging="360"/>
+      </w:pPr>
+      <w:rPr>
+        <w:rFonts w:ascii="Wingdings" w:hAnsi="Wingdings" w:hint="default"/>
+        <w:sz w:val="20"/>
+      </w:rPr>
+    </w:lvl>
+    <w:lvl w:ilvl="5" w:tentative="1">
+      <w:start w:val="1"/>
+      <w:numFmt w:val="bullet"/>
+      <w:lvlText w:val=""/>
+      <w:lvlJc w:val="left"/>
+      <w:pPr>
+        <w:tabs>
+          <w:tab w:val="num" w:pos="4320"/>
+        </w:tabs>
+        <w:ind w:left="4320" w:hanging="360"/>
+      </w:pPr>
+      <w:rPr>
+        <w:rFonts w:ascii="Wingdings" w:hAnsi="Wingdings" w:hint="default"/>
+        <w:sz w:val="20"/>
+      </w:rPr>
+    </w:lvl>
+    <w:lvl w:ilvl="6" w:tentative="1">
+      <w:start w:val="1"/>
+      <w:numFmt w:val="bullet"/>
+      <w:lvlText w:val=""/>
+      <w:lvlJc w:val="left"/>
+      <w:pPr>
+        <w:tabs>
+          <w:tab w:val="num" w:pos="5040"/>
+        </w:tabs>
+        <w:ind w:left="5040" w:hanging="360"/>
+      </w:pPr>
+      <w:rPr>
+        <w:rFonts w:ascii="Wingdings" w:hAnsi="Wingdings" w:hint="default"/>
+        <w:sz w:val="20"/>
+      </w:rPr>
+    </w:lvl>
+    <w:lvl w:ilvl="7" w:tentative="1">
+      <w:start w:val="1"/>
+      <w:numFmt w:val="bullet"/>
+      <w:lvlText w:val=""/>
+      <w:lvlJc w:val="left"/>
+      <w:pPr>
+        <w:tabs>
+          <w:tab w:val="num" w:pos="5760"/>
+        </w:tabs>
+        <w:ind w:left="5760" w:hanging="360"/>
+      </w:pPr>
+      <w:rPr>
+        <w:rFonts w:ascii="Wingdings" w:hAnsi="Wingdings" w:hint="default"/>
+        <w:sz w:val="20"/>
+      </w:rPr>
+    </w:lvl>
+    <w:lvl w:ilvl="8" w:tentative="1">
+      <w:start w:val="1"/>
+      <w:numFmt w:val="bullet"/>
+      <w:lvlText w:val=""/>
+      <w:lvlJc w:val="left"/>
+      <w:pPr>
+        <w:tabs>
+          <w:tab w:val="num" w:pos="6480"/>
+        </w:tabs>
+        <w:ind w:left="6480" w:hanging="360"/>
+      </w:pPr>
+      <w:rPr>
+        <w:rFonts w:ascii="Wingdings" w:hAnsi="Wingdings" w:hint="default"/>
+        <w:sz w:val="20"/>
+      </w:rPr>
+    </w:lvl>
+  </w:abstractNum>
+  <w:abstractNum w:abstractNumId="14" w15:restartNumberingAfterBreak="0">
     <w:nsid w:val="30F5671C"/>
     <w:multiLevelType w:val="multilevel"/>
     <w:tmpl w:val="CDD4DB56"/>
@@ -17235,7 +20261,7 @@
       </w:rPr>
     </w:lvl>
   </w:abstractNum>
-  <w:abstractNum w:abstractNumId="13" w15:restartNumberingAfterBreak="0">
+  <w:abstractNum w:abstractNumId="15" w15:restartNumberingAfterBreak="0">
     <w:nsid w:val="32180E9D"/>
     <w:multiLevelType w:val="multilevel"/>
     <w:tmpl w:val="A740BDA6"/>
@@ -17384,7 +20410,7 @@
       </w:rPr>
     </w:lvl>
   </w:abstractNum>
-  <w:abstractNum w:abstractNumId="14" w15:restartNumberingAfterBreak="0">
+  <w:abstractNum w:abstractNumId="16" w15:restartNumberingAfterBreak="0">
     <w:nsid w:val="32657EC3"/>
     <w:multiLevelType w:val="multilevel"/>
     <w:tmpl w:val="9F005220"/>
@@ -17533,7 +20559,7 @@
       </w:rPr>
     </w:lvl>
   </w:abstractNum>
-  <w:abstractNum w:abstractNumId="15" w15:restartNumberingAfterBreak="0">
+  <w:abstractNum w:abstractNumId="17" w15:restartNumberingAfterBreak="0">
     <w:nsid w:val="326D4E4A"/>
     <w:multiLevelType w:val="multilevel"/>
     <w:tmpl w:val="8642F19C"/>
@@ -17646,7 +20672,7 @@
       </w:pPr>
     </w:lvl>
   </w:abstractNum>
-  <w:abstractNum w:abstractNumId="16" w15:restartNumberingAfterBreak="0">
+  <w:abstractNum w:abstractNumId="18" w15:restartNumberingAfterBreak="0">
     <w:nsid w:val="34281421"/>
     <w:multiLevelType w:val="multilevel"/>
     <w:tmpl w:val="FA4A835C"/>
@@ -17795,7 +20821,7 @@
       </w:rPr>
     </w:lvl>
   </w:abstractNum>
-  <w:abstractNum w:abstractNumId="17" w15:restartNumberingAfterBreak="0">
+  <w:abstractNum w:abstractNumId="19" w15:restartNumberingAfterBreak="0">
     <w:nsid w:val="35037B4D"/>
     <w:multiLevelType w:val="multilevel"/>
     <w:tmpl w:val="25A45094"/>
@@ -17944,7 +20970,7 @@
       </w:rPr>
     </w:lvl>
   </w:abstractNum>
-  <w:abstractNum w:abstractNumId="18" w15:restartNumberingAfterBreak="0">
+  <w:abstractNum w:abstractNumId="20" w15:restartNumberingAfterBreak="0">
     <w:nsid w:val="368F3C4C"/>
     <w:multiLevelType w:val="multilevel"/>
     <w:tmpl w:val="EC5E60B6"/>
@@ -18093,7 +21119,7 @@
       </w:rPr>
     </w:lvl>
   </w:abstractNum>
-  <w:abstractNum w:abstractNumId="19" w15:restartNumberingAfterBreak="0">
+  <w:abstractNum w:abstractNumId="21" w15:restartNumberingAfterBreak="0">
     <w:nsid w:val="38525D97"/>
     <w:multiLevelType w:val="multilevel"/>
     <w:tmpl w:val="547C83F2"/>
@@ -18242,7 +21268,156 @@
       </w:rPr>
     </w:lvl>
   </w:abstractNum>
-  <w:abstractNum w:abstractNumId="20" w15:restartNumberingAfterBreak="0">
+  <w:abstractNum w:abstractNumId="22" w15:restartNumberingAfterBreak="0">
+    <w:nsid w:val="3BCC4E85"/>
+    <w:multiLevelType w:val="multilevel"/>
+    <w:tmpl w:val="216211A8"/>
+    <w:lvl w:ilvl="0">
+      <w:start w:val="1"/>
+      <w:numFmt w:val="bullet"/>
+      <w:lvlText w:val=""/>
+      <w:lvlJc w:val="left"/>
+      <w:pPr>
+        <w:tabs>
+          <w:tab w:val="num" w:pos="720"/>
+        </w:tabs>
+        <w:ind w:left="720" w:hanging="360"/>
+      </w:pPr>
+      <w:rPr>
+        <w:rFonts w:ascii="Symbol" w:hAnsi="Symbol" w:hint="default"/>
+        <w:sz w:val="20"/>
+      </w:rPr>
+    </w:lvl>
+    <w:lvl w:ilvl="1" w:tentative="1">
+      <w:start w:val="1"/>
+      <w:numFmt w:val="bullet"/>
+      <w:lvlText w:val="o"/>
+      <w:lvlJc w:val="left"/>
+      <w:pPr>
+        <w:tabs>
+          <w:tab w:val="num" w:pos="1440"/>
+        </w:tabs>
+        <w:ind w:left="1440" w:hanging="360"/>
+      </w:pPr>
+      <w:rPr>
+        <w:rFonts w:ascii="Courier New" w:hAnsi="Courier New" w:hint="default"/>
+        <w:sz w:val="20"/>
+      </w:rPr>
+    </w:lvl>
+    <w:lvl w:ilvl="2" w:tentative="1">
+      <w:start w:val="1"/>
+      <w:numFmt w:val="bullet"/>
+      <w:lvlText w:val=""/>
+      <w:lvlJc w:val="left"/>
+      <w:pPr>
+        <w:tabs>
+          <w:tab w:val="num" w:pos="2160"/>
+        </w:tabs>
+        <w:ind w:left="2160" w:hanging="360"/>
+      </w:pPr>
+      <w:rPr>
+        <w:rFonts w:ascii="Wingdings" w:hAnsi="Wingdings" w:hint="default"/>
+        <w:sz w:val="20"/>
+      </w:rPr>
+    </w:lvl>
+    <w:lvl w:ilvl="3" w:tentative="1">
+      <w:start w:val="1"/>
+      <w:numFmt w:val="bullet"/>
+      <w:lvlText w:val=""/>
+      <w:lvlJc w:val="left"/>
+      <w:pPr>
+        <w:tabs>
+          <w:tab w:val="num" w:pos="2880"/>
+        </w:tabs>
+        <w:ind w:left="2880" w:hanging="360"/>
+      </w:pPr>
+      <w:rPr>
+        <w:rFonts w:ascii="Wingdings" w:hAnsi="Wingdings" w:hint="default"/>
+        <w:sz w:val="20"/>
+      </w:rPr>
+    </w:lvl>
+    <w:lvl w:ilvl="4" w:tentative="1">
+      <w:start w:val="1"/>
+      <w:numFmt w:val="bullet"/>
+      <w:lvlText w:val=""/>
+      <w:lvlJc w:val="left"/>
+      <w:pPr>
+        <w:tabs>
+          <w:tab w:val="num" w:pos="3600"/>
+        </w:tabs>
+        <w:ind w:left="3600" w:hanging="360"/>
+      </w:pPr>
+      <w:rPr>
+        <w:rFonts w:ascii="Wingdings" w:hAnsi="Wingdings" w:hint="default"/>
+        <w:sz w:val="20"/>
+      </w:rPr>
+    </w:lvl>
+    <w:lvl w:ilvl="5" w:tentative="1">
+      <w:start w:val="1"/>
+      <w:numFmt w:val="bullet"/>
+      <w:lvlText w:val=""/>
+      <w:lvlJc w:val="left"/>
+      <w:pPr>
+        <w:tabs>
+          <w:tab w:val="num" w:pos="4320"/>
+        </w:tabs>
+        <w:ind w:left="4320" w:hanging="360"/>
+      </w:pPr>
+      <w:rPr>
+        <w:rFonts w:ascii="Wingdings" w:hAnsi="Wingdings" w:hint="default"/>
+        <w:sz w:val="20"/>
+      </w:rPr>
+    </w:lvl>
+    <w:lvl w:ilvl="6" w:tentative="1">
+      <w:start w:val="1"/>
+      <w:numFmt w:val="bullet"/>
+      <w:lvlText w:val=""/>
+      <w:lvlJc w:val="left"/>
+      <w:pPr>
+        <w:tabs>
+          <w:tab w:val="num" w:pos="5040"/>
+        </w:tabs>
+        <w:ind w:left="5040" w:hanging="360"/>
+      </w:pPr>
+      <w:rPr>
+        <w:rFonts w:ascii="Wingdings" w:hAnsi="Wingdings" w:hint="default"/>
+        <w:sz w:val="20"/>
+      </w:rPr>
+    </w:lvl>
+    <w:lvl w:ilvl="7" w:tentative="1">
+      <w:start w:val="1"/>
+      <w:numFmt w:val="bullet"/>
+      <w:lvlText w:val=""/>
+      <w:lvlJc w:val="left"/>
+      <w:pPr>
+        <w:tabs>
+          <w:tab w:val="num" w:pos="5760"/>
+        </w:tabs>
+        <w:ind w:left="5760" w:hanging="360"/>
+      </w:pPr>
+      <w:rPr>
+        <w:rFonts w:ascii="Wingdings" w:hAnsi="Wingdings" w:hint="default"/>
+        <w:sz w:val="20"/>
+      </w:rPr>
+    </w:lvl>
+    <w:lvl w:ilvl="8" w:tentative="1">
+      <w:start w:val="1"/>
+      <w:numFmt w:val="bullet"/>
+      <w:lvlText w:val=""/>
+      <w:lvlJc w:val="left"/>
+      <w:pPr>
+        <w:tabs>
+          <w:tab w:val="num" w:pos="6480"/>
+        </w:tabs>
+        <w:ind w:left="6480" w:hanging="360"/>
+      </w:pPr>
+      <w:rPr>
+        <w:rFonts w:ascii="Wingdings" w:hAnsi="Wingdings" w:hint="default"/>
+        <w:sz w:val="20"/>
+      </w:rPr>
+    </w:lvl>
+  </w:abstractNum>
+  <w:abstractNum w:abstractNumId="23" w15:restartNumberingAfterBreak="0">
     <w:nsid w:val="41907999"/>
     <w:multiLevelType w:val="multilevel"/>
     <w:tmpl w:val="65504056"/>
@@ -18355,7 +21530,7 @@
       </w:pPr>
     </w:lvl>
   </w:abstractNum>
-  <w:abstractNum w:abstractNumId="21" w15:restartNumberingAfterBreak="0">
+  <w:abstractNum w:abstractNumId="24" w15:restartNumberingAfterBreak="0">
     <w:nsid w:val="586610AB"/>
     <w:multiLevelType w:val="multilevel"/>
     <w:tmpl w:val="54AA77F4"/>
@@ -18468,7 +21643,7 @@
       </w:pPr>
     </w:lvl>
   </w:abstractNum>
-  <w:abstractNum w:abstractNumId="22" w15:restartNumberingAfterBreak="0">
+  <w:abstractNum w:abstractNumId="25" w15:restartNumberingAfterBreak="0">
     <w:nsid w:val="5BFC2A2B"/>
     <w:multiLevelType w:val="multilevel"/>
     <w:tmpl w:val="F68044EC"/>
@@ -18581,7 +21756,7 @@
       </w:pPr>
     </w:lvl>
   </w:abstractNum>
-  <w:abstractNum w:abstractNumId="23" w15:restartNumberingAfterBreak="0">
+  <w:abstractNum w:abstractNumId="26" w15:restartNumberingAfterBreak="0">
     <w:nsid w:val="5DFF40AE"/>
     <w:multiLevelType w:val="multilevel"/>
     <w:tmpl w:val="3D86B8D8"/>
@@ -18730,7 +21905,7 @@
       </w:rPr>
     </w:lvl>
   </w:abstractNum>
-  <w:abstractNum w:abstractNumId="24" w15:restartNumberingAfterBreak="0">
+  <w:abstractNum w:abstractNumId="27" w15:restartNumberingAfterBreak="0">
     <w:nsid w:val="5F436771"/>
     <w:multiLevelType w:val="multilevel"/>
     <w:tmpl w:val="3320C6A2"/>
@@ -18843,7 +22018,7 @@
       </w:pPr>
     </w:lvl>
   </w:abstractNum>
-  <w:abstractNum w:abstractNumId="25" w15:restartNumberingAfterBreak="0">
+  <w:abstractNum w:abstractNumId="28" w15:restartNumberingAfterBreak="0">
     <w:nsid w:val="60E335AB"/>
     <w:multiLevelType w:val="multilevel"/>
     <w:tmpl w:val="22AC81BE"/>
@@ -18956,7 +22131,7 @@
       </w:pPr>
     </w:lvl>
   </w:abstractNum>
-  <w:abstractNum w:abstractNumId="26" w15:restartNumberingAfterBreak="0">
+  <w:abstractNum w:abstractNumId="29" w15:restartNumberingAfterBreak="0">
     <w:nsid w:val="66811F00"/>
     <w:multiLevelType w:val="multilevel"/>
     <w:tmpl w:val="D24C34E4"/>
@@ -19069,7 +22244,233 @@
       </w:pPr>
     </w:lvl>
   </w:abstractNum>
-  <w:abstractNum w:abstractNumId="27" w15:restartNumberingAfterBreak="0">
+  <w:abstractNum w:abstractNumId="30" w15:restartNumberingAfterBreak="0">
+    <w:nsid w:val="6A150506"/>
+    <w:multiLevelType w:val="multilevel"/>
+    <w:tmpl w:val="A96C2FBC"/>
+    <w:lvl w:ilvl="0">
+      <w:start w:val="1"/>
+      <w:numFmt w:val="decimal"/>
+      <w:lvlText w:val="%1."/>
+      <w:lvlJc w:val="left"/>
+      <w:pPr>
+        <w:tabs>
+          <w:tab w:val="num" w:pos="720"/>
+        </w:tabs>
+        <w:ind w:left="720" w:hanging="360"/>
+      </w:pPr>
+    </w:lvl>
+    <w:lvl w:ilvl="1" w:tentative="1">
+      <w:start w:val="1"/>
+      <w:numFmt w:val="decimal"/>
+      <w:lvlText w:val="%2."/>
+      <w:lvlJc w:val="left"/>
+      <w:pPr>
+        <w:tabs>
+          <w:tab w:val="num" w:pos="1440"/>
+        </w:tabs>
+        <w:ind w:left="1440" w:hanging="360"/>
+      </w:pPr>
+    </w:lvl>
+    <w:lvl w:ilvl="2" w:tentative="1">
+      <w:start w:val="1"/>
+      <w:numFmt w:val="decimal"/>
+      <w:lvlText w:val="%3."/>
+      <w:lvlJc w:val="left"/>
+      <w:pPr>
+        <w:tabs>
+          <w:tab w:val="num" w:pos="2160"/>
+        </w:tabs>
+        <w:ind w:left="2160" w:hanging="360"/>
+      </w:pPr>
+    </w:lvl>
+    <w:lvl w:ilvl="3" w:tentative="1">
+      <w:start w:val="1"/>
+      <w:numFmt w:val="decimal"/>
+      <w:lvlText w:val="%4."/>
+      <w:lvlJc w:val="left"/>
+      <w:pPr>
+        <w:tabs>
+          <w:tab w:val="num" w:pos="2880"/>
+        </w:tabs>
+        <w:ind w:left="2880" w:hanging="360"/>
+      </w:pPr>
+    </w:lvl>
+    <w:lvl w:ilvl="4" w:tentative="1">
+      <w:start w:val="1"/>
+      <w:numFmt w:val="decimal"/>
+      <w:lvlText w:val="%5."/>
+      <w:lvlJc w:val="left"/>
+      <w:pPr>
+        <w:tabs>
+          <w:tab w:val="num" w:pos="3600"/>
+        </w:tabs>
+        <w:ind w:left="3600" w:hanging="360"/>
+      </w:pPr>
+    </w:lvl>
+    <w:lvl w:ilvl="5" w:tentative="1">
+      <w:start w:val="1"/>
+      <w:numFmt w:val="decimal"/>
+      <w:lvlText w:val="%6."/>
+      <w:lvlJc w:val="left"/>
+      <w:pPr>
+        <w:tabs>
+          <w:tab w:val="num" w:pos="4320"/>
+        </w:tabs>
+        <w:ind w:left="4320" w:hanging="360"/>
+      </w:pPr>
+    </w:lvl>
+    <w:lvl w:ilvl="6" w:tentative="1">
+      <w:start w:val="1"/>
+      <w:numFmt w:val="decimal"/>
+      <w:lvlText w:val="%7."/>
+      <w:lvlJc w:val="left"/>
+      <w:pPr>
+        <w:tabs>
+          <w:tab w:val="num" w:pos="5040"/>
+        </w:tabs>
+        <w:ind w:left="5040" w:hanging="360"/>
+      </w:pPr>
+    </w:lvl>
+    <w:lvl w:ilvl="7" w:tentative="1">
+      <w:start w:val="1"/>
+      <w:numFmt w:val="decimal"/>
+      <w:lvlText w:val="%8."/>
+      <w:lvlJc w:val="left"/>
+      <w:pPr>
+        <w:tabs>
+          <w:tab w:val="num" w:pos="5760"/>
+        </w:tabs>
+        <w:ind w:left="5760" w:hanging="360"/>
+      </w:pPr>
+    </w:lvl>
+    <w:lvl w:ilvl="8" w:tentative="1">
+      <w:start w:val="1"/>
+      <w:numFmt w:val="decimal"/>
+      <w:lvlText w:val="%9."/>
+      <w:lvlJc w:val="left"/>
+      <w:pPr>
+        <w:tabs>
+          <w:tab w:val="num" w:pos="6480"/>
+        </w:tabs>
+        <w:ind w:left="6480" w:hanging="360"/>
+      </w:pPr>
+    </w:lvl>
+  </w:abstractNum>
+  <w:abstractNum w:abstractNumId="31" w15:restartNumberingAfterBreak="0">
+    <w:nsid w:val="6B2B18FE"/>
+    <w:multiLevelType w:val="multilevel"/>
+    <w:tmpl w:val="0BDE9AF8"/>
+    <w:lvl w:ilvl="0">
+      <w:start w:val="1"/>
+      <w:numFmt w:val="decimal"/>
+      <w:lvlText w:val="%1."/>
+      <w:lvlJc w:val="left"/>
+      <w:pPr>
+        <w:tabs>
+          <w:tab w:val="num" w:pos="720"/>
+        </w:tabs>
+        <w:ind w:left="720" w:hanging="360"/>
+      </w:pPr>
+    </w:lvl>
+    <w:lvl w:ilvl="1" w:tentative="1">
+      <w:start w:val="1"/>
+      <w:numFmt w:val="decimal"/>
+      <w:lvlText w:val="%2."/>
+      <w:lvlJc w:val="left"/>
+      <w:pPr>
+        <w:tabs>
+          <w:tab w:val="num" w:pos="1440"/>
+        </w:tabs>
+        <w:ind w:left="1440" w:hanging="360"/>
+      </w:pPr>
+    </w:lvl>
+    <w:lvl w:ilvl="2" w:tentative="1">
+      <w:start w:val="1"/>
+      <w:numFmt w:val="decimal"/>
+      <w:lvlText w:val="%3."/>
+      <w:lvlJc w:val="left"/>
+      <w:pPr>
+        <w:tabs>
+          <w:tab w:val="num" w:pos="2160"/>
+        </w:tabs>
+        <w:ind w:left="2160" w:hanging="360"/>
+      </w:pPr>
+    </w:lvl>
+    <w:lvl w:ilvl="3" w:tentative="1">
+      <w:start w:val="1"/>
+      <w:numFmt w:val="decimal"/>
+      <w:lvlText w:val="%4."/>
+      <w:lvlJc w:val="left"/>
+      <w:pPr>
+        <w:tabs>
+          <w:tab w:val="num" w:pos="2880"/>
+        </w:tabs>
+        <w:ind w:left="2880" w:hanging="360"/>
+      </w:pPr>
+    </w:lvl>
+    <w:lvl w:ilvl="4" w:tentative="1">
+      <w:start w:val="1"/>
+      <w:numFmt w:val="decimal"/>
+      <w:lvlText w:val="%5."/>
+      <w:lvlJc w:val="left"/>
+      <w:pPr>
+        <w:tabs>
+          <w:tab w:val="num" w:pos="3600"/>
+        </w:tabs>
+        <w:ind w:left="3600" w:hanging="360"/>
+      </w:pPr>
+    </w:lvl>
+    <w:lvl w:ilvl="5" w:tentative="1">
+      <w:start w:val="1"/>
+      <w:numFmt w:val="decimal"/>
+      <w:lvlText w:val="%6."/>
+      <w:lvlJc w:val="left"/>
+      <w:pPr>
+        <w:tabs>
+          <w:tab w:val="num" w:pos="4320"/>
+        </w:tabs>
+        <w:ind w:left="4320" w:hanging="360"/>
+      </w:pPr>
+    </w:lvl>
+    <w:lvl w:ilvl="6" w:tentative="1">
+      <w:start w:val="1"/>
+      <w:numFmt w:val="decimal"/>
+      <w:lvlText w:val="%7."/>
+      <w:lvlJc w:val="left"/>
+      <w:pPr>
+        <w:tabs>
+          <w:tab w:val="num" w:pos="5040"/>
+        </w:tabs>
+        <w:ind w:left="5040" w:hanging="360"/>
+      </w:pPr>
+    </w:lvl>
+    <w:lvl w:ilvl="7" w:tentative="1">
+      <w:start w:val="1"/>
+      <w:numFmt w:val="decimal"/>
+      <w:lvlText w:val="%8."/>
+      <w:lvlJc w:val="left"/>
+      <w:pPr>
+        <w:tabs>
+          <w:tab w:val="num" w:pos="5760"/>
+        </w:tabs>
+        <w:ind w:left="5760" w:hanging="360"/>
+      </w:pPr>
+    </w:lvl>
+    <w:lvl w:ilvl="8" w:tentative="1">
+      <w:start w:val="1"/>
+      <w:numFmt w:val="decimal"/>
+      <w:lvlText w:val="%9."/>
+      <w:lvlJc w:val="left"/>
+      <w:pPr>
+        <w:tabs>
+          <w:tab w:val="num" w:pos="6480"/>
+        </w:tabs>
+        <w:ind w:left="6480" w:hanging="360"/>
+      </w:pPr>
+    </w:lvl>
+  </w:abstractNum>
+  <w:abstractNum w:abstractNumId="32" w15:restartNumberingAfterBreak="0">
     <w:nsid w:val="6DBE51C3"/>
     <w:multiLevelType w:val="multilevel"/>
     <w:tmpl w:val="F14C8AF0"/>
@@ -19182,7 +22583,7 @@
       </w:pPr>
     </w:lvl>
   </w:abstractNum>
-  <w:abstractNum w:abstractNumId="28" w15:restartNumberingAfterBreak="0">
+  <w:abstractNum w:abstractNumId="33" w15:restartNumberingAfterBreak="0">
     <w:nsid w:val="74967BA0"/>
     <w:multiLevelType w:val="multilevel"/>
     <w:tmpl w:val="022A8502"/>
@@ -19331,7 +22732,7 @@
       </w:rPr>
     </w:lvl>
   </w:abstractNum>
-  <w:abstractNum w:abstractNumId="29" w15:restartNumberingAfterBreak="0">
+  <w:abstractNum w:abstractNumId="34" w15:restartNumberingAfterBreak="0">
     <w:nsid w:val="772108D7"/>
     <w:multiLevelType w:val="multilevel"/>
     <w:tmpl w:val="AED6F526"/>
@@ -19444,7 +22845,7 @@
       </w:pPr>
     </w:lvl>
   </w:abstractNum>
-  <w:abstractNum w:abstractNumId="30" w15:restartNumberingAfterBreak="0">
+  <w:abstractNum w:abstractNumId="35" w15:restartNumberingAfterBreak="0">
     <w:nsid w:val="78F23F18"/>
     <w:multiLevelType w:val="multilevel"/>
     <w:tmpl w:val="91169836"/>
@@ -19557,7 +22958,7 @@
       </w:pPr>
     </w:lvl>
   </w:abstractNum>
-  <w:abstractNum w:abstractNumId="31" w15:restartNumberingAfterBreak="0">
+  <w:abstractNum w:abstractNumId="36" w15:restartNumberingAfterBreak="0">
     <w:nsid w:val="79865D90"/>
     <w:multiLevelType w:val="multilevel"/>
     <w:tmpl w:val="4C8E399E"/>
@@ -19670,7 +23071,7 @@
       </w:pPr>
     </w:lvl>
   </w:abstractNum>
-  <w:abstractNum w:abstractNumId="32" w15:restartNumberingAfterBreak="0">
+  <w:abstractNum w:abstractNumId="37" w15:restartNumberingAfterBreak="0">
     <w:nsid w:val="7A666CB5"/>
     <w:multiLevelType w:val="multilevel"/>
     <w:tmpl w:val="5602EB2E"/>
@@ -19820,70 +23221,70 @@
     </w:lvl>
   </w:abstractNum>
   <w:num w:numId="1" w16cid:durableId="1099566421">
+    <w:abstractNumId w:val="21"/>
+  </w:num>
+  <w:num w:numId="2" w16cid:durableId="2116751180">
+    <w:abstractNumId w:val="6"/>
+  </w:num>
+  <w:num w:numId="3" w16cid:durableId="938954067">
+    <w:abstractNumId w:val="4"/>
+  </w:num>
+  <w:num w:numId="4" w16cid:durableId="49109621">
+    <w:abstractNumId w:val="14"/>
+  </w:num>
+  <w:num w:numId="5" w16cid:durableId="1631398879">
+    <w:abstractNumId w:val="20"/>
+  </w:num>
+  <w:num w:numId="6" w16cid:durableId="1628199336">
     <w:abstractNumId w:val="19"/>
   </w:num>
-  <w:num w:numId="2" w16cid:durableId="2116751180">
+  <w:num w:numId="7" w16cid:durableId="1074161061">
+    <w:abstractNumId w:val="23"/>
+  </w:num>
+  <w:num w:numId="8" w16cid:durableId="1518034576">
+    <w:abstractNumId w:val="35"/>
+  </w:num>
+  <w:num w:numId="9" w16cid:durableId="1561164621">
     <w:abstractNumId w:val="5"/>
   </w:num>
-  <w:num w:numId="3" w16cid:durableId="938954067">
-    <w:abstractNumId w:val="3"/>
+  <w:num w:numId="10" w16cid:durableId="1690449380">
+    <w:abstractNumId w:val="10"/>
   </w:num>
-  <w:num w:numId="4" w16cid:durableId="49109621">
-    <w:abstractNumId w:val="12"/>
+  <w:num w:numId="11" w16cid:durableId="1359697395">
+    <w:abstractNumId w:val="7"/>
   </w:num>
-  <w:num w:numId="5" w16cid:durableId="1631398879">
+  <w:num w:numId="12" w16cid:durableId="1559971753">
+    <w:abstractNumId w:val="27"/>
+  </w:num>
+  <w:num w:numId="13" w16cid:durableId="1625500408">
+    <w:abstractNumId w:val="28"/>
+  </w:num>
+  <w:num w:numId="14" w16cid:durableId="1103452895">
+    <w:abstractNumId w:val="8"/>
+  </w:num>
+  <w:num w:numId="15" w16cid:durableId="1325015138">
+    <w:abstractNumId w:val="25"/>
+  </w:num>
+  <w:num w:numId="16" w16cid:durableId="889653411">
+    <w:abstractNumId w:val="29"/>
+  </w:num>
+  <w:num w:numId="17" w16cid:durableId="1952055407">
+    <w:abstractNumId w:val="36"/>
+  </w:num>
+  <w:num w:numId="18" w16cid:durableId="942152649">
+    <w:abstractNumId w:val="24"/>
+  </w:num>
+  <w:num w:numId="19" w16cid:durableId="157113166">
+    <w:abstractNumId w:val="16"/>
+  </w:num>
+  <w:num w:numId="20" w16cid:durableId="586619119">
+    <w:abstractNumId w:val="33"/>
+  </w:num>
+  <w:num w:numId="21" w16cid:durableId="10840090">
     <w:abstractNumId w:val="18"/>
   </w:num>
-  <w:num w:numId="6" w16cid:durableId="1628199336">
-    <w:abstractNumId w:val="17"/>
-  </w:num>
-  <w:num w:numId="7" w16cid:durableId="1074161061">
-    <w:abstractNumId w:val="20"/>
-  </w:num>
-  <w:num w:numId="8" w16cid:durableId="1518034576">
-    <w:abstractNumId w:val="30"/>
-  </w:num>
-  <w:num w:numId="9" w16cid:durableId="1561164621">
-    <w:abstractNumId w:val="4"/>
-  </w:num>
-  <w:num w:numId="10" w16cid:durableId="1690449380">
-    <w:abstractNumId w:val="9"/>
-  </w:num>
-  <w:num w:numId="11" w16cid:durableId="1359697395">
-    <w:abstractNumId w:val="6"/>
-  </w:num>
-  <w:num w:numId="12" w16cid:durableId="1559971753">
-    <w:abstractNumId w:val="24"/>
-  </w:num>
-  <w:num w:numId="13" w16cid:durableId="1625500408">
-    <w:abstractNumId w:val="25"/>
-  </w:num>
-  <w:num w:numId="14" w16cid:durableId="1103452895">
-    <w:abstractNumId w:val="7"/>
-  </w:num>
-  <w:num w:numId="15" w16cid:durableId="1325015138">
-    <w:abstractNumId w:val="22"/>
-  </w:num>
-  <w:num w:numId="16" w16cid:durableId="889653411">
-    <w:abstractNumId w:val="26"/>
-  </w:num>
-  <w:num w:numId="17" w16cid:durableId="1952055407">
-    <w:abstractNumId w:val="31"/>
-  </w:num>
-  <w:num w:numId="18" w16cid:durableId="942152649">
-    <w:abstractNumId w:val="21"/>
-  </w:num>
-  <w:num w:numId="19" w16cid:durableId="157113166">
-    <w:abstractNumId w:val="14"/>
-  </w:num>
-  <w:num w:numId="20" w16cid:durableId="586619119">
-    <w:abstractNumId w:val="28"/>
-  </w:num>
-  <w:num w:numId="21" w16cid:durableId="10840090">
-    <w:abstractNumId w:val="16"/>
-  </w:num>
   <w:num w:numId="22" w16cid:durableId="1623464123">
-    <w:abstractNumId w:val="32"/>
+    <w:abstractNumId w:val="37"/>
   </w:num>
   <w:num w:numId="23" w16cid:durableId="1779173879">
     <w:abstractNumId w:val="0"/>
@@ -19895,28 +23296,43 @@
     <w:abstractNumId w:val="2"/>
   </w:num>
   <w:num w:numId="26" w16cid:durableId="1153520976">
+    <w:abstractNumId w:val="12"/>
+  </w:num>
+  <w:num w:numId="27" w16cid:durableId="837771531">
+    <w:abstractNumId w:val="34"/>
+  </w:num>
+  <w:num w:numId="28" w16cid:durableId="1471630325">
+    <w:abstractNumId w:val="17"/>
+  </w:num>
+  <w:num w:numId="29" w16cid:durableId="1352681797">
     <w:abstractNumId w:val="11"/>
   </w:num>
-  <w:num w:numId="27" w16cid:durableId="837771531">
-    <w:abstractNumId w:val="29"/>
+  <w:num w:numId="30" w16cid:durableId="1148403827">
+    <w:abstractNumId w:val="32"/>
   </w:num>
-  <w:num w:numId="28" w16cid:durableId="1471630325">
+  <w:num w:numId="31" w16cid:durableId="286357560">
     <w:abstractNumId w:val="15"/>
   </w:num>
-  <w:num w:numId="29" w16cid:durableId="1352681797">
-    <w:abstractNumId w:val="10"/>
+  <w:num w:numId="32" w16cid:durableId="1699963023">
+    <w:abstractNumId w:val="26"/>
   </w:num>
-  <w:num w:numId="30" w16cid:durableId="1148403827">
-    <w:abstractNumId w:val="27"/>
+  <w:num w:numId="33" w16cid:durableId="1059791945">
+    <w:abstractNumId w:val="9"/>
   </w:num>
-  <w:num w:numId="31" w16cid:durableId="286357560">
+  <w:num w:numId="34" w16cid:durableId="1354721593">
+    <w:abstractNumId w:val="30"/>
+  </w:num>
+  <w:num w:numId="35" w16cid:durableId="1637828997">
+    <w:abstractNumId w:val="3"/>
+  </w:num>
+  <w:num w:numId="36" w16cid:durableId="394544842">
     <w:abstractNumId w:val="13"/>
   </w:num>
-  <w:num w:numId="32" w16cid:durableId="1699963023">
-    <w:abstractNumId w:val="23"/>
+  <w:num w:numId="37" w16cid:durableId="1363284568">
+    <w:abstractNumId w:val="31"/>
   </w:num>
-  <w:num w:numId="33" w16cid:durableId="1059791945">
-    <w:abstractNumId w:val="8"/>
+  <w:num w:numId="38" w16cid:durableId="1716586183">
+    <w:abstractNumId w:val="22"/>
   </w:num>
 </w:numbering>
 </file>

</xml_diff>